<commit_message>
fix: add endpoint for profiles, add default to client-type header
</commit_message>
<xml_diff>
--- a/src/main/resources/contract_templates/deposit_contract_template.docx
+++ b/src/main/resources/contract_templates/deposit_contract_template.docx
@@ -1,6 +1,6 @@
 
 <file path=word/document.xml><?xml version="1.0" encoding="utf-8"?>
-<w:document xmlns:wpc="http://schemas.microsoft.com/office/word/2010/wordprocessingCanvas" xmlns:cx="http://schemas.microsoft.com/office/drawing/2014/chartex" xmlns:cx1="http://schemas.microsoft.com/office/drawing/2015/9/8/chartex" xmlns:cx2="http://schemas.microsoft.com/office/drawing/2015/10/21/chartex" xmlns:cx3="http://schemas.microsoft.com/office/drawing/2016/5/9/chartex" xmlns:cx4="http://schemas.microsoft.com/office/drawing/2016/5/10/chartex" xmlns:cx5="http://schemas.microsoft.com/office/drawing/2016/5/11/chartex" xmlns:cx6="http://schemas.microsoft.com/office/drawing/2016/5/12/chartex" xmlns:cx7="http://schemas.microsoft.com/office/drawing/2016/5/13/chartex" xmlns:cx8="http://schemas.microsoft.com/office/drawing/2016/5/14/chartex" xmlns:mc="http://schemas.openxmlformats.org/markup-compatibility/2006" xmlns:aink="http://schemas.microsoft.com/office/drawing/2016/ink" xmlns:am3d="http://schemas.microsoft.com/office/drawing/2017/model3d" xmlns:o="urn:schemas-microsoft-com:office:office" xmlns:oel="http://schemas.microsoft.com/office/2019/extlst" xmlns:r="http://schemas.openxmlformats.org/officeDocument/2006/relationships" xmlns:m="http://schemas.openxmlformats.org/officeDocument/2006/math" xmlns:v="urn:schemas-microsoft-com:vml" xmlns:wp14="http://schemas.microsoft.com/office/word/2010/wordprocessingDrawing" xmlns:wp="http://schemas.openxmlformats.org/drawingml/2006/wordprocessingDrawing" xmlns:w10="urn:schemas-microsoft-com:office:word" xmlns:w="http://schemas.openxmlformats.org/wordprocessingml/2006/main" xmlns:w14="http://schemas.microsoft.com/office/word/2010/wordml" xmlns:w15="http://schemas.microsoft.com/office/word/2012/wordml" xmlns:w16cex="http://schemas.microsoft.com/office/word/2018/wordml/cex" xmlns:w16cid="http://schemas.microsoft.com/office/word/2016/wordml/cid" xmlns:w16="http://schemas.microsoft.com/office/word/2018/wordml" xmlns:w16du="http://schemas.microsoft.com/office/word/2023/wordml/word16du" xmlns:w16sdtdh="http://schemas.microsoft.com/office/word/2020/wordml/sdtdatahash" xmlns:w16sdtfl="http://schemas.microsoft.com/office/word/2024/wordml/sdtformatlock" xmlns:w16se="http://schemas.microsoft.com/office/word/2015/wordml/symex" xmlns:wpg="http://schemas.microsoft.com/office/word/2010/wordprocessingGroup" xmlns:wpi="http://schemas.microsoft.com/office/word/2010/wordprocessingInk" xmlns:wne="http://schemas.microsoft.com/office/word/2006/wordml" xmlns:wps="http://schemas.microsoft.com/office/word/2010/wordprocessingShape" mc:Ignorable="w14 w15 w16se w16cid w16 w16cex w16sdtdh w16sdtfl w16du wp14">
+<w:document xmlns:wpc="http://schemas.microsoft.com/office/word/2010/wordprocessingCanvas" xmlns:mc="http://schemas.openxmlformats.org/markup-compatibility/2006" xmlns:o="urn:schemas-microsoft-com:office:office" xmlns:r="http://schemas.openxmlformats.org/officeDocument/2006/relationships" xmlns:m="http://schemas.openxmlformats.org/officeDocument/2006/math" xmlns:v="urn:schemas-microsoft-com:vml" xmlns:wp14="http://schemas.microsoft.com/office/word/2010/wordprocessingDrawing" xmlns:wp="http://schemas.openxmlformats.org/drawingml/2006/wordprocessingDrawing" xmlns:w10="urn:schemas-microsoft-com:office:word" xmlns:w="http://schemas.openxmlformats.org/wordprocessingml/2006/main" xmlns:w14="http://schemas.microsoft.com/office/word/2010/wordml" xmlns:wpg="http://schemas.microsoft.com/office/word/2010/wordprocessingGroup" xmlns:wpi="http://schemas.microsoft.com/office/word/2010/wordprocessingInk" xmlns:wne="http://schemas.microsoft.com/office/word/2006/wordml" xmlns:wps="http://schemas.microsoft.com/office/word/2010/wordprocessingShape" mc:Ignorable="w14 wp14">
   <w:body>
     <w:p>
       <w:pPr>
@@ -729,7 +729,44 @@
           <w:sz w:val="24"/>
           <w:szCs w:val="24"/>
         </w:rPr>
-        <w:t xml:space="preserve">     Phương thức thanh toán: Đặt cọc ………. tháng và thanh toán ……………. tháng tiền nhà</w:t>
+        <w:t xml:space="preserve">     Phương thức thanh t</w:t>
+      </w:r>
+      <w:bookmarkStart w:id="0" w:name="_GoBack"/>
+      <w:bookmarkEnd w:id="0"/>
+      <w:r>
+        <w:rPr>
+          <w:sz w:val="24"/>
+          <w:szCs w:val="24"/>
+        </w:rPr>
+        <w:t>oán: Đặt cọc</w:t>
+      </w:r>
+      <w:r>
+        <w:rPr>
+          <w:sz w:val="24"/>
+          <w:szCs w:val="24"/>
+        </w:rPr>
+        <w:t xml:space="preserve"> ${depositMonths}</w:t>
+      </w:r>
+      <w:r>
+        <w:rPr>
+          <w:sz w:val="24"/>
+          <w:szCs w:val="24"/>
+        </w:rPr>
+        <w:t xml:space="preserve"> tháng và thanh toán</w:t>
+      </w:r>
+      <w:r>
+        <w:rPr>
+          <w:sz w:val="24"/>
+          <w:szCs w:val="24"/>
+        </w:rPr>
+        <w:t xml:space="preserve"> ${paymentCycleMonths}</w:t>
+      </w:r>
+      <w:r>
+        <w:rPr>
+          <w:sz w:val="24"/>
+          <w:szCs w:val="24"/>
+        </w:rPr>
+        <w:t xml:space="preserve"> tháng tiền nhà</w:t>
       </w:r>
     </w:p>
     <w:p>
@@ -1035,88 +1072,24 @@
           <w:szCs w:val="24"/>
           <w:bdr w:val="none" w:sz="0" w:space="0" w:color="auto" w:frame="1"/>
         </w:rPr>
-        <w:t xml:space="preserve">BÊN NHẬN TIỀN ĐẶT CỌC </w:t>
-      </w:r>
-      <w:proofErr w:type="gramStart"/>
+        <w:t>BÊN NHẬN TIỀN ĐẶT CỌC ( BÊN A</w:t>
+      </w:r>
       <w:r>
         <w:rPr>
           <w:sz w:val="24"/>
           <w:szCs w:val="24"/>
           <w:bdr w:val="none" w:sz="0" w:space="0" w:color="auto" w:frame="1"/>
         </w:rPr>
-        <w:t>( BÊN</w:t>
-      </w:r>
-      <w:proofErr w:type="gramEnd"/>
+        <w:t xml:space="preserve"> </w:t>
+      </w:r>
       <w:r>
         <w:rPr>
           <w:sz w:val="24"/>
           <w:szCs w:val="24"/>
           <w:bdr w:val="none" w:sz="0" w:space="0" w:color="auto" w:frame="1"/>
         </w:rPr>
-        <w:t xml:space="preserve"> </w:t>
-      </w:r>
-      <w:proofErr w:type="gramStart"/>
-      <w:r>
-        <w:rPr>
-          <w:sz w:val="24"/>
-          <w:szCs w:val="24"/>
-          <w:bdr w:val="none" w:sz="0" w:space="0" w:color="auto" w:frame="1"/>
-        </w:rPr>
-        <w:t>A</w:t>
-      </w:r>
-      <w:r>
-        <w:rPr>
-          <w:sz w:val="24"/>
-          <w:szCs w:val="24"/>
-          <w:bdr w:val="none" w:sz="0" w:space="0" w:color="auto" w:frame="1"/>
-        </w:rPr>
-        <w:t xml:space="preserve"> </w:t>
-      </w:r>
-      <w:r>
-        <w:rPr>
-          <w:sz w:val="24"/>
-          <w:szCs w:val="24"/>
-          <w:bdr w:val="none" w:sz="0" w:space="0" w:color="auto" w:frame="1"/>
-        </w:rPr>
-        <w:t>)</w:t>
-      </w:r>
-      <w:proofErr w:type="gramEnd"/>
-      <w:r>
-        <w:rPr>
-          <w:sz w:val="24"/>
-          <w:szCs w:val="24"/>
-          <w:bdr w:val="none" w:sz="0" w:space="0" w:color="auto" w:frame="1"/>
-        </w:rPr>
-        <w:t xml:space="preserve">            BÊN GIAO TIỀN ĐẶT CỌC </w:t>
-      </w:r>
-      <w:proofErr w:type="gramStart"/>
-      <w:r>
-        <w:rPr>
-          <w:sz w:val="24"/>
-          <w:szCs w:val="24"/>
-          <w:bdr w:val="none" w:sz="0" w:space="0" w:color="auto" w:frame="1"/>
-        </w:rPr>
-        <w:t>( BÊN</w:t>
-      </w:r>
-      <w:proofErr w:type="gramEnd"/>
-      <w:r>
-        <w:rPr>
-          <w:sz w:val="24"/>
-          <w:szCs w:val="24"/>
-          <w:bdr w:val="none" w:sz="0" w:space="0" w:color="auto" w:frame="1"/>
-        </w:rPr>
-        <w:t xml:space="preserve"> </w:t>
-      </w:r>
-      <w:proofErr w:type="gramStart"/>
-      <w:r>
-        <w:rPr>
-          <w:sz w:val="24"/>
-          <w:szCs w:val="24"/>
-          <w:bdr w:val="none" w:sz="0" w:space="0" w:color="auto" w:frame="1"/>
-        </w:rPr>
-        <w:t>B )</w:t>
-      </w:r>
-      <w:proofErr w:type="gramEnd"/>
+        <w:t>)            BÊN GIAO TIỀN ĐẶT CỌC ( BÊN B )</w:t>
+      </w:r>
     </w:p>
     <w:p>
       <w:pPr>
@@ -1253,7 +1226,7 @@
 </file>
 
 <file path=word/styles.xml><?xml version="1.0" encoding="utf-8"?>
-<w:styles xmlns:mc="http://schemas.openxmlformats.org/markup-compatibility/2006" xmlns:r="http://schemas.openxmlformats.org/officeDocument/2006/relationships" xmlns:w="http://schemas.openxmlformats.org/wordprocessingml/2006/main" xmlns:w14="http://schemas.microsoft.com/office/word/2010/wordml" xmlns:w15="http://schemas.microsoft.com/office/word/2012/wordml" xmlns:w16cex="http://schemas.microsoft.com/office/word/2018/wordml/cex" xmlns:w16cid="http://schemas.microsoft.com/office/word/2016/wordml/cid" xmlns:w16="http://schemas.microsoft.com/office/word/2018/wordml" xmlns:w16du="http://schemas.microsoft.com/office/word/2023/wordml/word16du" xmlns:w16sdtdh="http://schemas.microsoft.com/office/word/2020/wordml/sdtdatahash" xmlns:w16sdtfl="http://schemas.microsoft.com/office/word/2024/wordml/sdtformatlock" xmlns:w16se="http://schemas.microsoft.com/office/word/2015/wordml/symex" mc:Ignorable="w14 w15 w16se w16cid w16 w16cex w16sdtdh w16sdtfl w16du">
+<w:styles xmlns:mc="http://schemas.openxmlformats.org/markup-compatibility/2006" xmlns:r="http://schemas.openxmlformats.org/officeDocument/2006/relationships" xmlns:w="http://schemas.openxmlformats.org/wordprocessingml/2006/main" xmlns:w14="http://schemas.microsoft.com/office/word/2010/wordml" mc:Ignorable="w14">
   <w:docDefaults>
     <w:rPrDefault>
       <w:rPr>
@@ -1271,383 +1244,872 @@
       </w:pPr>
     </w:pPrDefault>
   </w:docDefaults>
-  <w:latentStyles w:defLockedState="0" w:defUIPriority="99" w:defSemiHidden="0" w:defUnhideWhenUsed="0" w:defQFormat="0" w:count="376">
-    <w:lsdException w:name="Normal" w:uiPriority="0" w:qFormat="1"/>
-    <w:lsdException w:name="heading 1" w:uiPriority="9" w:qFormat="1"/>
-    <w:lsdException w:name="heading 2" w:semiHidden="1" w:uiPriority="9" w:unhideWhenUsed="1" w:qFormat="1"/>
-    <w:lsdException w:name="heading 3" w:semiHidden="1" w:uiPriority="9" w:unhideWhenUsed="1" w:qFormat="1"/>
-    <w:lsdException w:name="heading 4" w:semiHidden="1" w:uiPriority="9" w:unhideWhenUsed="1" w:qFormat="1"/>
-    <w:lsdException w:name="heading 5" w:semiHidden="1" w:uiPriority="9" w:unhideWhenUsed="1" w:qFormat="1"/>
-    <w:lsdException w:name="heading 6" w:semiHidden="1" w:uiPriority="9" w:unhideWhenUsed="1" w:qFormat="1"/>
-    <w:lsdException w:name="heading 7" w:semiHidden="1" w:uiPriority="9" w:unhideWhenUsed="1" w:qFormat="1"/>
-    <w:lsdException w:name="heading 8" w:semiHidden="1" w:uiPriority="9" w:unhideWhenUsed="1" w:qFormat="1"/>
-    <w:lsdException w:name="heading 9" w:semiHidden="1" w:uiPriority="9" w:unhideWhenUsed="1" w:qFormat="1"/>
-    <w:lsdException w:name="index 1" w:semiHidden="1" w:unhideWhenUsed="1"/>
-    <w:lsdException w:name="index 2" w:semiHidden="1" w:unhideWhenUsed="1"/>
-    <w:lsdException w:name="index 3" w:semiHidden="1" w:unhideWhenUsed="1"/>
-    <w:lsdException w:name="index 4" w:semiHidden="1" w:unhideWhenUsed="1"/>
-    <w:lsdException w:name="index 5" w:semiHidden="1" w:unhideWhenUsed="1"/>
-    <w:lsdException w:name="index 6" w:semiHidden="1" w:unhideWhenUsed="1"/>
-    <w:lsdException w:name="index 7" w:semiHidden="1" w:unhideWhenUsed="1"/>
-    <w:lsdException w:name="index 8" w:semiHidden="1" w:unhideWhenUsed="1"/>
-    <w:lsdException w:name="index 9" w:semiHidden="1" w:unhideWhenUsed="1"/>
-    <w:lsdException w:name="toc 1" w:semiHidden="1" w:uiPriority="39" w:unhideWhenUsed="1"/>
-    <w:lsdException w:name="toc 2" w:semiHidden="1" w:uiPriority="39" w:unhideWhenUsed="1"/>
-    <w:lsdException w:name="toc 3" w:semiHidden="1" w:uiPriority="39" w:unhideWhenUsed="1"/>
-    <w:lsdException w:name="toc 4" w:semiHidden="1" w:uiPriority="39" w:unhideWhenUsed="1"/>
-    <w:lsdException w:name="toc 5" w:semiHidden="1" w:uiPriority="39" w:unhideWhenUsed="1"/>
-    <w:lsdException w:name="toc 6" w:semiHidden="1" w:uiPriority="39" w:unhideWhenUsed="1"/>
-    <w:lsdException w:name="toc 7" w:semiHidden="1" w:uiPriority="39" w:unhideWhenUsed="1"/>
-    <w:lsdException w:name="toc 8" w:semiHidden="1" w:uiPriority="39" w:unhideWhenUsed="1"/>
-    <w:lsdException w:name="toc 9" w:semiHidden="1" w:uiPriority="39" w:unhideWhenUsed="1"/>
-    <w:lsdException w:name="Normal Indent" w:semiHidden="1" w:unhideWhenUsed="1"/>
-    <w:lsdException w:name="footnote text" w:semiHidden="1" w:unhideWhenUsed="1"/>
-    <w:lsdException w:name="annotation text" w:semiHidden="1" w:unhideWhenUsed="1"/>
-    <w:lsdException w:name="header" w:semiHidden="1" w:unhideWhenUsed="1"/>
-    <w:lsdException w:name="footer" w:semiHidden="1" w:unhideWhenUsed="1"/>
-    <w:lsdException w:name="index heading" w:semiHidden="1" w:unhideWhenUsed="1"/>
-    <w:lsdException w:name="caption" w:semiHidden="1" w:uiPriority="35" w:unhideWhenUsed="1" w:qFormat="1"/>
-    <w:lsdException w:name="table of figures" w:semiHidden="1" w:unhideWhenUsed="1"/>
-    <w:lsdException w:name="envelope address" w:semiHidden="1" w:unhideWhenUsed="1"/>
-    <w:lsdException w:name="envelope return" w:semiHidden="1" w:unhideWhenUsed="1"/>
-    <w:lsdException w:name="footnote reference" w:semiHidden="1" w:unhideWhenUsed="1"/>
-    <w:lsdException w:name="annotation reference" w:semiHidden="1" w:unhideWhenUsed="1"/>
-    <w:lsdException w:name="line number" w:semiHidden="1" w:unhideWhenUsed="1"/>
-    <w:lsdException w:name="page number" w:semiHidden="1" w:unhideWhenUsed="1"/>
-    <w:lsdException w:name="endnote reference" w:semiHidden="1" w:unhideWhenUsed="1"/>
-    <w:lsdException w:name="endnote text" w:semiHidden="1" w:unhideWhenUsed="1"/>
-    <w:lsdException w:name="table of authorities" w:semiHidden="1" w:unhideWhenUsed="1"/>
-    <w:lsdException w:name="macro" w:semiHidden="1" w:unhideWhenUsed="1"/>
-    <w:lsdException w:name="toa heading" w:semiHidden="1" w:unhideWhenUsed="1"/>
-    <w:lsdException w:name="List" w:semiHidden="1" w:unhideWhenUsed="1"/>
-    <w:lsdException w:name="List Bullet" w:semiHidden="1" w:unhideWhenUsed="1"/>
-    <w:lsdException w:name="List Number" w:semiHidden="1" w:unhideWhenUsed="1"/>
-    <w:lsdException w:name="List 2" w:semiHidden="1" w:unhideWhenUsed="1"/>
-    <w:lsdException w:name="List 3" w:semiHidden="1" w:unhideWhenUsed="1"/>
-    <w:lsdException w:name="List 4" w:semiHidden="1" w:unhideWhenUsed="1"/>
-    <w:lsdException w:name="List 5" w:semiHidden="1" w:unhideWhenUsed="1"/>
-    <w:lsdException w:name="List Bullet 2" w:semiHidden="1" w:unhideWhenUsed="1"/>
-    <w:lsdException w:name="List Bullet 3" w:semiHidden="1" w:unhideWhenUsed="1"/>
-    <w:lsdException w:name="List Bullet 4" w:semiHidden="1" w:unhideWhenUsed="1"/>
-    <w:lsdException w:name="List Bullet 5" w:semiHidden="1" w:unhideWhenUsed="1"/>
-    <w:lsdException w:name="List Number 2" w:semiHidden="1" w:unhideWhenUsed="1"/>
-    <w:lsdException w:name="List Number 3" w:semiHidden="1" w:unhideWhenUsed="1"/>
-    <w:lsdException w:name="List Number 4" w:semiHidden="1" w:unhideWhenUsed="1"/>
-    <w:lsdException w:name="List Number 5" w:semiHidden="1" w:unhideWhenUsed="1"/>
-    <w:lsdException w:name="Title" w:uiPriority="10" w:qFormat="1"/>
-    <w:lsdException w:name="Closing" w:semiHidden="1" w:unhideWhenUsed="1"/>
-    <w:lsdException w:name="Signature" w:semiHidden="1" w:unhideWhenUsed="1"/>
-    <w:lsdException w:name="Default Paragraph Font" w:semiHidden="1" w:uiPriority="1" w:unhideWhenUsed="1"/>
-    <w:lsdException w:name="Body Text" w:semiHidden="1" w:unhideWhenUsed="1"/>
-    <w:lsdException w:name="Body Text Indent" w:semiHidden="1" w:unhideWhenUsed="1"/>
-    <w:lsdException w:name="List Continue" w:semiHidden="1" w:unhideWhenUsed="1"/>
-    <w:lsdException w:name="List Continue 2" w:semiHidden="1" w:unhideWhenUsed="1"/>
-    <w:lsdException w:name="List Continue 3" w:semiHidden="1" w:unhideWhenUsed="1"/>
-    <w:lsdException w:name="List Continue 4" w:semiHidden="1" w:unhideWhenUsed="1"/>
-    <w:lsdException w:name="List Continue 5" w:semiHidden="1" w:unhideWhenUsed="1"/>
-    <w:lsdException w:name="Message Header" w:semiHidden="1" w:unhideWhenUsed="1"/>
-    <w:lsdException w:name="Subtitle" w:uiPriority="11" w:qFormat="1"/>
-    <w:lsdException w:name="Salutation" w:semiHidden="1" w:unhideWhenUsed="1"/>
-    <w:lsdException w:name="Date" w:semiHidden="1" w:unhideWhenUsed="1"/>
-    <w:lsdException w:name="Body Text First Indent" w:semiHidden="1" w:unhideWhenUsed="1"/>
-    <w:lsdException w:name="Body Text First Indent 2" w:semiHidden="1" w:unhideWhenUsed="1"/>
-    <w:lsdException w:name="Note Heading" w:semiHidden="1" w:unhideWhenUsed="1"/>
-    <w:lsdException w:name="Body Text 2" w:semiHidden="1" w:unhideWhenUsed="1"/>
-    <w:lsdException w:name="Body Text 3" w:semiHidden="1" w:unhideWhenUsed="1"/>
-    <w:lsdException w:name="Body Text Indent 2" w:semiHidden="1" w:unhideWhenUsed="1"/>
-    <w:lsdException w:name="Body Text Indent 3" w:semiHidden="1" w:unhideWhenUsed="1"/>
-    <w:lsdException w:name="Block Text" w:semiHidden="1" w:unhideWhenUsed="1"/>
-    <w:lsdException w:name="Hyperlink" w:semiHidden="1" w:unhideWhenUsed="1"/>
-    <w:lsdException w:name="FollowedHyperlink" w:semiHidden="1" w:unhideWhenUsed="1"/>
-    <w:lsdException w:name="Strong" w:uiPriority="22" w:qFormat="1"/>
-    <w:lsdException w:name="Emphasis" w:uiPriority="20" w:qFormat="1"/>
-    <w:lsdException w:name="Document Map" w:semiHidden="1" w:unhideWhenUsed="1"/>
-    <w:lsdException w:name="Plain Text" w:semiHidden="1" w:unhideWhenUsed="1"/>
-    <w:lsdException w:name="E-mail Signature" w:semiHidden="1" w:unhideWhenUsed="1"/>
-    <w:lsdException w:name="HTML Top of Form" w:semiHidden="1" w:unhideWhenUsed="1"/>
-    <w:lsdException w:name="HTML Bottom of Form" w:semiHidden="1" w:unhideWhenUsed="1"/>
-    <w:lsdException w:name="Normal (Web)" w:semiHidden="1" w:unhideWhenUsed="1"/>
-    <w:lsdException w:name="HTML Acronym" w:semiHidden="1" w:unhideWhenUsed="1"/>
-    <w:lsdException w:name="HTML Address" w:semiHidden="1" w:unhideWhenUsed="1"/>
-    <w:lsdException w:name="HTML Cite" w:semiHidden="1" w:unhideWhenUsed="1"/>
-    <w:lsdException w:name="HTML Code" w:semiHidden="1" w:unhideWhenUsed="1"/>
-    <w:lsdException w:name="HTML Definition" w:semiHidden="1" w:unhideWhenUsed="1"/>
-    <w:lsdException w:name="HTML Keyboard" w:semiHidden="1" w:unhideWhenUsed="1"/>
-    <w:lsdException w:name="HTML Preformatted" w:semiHidden="1" w:unhideWhenUsed="1"/>
-    <w:lsdException w:name="HTML Sample" w:semiHidden="1" w:unhideWhenUsed="1"/>
-    <w:lsdException w:name="HTML Typewriter" w:semiHidden="1" w:unhideWhenUsed="1"/>
-    <w:lsdException w:name="HTML Variable" w:semiHidden="1" w:unhideWhenUsed="1"/>
-    <w:lsdException w:name="Normal Table" w:semiHidden="1" w:unhideWhenUsed="1"/>
-    <w:lsdException w:name="annotation subject" w:semiHidden="1" w:unhideWhenUsed="1"/>
-    <w:lsdException w:name="No List" w:semiHidden="1" w:unhideWhenUsed="1"/>
-    <w:lsdException w:name="Outline List 1" w:semiHidden="1" w:unhideWhenUsed="1"/>
-    <w:lsdException w:name="Outline List 2" w:semiHidden="1" w:unhideWhenUsed="1"/>
-    <w:lsdException w:name="Outline List 3" w:semiHidden="1" w:unhideWhenUsed="1"/>
-    <w:lsdException w:name="Table Simple 1" w:semiHidden="1" w:unhideWhenUsed="1"/>
-    <w:lsdException w:name="Table Simple 2" w:semiHidden="1" w:unhideWhenUsed="1"/>
-    <w:lsdException w:name="Table Simple 3" w:semiHidden="1" w:unhideWhenUsed="1"/>
-    <w:lsdException w:name="Table Classic 1" w:semiHidden="1" w:unhideWhenUsed="1"/>
-    <w:lsdException w:name="Table Classic 2" w:semiHidden="1" w:unhideWhenUsed="1"/>
-    <w:lsdException w:name="Table Classic 3" w:semiHidden="1" w:unhideWhenUsed="1"/>
-    <w:lsdException w:name="Table Classic 4" w:semiHidden="1" w:unhideWhenUsed="1"/>
-    <w:lsdException w:name="Table Colorful 1" w:semiHidden="1" w:unhideWhenUsed="1"/>
-    <w:lsdException w:name="Table Colorful 2" w:semiHidden="1" w:unhideWhenUsed="1"/>
-    <w:lsdException w:name="Table Colorful 3" w:semiHidden="1" w:unhideWhenUsed="1"/>
-    <w:lsdException w:name="Table Columns 1" w:semiHidden="1" w:unhideWhenUsed="1"/>
-    <w:lsdException w:name="Table Columns 2" w:semiHidden="1" w:unhideWhenUsed="1"/>
-    <w:lsdException w:name="Table Columns 3" w:semiHidden="1" w:unhideWhenUsed="1"/>
-    <w:lsdException w:name="Table Columns 4" w:semiHidden="1" w:unhideWhenUsed="1"/>
-    <w:lsdException w:name="Table Columns 5" w:semiHidden="1" w:unhideWhenUsed="1"/>
-    <w:lsdException w:name="Table Grid 1" w:semiHidden="1" w:unhideWhenUsed="1"/>
-    <w:lsdException w:name="Table Grid 2" w:semiHidden="1" w:unhideWhenUsed="1"/>
-    <w:lsdException w:name="Table Grid 3" w:semiHidden="1" w:unhideWhenUsed="1"/>
-    <w:lsdException w:name="Table Grid 4" w:semiHidden="1" w:unhideWhenUsed="1"/>
-    <w:lsdException w:name="Table Grid 5" w:semiHidden="1" w:unhideWhenUsed="1"/>
-    <w:lsdException w:name="Table Grid 6" w:semiHidden="1" w:unhideWhenUsed="1"/>
-    <w:lsdException w:name="Table Grid 7" w:semiHidden="1" w:unhideWhenUsed="1"/>
-    <w:lsdException w:name="Table Grid 8" w:semiHidden="1" w:unhideWhenUsed="1"/>
-    <w:lsdException w:name="Table List 1" w:semiHidden="1" w:unhideWhenUsed="1"/>
-    <w:lsdException w:name="Table List 2" w:semiHidden="1" w:unhideWhenUsed="1"/>
-    <w:lsdException w:name="Table List 3" w:semiHidden="1" w:unhideWhenUsed="1"/>
-    <w:lsdException w:name="Table List 4" w:semiHidden="1" w:unhideWhenUsed="1"/>
-    <w:lsdException w:name="Table List 5" w:semiHidden="1" w:unhideWhenUsed="1"/>
-    <w:lsdException w:name="Table List 6" w:semiHidden="1" w:unhideWhenUsed="1"/>
-    <w:lsdException w:name="Table List 7" w:semiHidden="1" w:unhideWhenUsed="1"/>
-    <w:lsdException w:name="Table List 8" w:semiHidden="1" w:unhideWhenUsed="1"/>
-    <w:lsdException w:name="Table 3D effects 1" w:semiHidden="1" w:unhideWhenUsed="1"/>
-    <w:lsdException w:name="Table 3D effects 2" w:semiHidden="1" w:unhideWhenUsed="1"/>
-    <w:lsdException w:name="Table 3D effects 3" w:semiHidden="1" w:unhideWhenUsed="1"/>
-    <w:lsdException w:name="Table Contemporary" w:semiHidden="1" w:unhideWhenUsed="1"/>
-    <w:lsdException w:name="Table Elegant" w:semiHidden="1" w:unhideWhenUsed="1"/>
-    <w:lsdException w:name="Table Professional" w:semiHidden="1" w:unhideWhenUsed="1"/>
-    <w:lsdException w:name="Table Subtle 1" w:semiHidden="1" w:unhideWhenUsed="1"/>
-    <w:lsdException w:name="Table Subtle 2" w:semiHidden="1" w:unhideWhenUsed="1"/>
-    <w:lsdException w:name="Table Web 1" w:semiHidden="1" w:unhideWhenUsed="1"/>
-    <w:lsdException w:name="Table Web 2" w:semiHidden="1" w:unhideWhenUsed="1"/>
-    <w:lsdException w:name="Table Web 3" w:semiHidden="1" w:unhideWhenUsed="1"/>
-    <w:lsdException w:name="Balloon Text" w:semiHidden="1" w:unhideWhenUsed="1"/>
-    <w:lsdException w:name="Table Grid" w:uiPriority="39"/>
-    <w:lsdException w:name="Table Theme" w:semiHidden="1" w:unhideWhenUsed="1"/>
-    <w:lsdException w:name="Placeholder Text" w:semiHidden="1"/>
-    <w:lsdException w:name="No Spacing" w:uiPriority="1" w:qFormat="1"/>
-    <w:lsdException w:name="Light Shading" w:uiPriority="60"/>
-    <w:lsdException w:name="Light List" w:uiPriority="61"/>
-    <w:lsdException w:name="Light Grid" w:uiPriority="62"/>
-    <w:lsdException w:name="Medium Shading 1" w:uiPriority="63"/>
-    <w:lsdException w:name="Medium Shading 2" w:uiPriority="64"/>
-    <w:lsdException w:name="Medium List 1" w:uiPriority="65"/>
-    <w:lsdException w:name="Medium List 2" w:uiPriority="66"/>
-    <w:lsdException w:name="Medium Grid 1" w:uiPriority="67"/>
-    <w:lsdException w:name="Medium Grid 2" w:uiPriority="68"/>
-    <w:lsdException w:name="Medium Grid 3" w:uiPriority="69"/>
-    <w:lsdException w:name="Dark List" w:uiPriority="70"/>
-    <w:lsdException w:name="Colorful Shading" w:uiPriority="71"/>
-    <w:lsdException w:name="Colorful List" w:uiPriority="72"/>
-    <w:lsdException w:name="Colorful Grid" w:uiPriority="73"/>
-    <w:lsdException w:name="Light Shading Accent 1" w:uiPriority="60"/>
-    <w:lsdException w:name="Light List Accent 1" w:uiPriority="61"/>
-    <w:lsdException w:name="Light Grid Accent 1" w:uiPriority="62"/>
-    <w:lsdException w:name="Medium Shading 1 Accent 1" w:uiPriority="63"/>
-    <w:lsdException w:name="Medium Shading 2 Accent 1" w:uiPriority="64"/>
-    <w:lsdException w:name="Medium List 1 Accent 1" w:uiPriority="65"/>
-    <w:lsdException w:name="Revision" w:semiHidden="1"/>
-    <w:lsdException w:name="List Paragraph" w:uiPriority="34" w:qFormat="1"/>
-    <w:lsdException w:name="Quote" w:uiPriority="29" w:qFormat="1"/>
-    <w:lsdException w:name="Intense Quote" w:uiPriority="30" w:qFormat="1"/>
-    <w:lsdException w:name="Medium List 2 Accent 1" w:uiPriority="66"/>
-    <w:lsdException w:name="Medium Grid 1 Accent 1" w:uiPriority="67"/>
-    <w:lsdException w:name="Medium Grid 2 Accent 1" w:uiPriority="68"/>
-    <w:lsdException w:name="Medium Grid 3 Accent 1" w:uiPriority="69"/>
-    <w:lsdException w:name="Dark List Accent 1" w:uiPriority="70"/>
-    <w:lsdException w:name="Colorful Shading Accent 1" w:uiPriority="71"/>
-    <w:lsdException w:name="Colorful List Accent 1" w:uiPriority="72"/>
-    <w:lsdException w:name="Colorful Grid Accent 1" w:uiPriority="73"/>
-    <w:lsdException w:name="Light Shading Accent 2" w:uiPriority="60"/>
-    <w:lsdException w:name="Light List Accent 2" w:uiPriority="61"/>
-    <w:lsdException w:name="Light Grid Accent 2" w:uiPriority="62"/>
-    <w:lsdException w:name="Medium Shading 1 Accent 2" w:uiPriority="63"/>
-    <w:lsdException w:name="Medium Shading 2 Accent 2" w:uiPriority="64"/>
-    <w:lsdException w:name="Medium List 1 Accent 2" w:uiPriority="65"/>
-    <w:lsdException w:name="Medium List 2 Accent 2" w:uiPriority="66"/>
-    <w:lsdException w:name="Medium Grid 1 Accent 2" w:uiPriority="67"/>
-    <w:lsdException w:name="Medium Grid 2 Accent 2" w:uiPriority="68"/>
-    <w:lsdException w:name="Medium Grid 3 Accent 2" w:uiPriority="69"/>
-    <w:lsdException w:name="Dark List Accent 2" w:uiPriority="70"/>
-    <w:lsdException w:name="Colorful Shading Accent 2" w:uiPriority="71"/>
-    <w:lsdException w:name="Colorful List Accent 2" w:uiPriority="72"/>
-    <w:lsdException w:name="Colorful Grid Accent 2" w:uiPriority="73"/>
-    <w:lsdException w:name="Light Shading Accent 3" w:uiPriority="60"/>
-    <w:lsdException w:name="Light List Accent 3" w:uiPriority="61"/>
-    <w:lsdException w:name="Light Grid Accent 3" w:uiPriority="62"/>
-    <w:lsdException w:name="Medium Shading 1 Accent 3" w:uiPriority="63"/>
-    <w:lsdException w:name="Medium Shading 2 Accent 3" w:uiPriority="64"/>
-    <w:lsdException w:name="Medium List 1 Accent 3" w:uiPriority="65"/>
-    <w:lsdException w:name="Medium List 2 Accent 3" w:uiPriority="66"/>
-    <w:lsdException w:name="Medium Grid 1 Accent 3" w:uiPriority="67"/>
-    <w:lsdException w:name="Medium Grid 2 Accent 3" w:uiPriority="68"/>
-    <w:lsdException w:name="Medium Grid 3 Accent 3" w:uiPriority="69"/>
-    <w:lsdException w:name="Dark List Accent 3" w:uiPriority="70"/>
-    <w:lsdException w:name="Colorful Shading Accent 3" w:uiPriority="71"/>
-    <w:lsdException w:name="Colorful List Accent 3" w:uiPriority="72"/>
-    <w:lsdException w:name="Colorful Grid Accent 3" w:uiPriority="73"/>
-    <w:lsdException w:name="Light Shading Accent 4" w:uiPriority="60"/>
-    <w:lsdException w:name="Light List Accent 4" w:uiPriority="61"/>
-    <w:lsdException w:name="Light Grid Accent 4" w:uiPriority="62"/>
-    <w:lsdException w:name="Medium Shading 1 Accent 4" w:uiPriority="63"/>
-    <w:lsdException w:name="Medium Shading 2 Accent 4" w:uiPriority="64"/>
-    <w:lsdException w:name="Medium List 1 Accent 4" w:uiPriority="65"/>
-    <w:lsdException w:name="Medium List 2 Accent 4" w:uiPriority="66"/>
-    <w:lsdException w:name="Medium Grid 1 Accent 4" w:uiPriority="67"/>
-    <w:lsdException w:name="Medium Grid 2 Accent 4" w:uiPriority="68"/>
-    <w:lsdException w:name="Medium Grid 3 Accent 4" w:uiPriority="69"/>
-    <w:lsdException w:name="Dark List Accent 4" w:uiPriority="70"/>
-    <w:lsdException w:name="Colorful Shading Accent 4" w:uiPriority="71"/>
-    <w:lsdException w:name="Colorful List Accent 4" w:uiPriority="72"/>
-    <w:lsdException w:name="Colorful Grid Accent 4" w:uiPriority="73"/>
-    <w:lsdException w:name="Light Shading Accent 5" w:uiPriority="60"/>
-    <w:lsdException w:name="Light List Accent 5" w:uiPriority="61"/>
-    <w:lsdException w:name="Light Grid Accent 5" w:uiPriority="62"/>
-    <w:lsdException w:name="Medium Shading 1 Accent 5" w:uiPriority="63"/>
-    <w:lsdException w:name="Medium Shading 2 Accent 5" w:uiPriority="64"/>
-    <w:lsdException w:name="Medium List 1 Accent 5" w:uiPriority="65"/>
-    <w:lsdException w:name="Medium List 2 Accent 5" w:uiPriority="66"/>
-    <w:lsdException w:name="Medium Grid 1 Accent 5" w:uiPriority="67"/>
-    <w:lsdException w:name="Medium Grid 2 Accent 5" w:uiPriority="68"/>
-    <w:lsdException w:name="Medium Grid 3 Accent 5" w:uiPriority="69"/>
-    <w:lsdException w:name="Dark List Accent 5" w:uiPriority="70"/>
-    <w:lsdException w:name="Colorful Shading Accent 5" w:uiPriority="71"/>
-    <w:lsdException w:name="Colorful List Accent 5" w:uiPriority="72"/>
-    <w:lsdException w:name="Colorful Grid Accent 5" w:uiPriority="73"/>
-    <w:lsdException w:name="Light Shading Accent 6" w:uiPriority="60"/>
-    <w:lsdException w:name="Light List Accent 6" w:uiPriority="61"/>
-    <w:lsdException w:name="Light Grid Accent 6" w:uiPriority="62"/>
-    <w:lsdException w:name="Medium Shading 1 Accent 6" w:uiPriority="63"/>
-    <w:lsdException w:name="Medium Shading 2 Accent 6" w:uiPriority="64"/>
-    <w:lsdException w:name="Medium List 1 Accent 6" w:uiPriority="65"/>
-    <w:lsdException w:name="Medium List 2 Accent 6" w:uiPriority="66"/>
-    <w:lsdException w:name="Medium Grid 1 Accent 6" w:uiPriority="67"/>
-    <w:lsdException w:name="Medium Grid 2 Accent 6" w:uiPriority="68"/>
-    <w:lsdException w:name="Medium Grid 3 Accent 6" w:uiPriority="69"/>
-    <w:lsdException w:name="Dark List Accent 6" w:uiPriority="70"/>
-    <w:lsdException w:name="Colorful Shading Accent 6" w:uiPriority="71"/>
-    <w:lsdException w:name="Colorful List Accent 6" w:uiPriority="72"/>
-    <w:lsdException w:name="Colorful Grid Accent 6" w:uiPriority="73"/>
-    <w:lsdException w:name="Subtle Emphasis" w:uiPriority="19" w:qFormat="1"/>
-    <w:lsdException w:name="Intense Emphasis" w:uiPriority="21" w:qFormat="1"/>
-    <w:lsdException w:name="Subtle Reference" w:uiPriority="31" w:qFormat="1"/>
-    <w:lsdException w:name="Intense Reference" w:uiPriority="32" w:qFormat="1"/>
-    <w:lsdException w:name="Book Title" w:uiPriority="33" w:qFormat="1"/>
-    <w:lsdException w:name="Bibliography" w:semiHidden="1" w:uiPriority="37" w:unhideWhenUsed="1"/>
-    <w:lsdException w:name="TOC Heading" w:semiHidden="1" w:uiPriority="39" w:unhideWhenUsed="1" w:qFormat="1"/>
-    <w:lsdException w:name="Plain Table 1" w:uiPriority="41"/>
-    <w:lsdException w:name="Plain Table 2" w:uiPriority="42"/>
-    <w:lsdException w:name="Plain Table 3" w:uiPriority="43"/>
-    <w:lsdException w:name="Plain Table 4" w:uiPriority="44"/>
-    <w:lsdException w:name="Plain Table 5" w:uiPriority="45"/>
-    <w:lsdException w:name="Grid Table Light" w:uiPriority="40"/>
-    <w:lsdException w:name="Grid Table 1 Light" w:uiPriority="46"/>
-    <w:lsdException w:name="Grid Table 2" w:uiPriority="47"/>
-    <w:lsdException w:name="Grid Table 3" w:uiPriority="48"/>
-    <w:lsdException w:name="Grid Table 4" w:uiPriority="49"/>
-    <w:lsdException w:name="Grid Table 5 Dark" w:uiPriority="50"/>
-    <w:lsdException w:name="Grid Table 6 Colorful" w:uiPriority="51"/>
-    <w:lsdException w:name="Grid Table 7 Colorful" w:uiPriority="52"/>
-    <w:lsdException w:name="Grid Table 1 Light Accent 1" w:uiPriority="46"/>
-    <w:lsdException w:name="Grid Table 2 Accent 1" w:uiPriority="47"/>
-    <w:lsdException w:name="Grid Table 3 Accent 1" w:uiPriority="48"/>
-    <w:lsdException w:name="Grid Table 4 Accent 1" w:uiPriority="49"/>
-    <w:lsdException w:name="Grid Table 5 Dark Accent 1" w:uiPriority="50"/>
-    <w:lsdException w:name="Grid Table 6 Colorful Accent 1" w:uiPriority="51"/>
-    <w:lsdException w:name="Grid Table 7 Colorful Accent 1" w:uiPriority="52"/>
-    <w:lsdException w:name="Grid Table 1 Light Accent 2" w:uiPriority="46"/>
-    <w:lsdException w:name="Grid Table 2 Accent 2" w:uiPriority="47"/>
-    <w:lsdException w:name="Grid Table 3 Accent 2" w:uiPriority="48"/>
-    <w:lsdException w:name="Grid Table 4 Accent 2" w:uiPriority="49"/>
-    <w:lsdException w:name="Grid Table 5 Dark Accent 2" w:uiPriority="50"/>
-    <w:lsdException w:name="Grid Table 6 Colorful Accent 2" w:uiPriority="51"/>
-    <w:lsdException w:name="Grid Table 7 Colorful Accent 2" w:uiPriority="52"/>
-    <w:lsdException w:name="Grid Table 1 Light Accent 3" w:uiPriority="46"/>
-    <w:lsdException w:name="Grid Table 2 Accent 3" w:uiPriority="47"/>
-    <w:lsdException w:name="Grid Table 3 Accent 3" w:uiPriority="48"/>
-    <w:lsdException w:name="Grid Table 4 Accent 3" w:uiPriority="49"/>
-    <w:lsdException w:name="Grid Table 5 Dark Accent 3" w:uiPriority="50"/>
-    <w:lsdException w:name="Grid Table 6 Colorful Accent 3" w:uiPriority="51"/>
-    <w:lsdException w:name="Grid Table 7 Colorful Accent 3" w:uiPriority="52"/>
-    <w:lsdException w:name="Grid Table 1 Light Accent 4" w:uiPriority="46"/>
-    <w:lsdException w:name="Grid Table 2 Accent 4" w:uiPriority="47"/>
-    <w:lsdException w:name="Grid Table 3 Accent 4" w:uiPriority="48"/>
-    <w:lsdException w:name="Grid Table 4 Accent 4" w:uiPriority="49"/>
-    <w:lsdException w:name="Grid Table 5 Dark Accent 4" w:uiPriority="50"/>
-    <w:lsdException w:name="Grid Table 6 Colorful Accent 4" w:uiPriority="51"/>
-    <w:lsdException w:name="Grid Table 7 Colorful Accent 4" w:uiPriority="52"/>
-    <w:lsdException w:name="Grid Table 1 Light Accent 5" w:uiPriority="46"/>
-    <w:lsdException w:name="Grid Table 2 Accent 5" w:uiPriority="47"/>
-    <w:lsdException w:name="Grid Table 3 Accent 5" w:uiPriority="48"/>
-    <w:lsdException w:name="Grid Table 4 Accent 5" w:uiPriority="49"/>
-    <w:lsdException w:name="Grid Table 5 Dark Accent 5" w:uiPriority="50"/>
-    <w:lsdException w:name="Grid Table 6 Colorful Accent 5" w:uiPriority="51"/>
-    <w:lsdException w:name="Grid Table 7 Colorful Accent 5" w:uiPriority="52"/>
-    <w:lsdException w:name="Grid Table 1 Light Accent 6" w:uiPriority="46"/>
-    <w:lsdException w:name="Grid Table 2 Accent 6" w:uiPriority="47"/>
-    <w:lsdException w:name="Grid Table 3 Accent 6" w:uiPriority="48"/>
-    <w:lsdException w:name="Grid Table 4 Accent 6" w:uiPriority="49"/>
-    <w:lsdException w:name="Grid Table 5 Dark Accent 6" w:uiPriority="50"/>
-    <w:lsdException w:name="Grid Table 6 Colorful Accent 6" w:uiPriority="51"/>
-    <w:lsdException w:name="Grid Table 7 Colorful Accent 6" w:uiPriority="52"/>
-    <w:lsdException w:name="List Table 1 Light" w:uiPriority="46"/>
-    <w:lsdException w:name="List Table 2" w:uiPriority="47"/>
-    <w:lsdException w:name="List Table 3" w:uiPriority="48"/>
-    <w:lsdException w:name="List Table 4" w:uiPriority="49"/>
-    <w:lsdException w:name="List Table 5 Dark" w:uiPriority="50"/>
-    <w:lsdException w:name="List Table 6 Colorful" w:uiPriority="51"/>
-    <w:lsdException w:name="List Table 7 Colorful" w:uiPriority="52"/>
-    <w:lsdException w:name="List Table 1 Light Accent 1" w:uiPriority="46"/>
-    <w:lsdException w:name="List Table 2 Accent 1" w:uiPriority="47"/>
-    <w:lsdException w:name="List Table 3 Accent 1" w:uiPriority="48"/>
-    <w:lsdException w:name="List Table 4 Accent 1" w:uiPriority="49"/>
-    <w:lsdException w:name="List Table 5 Dark Accent 1" w:uiPriority="50"/>
-    <w:lsdException w:name="List Table 6 Colorful Accent 1" w:uiPriority="51"/>
-    <w:lsdException w:name="List Table 7 Colorful Accent 1" w:uiPriority="52"/>
-    <w:lsdException w:name="List Table 1 Light Accent 2" w:uiPriority="46"/>
-    <w:lsdException w:name="List Table 2 Accent 2" w:uiPriority="47"/>
-    <w:lsdException w:name="List Table 3 Accent 2" w:uiPriority="48"/>
-    <w:lsdException w:name="List Table 4 Accent 2" w:uiPriority="49"/>
-    <w:lsdException w:name="List Table 5 Dark Accent 2" w:uiPriority="50"/>
-    <w:lsdException w:name="List Table 6 Colorful Accent 2" w:uiPriority="51"/>
-    <w:lsdException w:name="List Table 7 Colorful Accent 2" w:uiPriority="52"/>
-    <w:lsdException w:name="List Table 1 Light Accent 3" w:uiPriority="46"/>
-    <w:lsdException w:name="List Table 2 Accent 3" w:uiPriority="47"/>
-    <w:lsdException w:name="List Table 3 Accent 3" w:uiPriority="48"/>
-    <w:lsdException w:name="List Table 4 Accent 3" w:uiPriority="49"/>
-    <w:lsdException w:name="List Table 5 Dark Accent 3" w:uiPriority="50"/>
-    <w:lsdException w:name="List Table 6 Colorful Accent 3" w:uiPriority="51"/>
-    <w:lsdException w:name="List Table 7 Colorful Accent 3" w:uiPriority="52"/>
-    <w:lsdException w:name="List Table 1 Light Accent 4" w:uiPriority="46"/>
-    <w:lsdException w:name="List Table 2 Accent 4" w:uiPriority="47"/>
-    <w:lsdException w:name="List Table 3 Accent 4" w:uiPriority="48"/>
-    <w:lsdException w:name="List Table 4 Accent 4" w:uiPriority="49"/>
-    <w:lsdException w:name="List Table 5 Dark Accent 4" w:uiPriority="50"/>
-    <w:lsdException w:name="List Table 6 Colorful Accent 4" w:uiPriority="51"/>
-    <w:lsdException w:name="List Table 7 Colorful Accent 4" w:uiPriority="52"/>
-    <w:lsdException w:name="List Table 1 Light Accent 5" w:uiPriority="46"/>
-    <w:lsdException w:name="List Table 2 Accent 5" w:uiPriority="47"/>
-    <w:lsdException w:name="List Table 3 Accent 5" w:uiPriority="48"/>
-    <w:lsdException w:name="List Table 4 Accent 5" w:uiPriority="49"/>
-    <w:lsdException w:name="List Table 5 Dark Accent 5" w:uiPriority="50"/>
-    <w:lsdException w:name="List Table 6 Colorful Accent 5" w:uiPriority="51"/>
-    <w:lsdException w:name="List Table 7 Colorful Accent 5" w:uiPriority="52"/>
-    <w:lsdException w:name="List Table 1 Light Accent 6" w:uiPriority="46"/>
-    <w:lsdException w:name="List Table 2 Accent 6" w:uiPriority="47"/>
-    <w:lsdException w:name="List Table 3 Accent 6" w:uiPriority="48"/>
-    <w:lsdException w:name="List Table 4 Accent 6" w:uiPriority="49"/>
-    <w:lsdException w:name="List Table 5 Dark Accent 6" w:uiPriority="50"/>
-    <w:lsdException w:name="List Table 6 Colorful Accent 6" w:uiPriority="51"/>
-    <w:lsdException w:name="List Table 7 Colorful Accent 6" w:uiPriority="52"/>
-    <w:lsdException w:name="Mention" w:semiHidden="1" w:unhideWhenUsed="1"/>
-    <w:lsdException w:name="Smart Hyperlink" w:semiHidden="1" w:unhideWhenUsed="1"/>
-    <w:lsdException w:name="Hashtag" w:semiHidden="1" w:unhideWhenUsed="1"/>
-    <w:lsdException w:name="Unresolved Mention" w:semiHidden="1" w:unhideWhenUsed="1"/>
-    <w:lsdException w:name="Smart Link" w:semiHidden="1" w:unhideWhenUsed="1"/>
+  <w:latentStyles w:defLockedState="0" w:defUIPriority="99" w:defSemiHidden="1" w:defUnhideWhenUsed="1" w:defQFormat="0" w:count="267">
+    <w:lsdException w:name="Normal" w:semiHidden="0" w:uiPriority="0" w:unhideWhenUsed="0" w:qFormat="1"/>
+    <w:lsdException w:name="heading 1" w:semiHidden="0" w:uiPriority="9" w:unhideWhenUsed="0" w:qFormat="1"/>
+    <w:lsdException w:name="heading 2" w:uiPriority="9" w:qFormat="1"/>
+    <w:lsdException w:name="heading 3" w:uiPriority="9" w:qFormat="1"/>
+    <w:lsdException w:name="heading 4" w:uiPriority="9" w:qFormat="1"/>
+    <w:lsdException w:name="heading 5" w:uiPriority="9" w:qFormat="1"/>
+    <w:lsdException w:name="heading 6" w:uiPriority="9" w:qFormat="1"/>
+    <w:lsdException w:name="heading 7" w:uiPriority="9" w:qFormat="1"/>
+    <w:lsdException w:name="heading 8" w:uiPriority="9" w:qFormat="1"/>
+    <w:lsdException w:name="heading 9" w:uiPriority="9" w:qFormat="1"/>
+    <w:lsdException w:name="toc 1" w:uiPriority="39"/>
+    <w:lsdException w:name="toc 2" w:uiPriority="39"/>
+    <w:lsdException w:name="toc 3" w:uiPriority="39"/>
+    <w:lsdException w:name="toc 4" w:uiPriority="39"/>
+    <w:lsdException w:name="toc 5" w:uiPriority="39"/>
+    <w:lsdException w:name="toc 6" w:uiPriority="39"/>
+    <w:lsdException w:name="toc 7" w:uiPriority="39"/>
+    <w:lsdException w:name="toc 8" w:uiPriority="39"/>
+    <w:lsdException w:name="toc 9" w:uiPriority="39"/>
+    <w:lsdException w:name="caption" w:uiPriority="35" w:qFormat="1"/>
+    <w:lsdException w:name="Title" w:semiHidden="0" w:uiPriority="10" w:unhideWhenUsed="0" w:qFormat="1"/>
+    <w:lsdException w:name="Default Paragraph Font" w:uiPriority="1"/>
+    <w:lsdException w:name="Subtitle" w:semiHidden="0" w:uiPriority="11" w:unhideWhenUsed="0" w:qFormat="1"/>
+    <w:lsdException w:name="Strong" w:semiHidden="0" w:uiPriority="22" w:unhideWhenUsed="0" w:qFormat="1"/>
+    <w:lsdException w:name="Emphasis" w:semiHidden="0" w:uiPriority="20" w:unhideWhenUsed="0" w:qFormat="1"/>
+    <w:lsdException w:name="Table Grid" w:semiHidden="0" w:uiPriority="39" w:unhideWhenUsed="0"/>
+    <w:lsdException w:name="Placeholder Text" w:unhideWhenUsed="0"/>
+    <w:lsdException w:name="No Spacing" w:semiHidden="0" w:uiPriority="1" w:unhideWhenUsed="0" w:qFormat="1"/>
+    <w:lsdException w:name="Light Shading" w:semiHidden="0" w:uiPriority="60" w:unhideWhenUsed="0"/>
+    <w:lsdException w:name="Light List" w:semiHidden="0" w:uiPriority="61" w:unhideWhenUsed="0"/>
+    <w:lsdException w:name="Light Grid" w:semiHidden="0" w:uiPriority="62" w:unhideWhenUsed="0"/>
+    <w:lsdException w:name="Medium Shading 1" w:semiHidden="0" w:uiPriority="63" w:unhideWhenUsed="0"/>
+    <w:lsdException w:name="Medium Shading 2" w:semiHidden="0" w:uiPriority="64" w:unhideWhenUsed="0"/>
+    <w:lsdException w:name="Medium List 1" w:semiHidden="0" w:uiPriority="65" w:unhideWhenUsed="0"/>
+    <w:lsdException w:name="Medium List 2" w:semiHidden="0" w:uiPriority="66" w:unhideWhenUsed="0"/>
+    <w:lsdException w:name="Medium Grid 1" w:semiHidden="0" w:uiPriority="67" w:unhideWhenUsed="0"/>
+    <w:lsdException w:name="Medium Grid 2" w:semiHidden="0" w:uiPriority="68" w:unhideWhenUsed="0"/>
+    <w:lsdException w:name="Medium Grid 3" w:semiHidden="0" w:uiPriority="69" w:unhideWhenUsed="0"/>
+    <w:lsdException w:name="Dark List" w:semiHidden="0" w:uiPriority="70" w:unhideWhenUsed="0"/>
+    <w:lsdException w:name="Colorful Shading" w:semiHidden="0" w:uiPriority="71" w:unhideWhenUsed="0"/>
+    <w:lsdException w:name="Colorful List" w:semiHidden="0" w:uiPriority="72" w:unhideWhenUsed="0"/>
+    <w:lsdException w:name="Colorful Grid" w:semiHidden="0" w:uiPriority="73" w:unhideWhenUsed="0"/>
+    <w:lsdException w:name="Light Shading Accent 1" w:semiHidden="0" w:uiPriority="60" w:unhideWhenUsed="0"/>
+    <w:lsdException w:name="Light List Accent 1" w:semiHidden="0" w:uiPriority="61" w:unhideWhenUsed="0"/>
+    <w:lsdException w:name="Light Grid Accent 1" w:semiHidden="0" w:uiPriority="62" w:unhideWhenUsed="0"/>
+    <w:lsdException w:name="Medium Shading 1 Accent 1" w:semiHidden="0" w:uiPriority="63" w:unhideWhenUsed="0"/>
+    <w:lsdException w:name="Medium Shading 2 Accent 1" w:semiHidden="0" w:uiPriority="64" w:unhideWhenUsed="0"/>
+    <w:lsdException w:name="Medium List 1 Accent 1" w:semiHidden="0" w:uiPriority="65" w:unhideWhenUsed="0"/>
+    <w:lsdException w:name="Revision" w:unhideWhenUsed="0"/>
+    <w:lsdException w:name="List Paragraph" w:semiHidden="0" w:uiPriority="34" w:unhideWhenUsed="0" w:qFormat="1"/>
+    <w:lsdException w:name="Quote" w:semiHidden="0" w:uiPriority="29" w:unhideWhenUsed="0" w:qFormat="1"/>
+    <w:lsdException w:name="Intense Quote" w:semiHidden="0" w:uiPriority="30" w:unhideWhenUsed="0" w:qFormat="1"/>
+    <w:lsdException w:name="Medium List 2 Accent 1" w:semiHidden="0" w:uiPriority="66" w:unhideWhenUsed="0"/>
+    <w:lsdException w:name="Medium Grid 1 Accent 1" w:semiHidden="0" w:uiPriority="67" w:unhideWhenUsed="0"/>
+    <w:lsdException w:name="Medium Grid 2 Accent 1" w:semiHidden="0" w:uiPriority="68" w:unhideWhenUsed="0"/>
+    <w:lsdException w:name="Medium Grid 3 Accent 1" w:semiHidden="0" w:uiPriority="69" w:unhideWhenUsed="0"/>
+    <w:lsdException w:name="Dark List Accent 1" w:semiHidden="0" w:uiPriority="70" w:unhideWhenUsed="0"/>
+    <w:lsdException w:name="Colorful Shading Accent 1" w:semiHidden="0" w:uiPriority="71" w:unhideWhenUsed="0"/>
+    <w:lsdException w:name="Colorful List Accent 1" w:semiHidden="0" w:uiPriority="72" w:unhideWhenUsed="0"/>
+    <w:lsdException w:name="Colorful Grid Accent 1" w:semiHidden="0" w:uiPriority="73" w:unhideWhenUsed="0"/>
+    <w:lsdException w:name="Light Shading Accent 2" w:semiHidden="0" w:uiPriority="60" w:unhideWhenUsed="0"/>
+    <w:lsdException w:name="Light List Accent 2" w:semiHidden="0" w:uiPriority="61" w:unhideWhenUsed="0"/>
+    <w:lsdException w:name="Light Grid Accent 2" w:semiHidden="0" w:uiPriority="62" w:unhideWhenUsed="0"/>
+    <w:lsdException w:name="Medium Shading 1 Accent 2" w:semiHidden="0" w:uiPriority="63" w:unhideWhenUsed="0"/>
+    <w:lsdException w:name="Medium Shading 2 Accent 2" w:semiHidden="0" w:uiPriority="64" w:unhideWhenUsed="0"/>
+    <w:lsdException w:name="Medium List 1 Accent 2" w:semiHidden="0" w:uiPriority="65" w:unhideWhenUsed="0"/>
+    <w:lsdException w:name="Medium List 2 Accent 2" w:semiHidden="0" w:uiPriority="66" w:unhideWhenUsed="0"/>
+    <w:lsdException w:name="Medium Grid 1 Accent 2" w:semiHidden="0" w:uiPriority="67" w:unhideWhenUsed="0"/>
+    <w:lsdException w:name="Medium Grid 2 Accent 2" w:semiHidden="0" w:uiPriority="68" w:unhideWhenUsed="0"/>
+    <w:lsdException w:name="Medium Grid 3 Accent 2" w:semiHidden="0" w:uiPriority="69" w:unhideWhenUsed="0"/>
+    <w:lsdException w:name="Dark List Accent 2" w:semiHidden="0" w:uiPriority="70" w:unhideWhenUsed="0"/>
+    <w:lsdException w:name="Colorful Shading Accent 2" w:semiHidden="0" w:uiPriority="71" w:unhideWhenUsed="0"/>
+    <w:lsdException w:name="Colorful List Accent 2" w:semiHidden="0" w:uiPriority="72" w:unhideWhenUsed="0"/>
+    <w:lsdException w:name="Colorful Grid Accent 2" w:semiHidden="0" w:uiPriority="73" w:unhideWhenUsed="0"/>
+    <w:lsdException w:name="Light Shading Accent 3" w:semiHidden="0" w:uiPriority="60" w:unhideWhenUsed="0"/>
+    <w:lsdException w:name="Light List Accent 3" w:semiHidden="0" w:uiPriority="61" w:unhideWhenUsed="0"/>
+    <w:lsdException w:name="Light Grid Accent 3" w:semiHidden="0" w:uiPriority="62" w:unhideWhenUsed="0"/>
+    <w:lsdException w:name="Medium Shading 1 Accent 3" w:semiHidden="0" w:uiPriority="63" w:unhideWhenUsed="0"/>
+    <w:lsdException w:name="Medium Shading 2 Accent 3" w:semiHidden="0" w:uiPriority="64" w:unhideWhenUsed="0"/>
+    <w:lsdException w:name="Medium List 1 Accent 3" w:semiHidden="0" w:uiPriority="65" w:unhideWhenUsed="0"/>
+    <w:lsdException w:name="Medium List 2 Accent 3" w:semiHidden="0" w:uiPriority="66" w:unhideWhenUsed="0"/>
+    <w:lsdException w:name="Medium Grid 1 Accent 3" w:semiHidden="0" w:uiPriority="67" w:unhideWhenUsed="0"/>
+    <w:lsdException w:name="Medium Grid 2 Accent 3" w:semiHidden="0" w:uiPriority="68" w:unhideWhenUsed="0"/>
+    <w:lsdException w:name="Medium Grid 3 Accent 3" w:semiHidden="0" w:uiPriority="69" w:unhideWhenUsed="0"/>
+    <w:lsdException w:name="Dark List Accent 3" w:semiHidden="0" w:uiPriority="70" w:unhideWhenUsed="0"/>
+    <w:lsdException w:name="Colorful Shading Accent 3" w:semiHidden="0" w:uiPriority="71" w:unhideWhenUsed="0"/>
+    <w:lsdException w:name="Colorful List Accent 3" w:semiHidden="0" w:uiPriority="72" w:unhideWhenUsed="0"/>
+    <w:lsdException w:name="Colorful Grid Accent 3" w:semiHidden="0" w:uiPriority="73" w:unhideWhenUsed="0"/>
+    <w:lsdException w:name="Light Shading Accent 4" w:semiHidden="0" w:uiPriority="60" w:unhideWhenUsed="0"/>
+    <w:lsdException w:name="Light List Accent 4" w:semiHidden="0" w:uiPriority="61" w:unhideWhenUsed="0"/>
+    <w:lsdException w:name="Light Grid Accent 4" w:semiHidden="0" w:uiPriority="62" w:unhideWhenUsed="0"/>
+    <w:lsdException w:name="Medium Shading 1 Accent 4" w:semiHidden="0" w:uiPriority="63" w:unhideWhenUsed="0"/>
+    <w:lsdException w:name="Medium Shading 2 Accent 4" w:semiHidden="0" w:uiPriority="64" w:unhideWhenUsed="0"/>
+    <w:lsdException w:name="Medium List 1 Accent 4" w:semiHidden="0" w:uiPriority="65" w:unhideWhenUsed="0"/>
+    <w:lsdException w:name="Medium List 2 Accent 4" w:semiHidden="0" w:uiPriority="66" w:unhideWhenUsed="0"/>
+    <w:lsdException w:name="Medium Grid 1 Accent 4" w:semiHidden="0" w:uiPriority="67" w:unhideWhenUsed="0"/>
+    <w:lsdException w:name="Medium Grid 2 Accent 4" w:semiHidden="0" w:uiPriority="68" w:unhideWhenUsed="0"/>
+    <w:lsdException w:name="Medium Grid 3 Accent 4" w:semiHidden="0" w:uiPriority="69" w:unhideWhenUsed="0"/>
+    <w:lsdException w:name="Dark List Accent 4" w:semiHidden="0" w:uiPriority="70" w:unhideWhenUsed="0"/>
+    <w:lsdException w:name="Colorful Shading Accent 4" w:semiHidden="0" w:uiPriority="71" w:unhideWhenUsed="0"/>
+    <w:lsdException w:name="Colorful List Accent 4" w:semiHidden="0" w:uiPriority="72" w:unhideWhenUsed="0"/>
+    <w:lsdException w:name="Colorful Grid Accent 4" w:semiHidden="0" w:uiPriority="73" w:unhideWhenUsed="0"/>
+    <w:lsdException w:name="Light Shading Accent 5" w:semiHidden="0" w:uiPriority="60" w:unhideWhenUsed="0"/>
+    <w:lsdException w:name="Light List Accent 5" w:semiHidden="0" w:uiPriority="61" w:unhideWhenUsed="0"/>
+    <w:lsdException w:name="Light Grid Accent 5" w:semiHidden="0" w:uiPriority="62" w:unhideWhenUsed="0"/>
+    <w:lsdException w:name="Medium Shading 1 Accent 5" w:semiHidden="0" w:uiPriority="63" w:unhideWhenUsed="0"/>
+    <w:lsdException w:name="Medium Shading 2 Accent 5" w:semiHidden="0" w:uiPriority="64" w:unhideWhenUsed="0"/>
+    <w:lsdException w:name="Medium List 1 Accent 5" w:semiHidden="0" w:uiPriority="65" w:unhideWhenUsed="0"/>
+    <w:lsdException w:name="Medium List 2 Accent 5" w:semiHidden="0" w:uiPriority="66" w:unhideWhenUsed="0"/>
+    <w:lsdException w:name="Medium Grid 1 Accent 5" w:semiHidden="0" w:uiPriority="67" w:unhideWhenUsed="0"/>
+    <w:lsdException w:name="Medium Grid 2 Accent 5" w:semiHidden="0" w:uiPriority="68" w:unhideWhenUsed="0"/>
+    <w:lsdException w:name="Medium Grid 3 Accent 5" w:semiHidden="0" w:uiPriority="69" w:unhideWhenUsed="0"/>
+    <w:lsdException w:name="Dark List Accent 5" w:semiHidden="0" w:uiPriority="70" w:unhideWhenUsed="0"/>
+    <w:lsdException w:name="Colorful Shading Accent 5" w:semiHidden="0" w:uiPriority="71" w:unhideWhenUsed="0"/>
+    <w:lsdException w:name="Colorful List Accent 5" w:semiHidden="0" w:uiPriority="72" w:unhideWhenUsed="0"/>
+    <w:lsdException w:name="Colorful Grid Accent 5" w:semiHidden="0" w:uiPriority="73" w:unhideWhenUsed="0"/>
+    <w:lsdException w:name="Light Shading Accent 6" w:semiHidden="0" w:uiPriority="60" w:unhideWhenUsed="0"/>
+    <w:lsdException w:name="Light List Accent 6" w:semiHidden="0" w:uiPriority="61" w:unhideWhenUsed="0"/>
+    <w:lsdException w:name="Light Grid Accent 6" w:semiHidden="0" w:uiPriority="62" w:unhideWhenUsed="0"/>
+    <w:lsdException w:name="Medium Shading 1 Accent 6" w:semiHidden="0" w:uiPriority="63" w:unhideWhenUsed="0"/>
+    <w:lsdException w:name="Medium Shading 2 Accent 6" w:semiHidden="0" w:uiPriority="64" w:unhideWhenUsed="0"/>
+    <w:lsdException w:name="Medium List 1 Accent 6" w:semiHidden="0" w:uiPriority="65" w:unhideWhenUsed="0"/>
+    <w:lsdException w:name="Medium List 2 Accent 6" w:semiHidden="0" w:uiPriority="66" w:unhideWhenUsed="0"/>
+    <w:lsdException w:name="Medium Grid 1 Accent 6" w:semiHidden="0" w:uiPriority="67" w:unhideWhenUsed="0"/>
+    <w:lsdException w:name="Medium Grid 2 Accent 6" w:semiHidden="0" w:uiPriority="68" w:unhideWhenUsed="0"/>
+    <w:lsdException w:name="Medium Grid 3 Accent 6" w:semiHidden="0" w:uiPriority="69" w:unhideWhenUsed="0"/>
+    <w:lsdException w:name="Dark List Accent 6" w:semiHidden="0" w:uiPriority="70" w:unhideWhenUsed="0"/>
+    <w:lsdException w:name="Colorful Shading Accent 6" w:semiHidden="0" w:uiPriority="71" w:unhideWhenUsed="0"/>
+    <w:lsdException w:name="Colorful List Accent 6" w:semiHidden="0" w:uiPriority="72" w:unhideWhenUsed="0"/>
+    <w:lsdException w:name="Colorful Grid Accent 6" w:semiHidden="0" w:uiPriority="73" w:unhideWhenUsed="0"/>
+    <w:lsdException w:name="Subtle Emphasis" w:semiHidden="0" w:uiPriority="19" w:unhideWhenUsed="0" w:qFormat="1"/>
+    <w:lsdException w:name="Intense Emphasis" w:semiHidden="0" w:uiPriority="21" w:unhideWhenUsed="0" w:qFormat="1"/>
+    <w:lsdException w:name="Subtle Reference" w:semiHidden="0" w:uiPriority="31" w:unhideWhenUsed="0" w:qFormat="1"/>
+    <w:lsdException w:name="Intense Reference" w:semiHidden="0" w:uiPriority="32" w:unhideWhenUsed="0" w:qFormat="1"/>
+    <w:lsdException w:name="Book Title" w:semiHidden="0" w:uiPriority="33" w:unhideWhenUsed="0" w:qFormat="1"/>
+    <w:lsdException w:name="Bibliography" w:uiPriority="37"/>
+    <w:lsdException w:name="TOC Heading" w:uiPriority="39" w:qFormat="1"/>
+  </w:latentStyles>
+  <w:style w:type="paragraph" w:default="1" w:styleId="Normal">
+    <w:name w:val="Normal"/>
+    <w:qFormat/>
+  </w:style>
+  <w:style w:type="paragraph" w:styleId="Heading1">
+    <w:name w:val="heading 1"/>
+    <w:basedOn w:val="Normal"/>
+    <w:next w:val="Normal"/>
+    <w:link w:val="Heading1Char"/>
+    <w:uiPriority w:val="9"/>
+    <w:qFormat/>
+    <w:rsid w:val="00CD4189"/>
+    <w:pPr>
+      <w:keepNext/>
+      <w:keepLines/>
+      <w:spacing w:before="360" w:after="80"/>
+      <w:outlineLvl w:val="0"/>
+    </w:pPr>
+    <w:rPr>
+      <w:rFonts w:asciiTheme="majorHAnsi" w:eastAsiaTheme="majorEastAsia" w:hAnsiTheme="majorHAnsi" w:cstheme="majorBidi"/>
+      <w:color w:val="0F4761" w:themeColor="accent1" w:themeShade="BF"/>
+      <w:sz w:val="40"/>
+      <w:szCs w:val="40"/>
+    </w:rPr>
+  </w:style>
+  <w:style w:type="paragraph" w:styleId="Heading2">
+    <w:name w:val="heading 2"/>
+    <w:basedOn w:val="Normal"/>
+    <w:next w:val="Normal"/>
+    <w:link w:val="Heading2Char"/>
+    <w:uiPriority w:val="9"/>
+    <w:semiHidden/>
+    <w:unhideWhenUsed/>
+    <w:qFormat/>
+    <w:rsid w:val="00CD4189"/>
+    <w:pPr>
+      <w:keepNext/>
+      <w:keepLines/>
+      <w:spacing w:before="160" w:after="80"/>
+      <w:outlineLvl w:val="1"/>
+    </w:pPr>
+    <w:rPr>
+      <w:rFonts w:asciiTheme="majorHAnsi" w:eastAsiaTheme="majorEastAsia" w:hAnsiTheme="majorHAnsi" w:cstheme="majorBidi"/>
+      <w:color w:val="0F4761" w:themeColor="accent1" w:themeShade="BF"/>
+      <w:sz w:val="32"/>
+      <w:szCs w:val="32"/>
+    </w:rPr>
+  </w:style>
+  <w:style w:type="paragraph" w:styleId="Heading3">
+    <w:name w:val="heading 3"/>
+    <w:basedOn w:val="Normal"/>
+    <w:next w:val="Normal"/>
+    <w:link w:val="Heading3Char"/>
+    <w:uiPriority w:val="9"/>
+    <w:semiHidden/>
+    <w:unhideWhenUsed/>
+    <w:qFormat/>
+    <w:rsid w:val="00CD4189"/>
+    <w:pPr>
+      <w:keepNext/>
+      <w:keepLines/>
+      <w:spacing w:before="160" w:after="80"/>
+      <w:outlineLvl w:val="2"/>
+    </w:pPr>
+    <w:rPr>
+      <w:rFonts w:eastAsiaTheme="majorEastAsia" w:cstheme="majorBidi"/>
+      <w:color w:val="0F4761" w:themeColor="accent1" w:themeShade="BF"/>
+      <w:sz w:val="28"/>
+      <w:szCs w:val="28"/>
+    </w:rPr>
+  </w:style>
+  <w:style w:type="paragraph" w:styleId="Heading4">
+    <w:name w:val="heading 4"/>
+    <w:basedOn w:val="Normal"/>
+    <w:next w:val="Normal"/>
+    <w:link w:val="Heading4Char"/>
+    <w:uiPriority w:val="9"/>
+    <w:semiHidden/>
+    <w:unhideWhenUsed/>
+    <w:qFormat/>
+    <w:rsid w:val="00CD4189"/>
+    <w:pPr>
+      <w:keepNext/>
+      <w:keepLines/>
+      <w:spacing w:before="80" w:after="40"/>
+      <w:outlineLvl w:val="3"/>
+    </w:pPr>
+    <w:rPr>
+      <w:rFonts w:eastAsiaTheme="majorEastAsia" w:cstheme="majorBidi"/>
+      <w:i/>
+      <w:iCs/>
+      <w:color w:val="0F4761" w:themeColor="accent1" w:themeShade="BF"/>
+    </w:rPr>
+  </w:style>
+  <w:style w:type="paragraph" w:styleId="Heading5">
+    <w:name w:val="heading 5"/>
+    <w:basedOn w:val="Normal"/>
+    <w:next w:val="Normal"/>
+    <w:link w:val="Heading5Char"/>
+    <w:uiPriority w:val="9"/>
+    <w:semiHidden/>
+    <w:unhideWhenUsed/>
+    <w:qFormat/>
+    <w:rsid w:val="00CD4189"/>
+    <w:pPr>
+      <w:keepNext/>
+      <w:keepLines/>
+      <w:spacing w:before="80" w:after="40"/>
+      <w:outlineLvl w:val="4"/>
+    </w:pPr>
+    <w:rPr>
+      <w:rFonts w:eastAsiaTheme="majorEastAsia" w:cstheme="majorBidi"/>
+      <w:color w:val="0F4761" w:themeColor="accent1" w:themeShade="BF"/>
+    </w:rPr>
+  </w:style>
+  <w:style w:type="paragraph" w:styleId="Heading6">
+    <w:name w:val="heading 6"/>
+    <w:basedOn w:val="Normal"/>
+    <w:next w:val="Normal"/>
+    <w:link w:val="Heading6Char"/>
+    <w:uiPriority w:val="9"/>
+    <w:semiHidden/>
+    <w:unhideWhenUsed/>
+    <w:qFormat/>
+    <w:rsid w:val="00CD4189"/>
+    <w:pPr>
+      <w:keepNext/>
+      <w:keepLines/>
+      <w:spacing w:before="40" w:after="0"/>
+      <w:outlineLvl w:val="5"/>
+    </w:pPr>
+    <w:rPr>
+      <w:rFonts w:eastAsiaTheme="majorEastAsia" w:cstheme="majorBidi"/>
+      <w:i/>
+      <w:iCs/>
+      <w:color w:val="595959" w:themeColor="text1" w:themeTint="A6"/>
+    </w:rPr>
+  </w:style>
+  <w:style w:type="paragraph" w:styleId="Heading7">
+    <w:name w:val="heading 7"/>
+    <w:basedOn w:val="Normal"/>
+    <w:next w:val="Normal"/>
+    <w:link w:val="Heading7Char"/>
+    <w:uiPriority w:val="9"/>
+    <w:semiHidden/>
+    <w:unhideWhenUsed/>
+    <w:qFormat/>
+    <w:rsid w:val="00CD4189"/>
+    <w:pPr>
+      <w:keepNext/>
+      <w:keepLines/>
+      <w:spacing w:before="40" w:after="0"/>
+      <w:outlineLvl w:val="6"/>
+    </w:pPr>
+    <w:rPr>
+      <w:rFonts w:eastAsiaTheme="majorEastAsia" w:cstheme="majorBidi"/>
+      <w:color w:val="595959" w:themeColor="text1" w:themeTint="A6"/>
+    </w:rPr>
+  </w:style>
+  <w:style w:type="paragraph" w:styleId="Heading8">
+    <w:name w:val="heading 8"/>
+    <w:basedOn w:val="Normal"/>
+    <w:next w:val="Normal"/>
+    <w:link w:val="Heading8Char"/>
+    <w:uiPriority w:val="9"/>
+    <w:semiHidden/>
+    <w:unhideWhenUsed/>
+    <w:qFormat/>
+    <w:rsid w:val="00CD4189"/>
+    <w:pPr>
+      <w:keepNext/>
+      <w:keepLines/>
+      <w:spacing w:after="0"/>
+      <w:outlineLvl w:val="7"/>
+    </w:pPr>
+    <w:rPr>
+      <w:rFonts w:eastAsiaTheme="majorEastAsia" w:cstheme="majorBidi"/>
+      <w:i/>
+      <w:iCs/>
+      <w:color w:val="272727" w:themeColor="text1" w:themeTint="D8"/>
+    </w:rPr>
+  </w:style>
+  <w:style w:type="paragraph" w:styleId="Heading9">
+    <w:name w:val="heading 9"/>
+    <w:basedOn w:val="Normal"/>
+    <w:next w:val="Normal"/>
+    <w:link w:val="Heading9Char"/>
+    <w:uiPriority w:val="9"/>
+    <w:semiHidden/>
+    <w:unhideWhenUsed/>
+    <w:qFormat/>
+    <w:rsid w:val="00CD4189"/>
+    <w:pPr>
+      <w:keepNext/>
+      <w:keepLines/>
+      <w:spacing w:after="0"/>
+      <w:outlineLvl w:val="8"/>
+    </w:pPr>
+    <w:rPr>
+      <w:rFonts w:eastAsiaTheme="majorEastAsia" w:cstheme="majorBidi"/>
+      <w:color w:val="272727" w:themeColor="text1" w:themeTint="D8"/>
+    </w:rPr>
+  </w:style>
+  <w:style w:type="character" w:default="1" w:styleId="DefaultParagraphFont">
+    <w:name w:val="Default Paragraph Font"/>
+    <w:uiPriority w:val="1"/>
+    <w:semiHidden/>
+    <w:unhideWhenUsed/>
+  </w:style>
+  <w:style w:type="table" w:default="1" w:styleId="TableNormal">
+    <w:name w:val="Normal Table"/>
+    <w:uiPriority w:val="99"/>
+    <w:semiHidden/>
+    <w:unhideWhenUsed/>
+    <w:tblPr>
+      <w:tblInd w:w="0" w:type="dxa"/>
+      <w:tblCellMar>
+        <w:top w:w="0" w:type="dxa"/>
+        <w:left w:w="108" w:type="dxa"/>
+        <w:bottom w:w="0" w:type="dxa"/>
+        <w:right w:w="108" w:type="dxa"/>
+      </w:tblCellMar>
+    </w:tblPr>
+  </w:style>
+  <w:style w:type="numbering" w:default="1" w:styleId="NoList">
+    <w:name w:val="No List"/>
+    <w:uiPriority w:val="99"/>
+    <w:semiHidden/>
+    <w:unhideWhenUsed/>
+  </w:style>
+  <w:style w:type="character" w:customStyle="1" w:styleId="Heading1Char">
+    <w:name w:val="Heading 1 Char"/>
+    <w:basedOn w:val="DefaultParagraphFont"/>
+    <w:link w:val="Heading1"/>
+    <w:uiPriority w:val="9"/>
+    <w:rsid w:val="00CD4189"/>
+    <w:rPr>
+      <w:rFonts w:asciiTheme="majorHAnsi" w:eastAsiaTheme="majorEastAsia" w:hAnsiTheme="majorHAnsi" w:cstheme="majorBidi"/>
+      <w:color w:val="0F4761" w:themeColor="accent1" w:themeShade="BF"/>
+      <w:sz w:val="40"/>
+      <w:szCs w:val="40"/>
+    </w:rPr>
+  </w:style>
+  <w:style w:type="character" w:customStyle="1" w:styleId="Heading2Char">
+    <w:name w:val="Heading 2 Char"/>
+    <w:basedOn w:val="DefaultParagraphFont"/>
+    <w:link w:val="Heading2"/>
+    <w:uiPriority w:val="9"/>
+    <w:semiHidden/>
+    <w:rsid w:val="00CD4189"/>
+    <w:rPr>
+      <w:rFonts w:asciiTheme="majorHAnsi" w:eastAsiaTheme="majorEastAsia" w:hAnsiTheme="majorHAnsi" w:cstheme="majorBidi"/>
+      <w:color w:val="0F4761" w:themeColor="accent1" w:themeShade="BF"/>
+      <w:sz w:val="32"/>
+      <w:szCs w:val="32"/>
+    </w:rPr>
+  </w:style>
+  <w:style w:type="character" w:customStyle="1" w:styleId="Heading3Char">
+    <w:name w:val="Heading 3 Char"/>
+    <w:basedOn w:val="DefaultParagraphFont"/>
+    <w:link w:val="Heading3"/>
+    <w:uiPriority w:val="9"/>
+    <w:semiHidden/>
+    <w:rsid w:val="00CD4189"/>
+    <w:rPr>
+      <w:rFonts w:eastAsiaTheme="majorEastAsia" w:cstheme="majorBidi"/>
+      <w:color w:val="0F4761" w:themeColor="accent1" w:themeShade="BF"/>
+      <w:sz w:val="28"/>
+      <w:szCs w:val="28"/>
+    </w:rPr>
+  </w:style>
+  <w:style w:type="character" w:customStyle="1" w:styleId="Heading4Char">
+    <w:name w:val="Heading 4 Char"/>
+    <w:basedOn w:val="DefaultParagraphFont"/>
+    <w:link w:val="Heading4"/>
+    <w:uiPriority w:val="9"/>
+    <w:semiHidden/>
+    <w:rsid w:val="00CD4189"/>
+    <w:rPr>
+      <w:rFonts w:eastAsiaTheme="majorEastAsia" w:cstheme="majorBidi"/>
+      <w:i/>
+      <w:iCs/>
+      <w:color w:val="0F4761" w:themeColor="accent1" w:themeShade="BF"/>
+    </w:rPr>
+  </w:style>
+  <w:style w:type="character" w:customStyle="1" w:styleId="Heading5Char">
+    <w:name w:val="Heading 5 Char"/>
+    <w:basedOn w:val="DefaultParagraphFont"/>
+    <w:link w:val="Heading5"/>
+    <w:uiPriority w:val="9"/>
+    <w:semiHidden/>
+    <w:rsid w:val="00CD4189"/>
+    <w:rPr>
+      <w:rFonts w:eastAsiaTheme="majorEastAsia" w:cstheme="majorBidi"/>
+      <w:color w:val="0F4761" w:themeColor="accent1" w:themeShade="BF"/>
+    </w:rPr>
+  </w:style>
+  <w:style w:type="character" w:customStyle="1" w:styleId="Heading6Char">
+    <w:name w:val="Heading 6 Char"/>
+    <w:basedOn w:val="DefaultParagraphFont"/>
+    <w:link w:val="Heading6"/>
+    <w:uiPriority w:val="9"/>
+    <w:semiHidden/>
+    <w:rsid w:val="00CD4189"/>
+    <w:rPr>
+      <w:rFonts w:eastAsiaTheme="majorEastAsia" w:cstheme="majorBidi"/>
+      <w:i/>
+      <w:iCs/>
+      <w:color w:val="595959" w:themeColor="text1" w:themeTint="A6"/>
+    </w:rPr>
+  </w:style>
+  <w:style w:type="character" w:customStyle="1" w:styleId="Heading7Char">
+    <w:name w:val="Heading 7 Char"/>
+    <w:basedOn w:val="DefaultParagraphFont"/>
+    <w:link w:val="Heading7"/>
+    <w:uiPriority w:val="9"/>
+    <w:semiHidden/>
+    <w:rsid w:val="00CD4189"/>
+    <w:rPr>
+      <w:rFonts w:eastAsiaTheme="majorEastAsia" w:cstheme="majorBidi"/>
+      <w:color w:val="595959" w:themeColor="text1" w:themeTint="A6"/>
+    </w:rPr>
+  </w:style>
+  <w:style w:type="character" w:customStyle="1" w:styleId="Heading8Char">
+    <w:name w:val="Heading 8 Char"/>
+    <w:basedOn w:val="DefaultParagraphFont"/>
+    <w:link w:val="Heading8"/>
+    <w:uiPriority w:val="9"/>
+    <w:semiHidden/>
+    <w:rsid w:val="00CD4189"/>
+    <w:rPr>
+      <w:rFonts w:eastAsiaTheme="majorEastAsia" w:cstheme="majorBidi"/>
+      <w:i/>
+      <w:iCs/>
+      <w:color w:val="272727" w:themeColor="text1" w:themeTint="D8"/>
+    </w:rPr>
+  </w:style>
+  <w:style w:type="character" w:customStyle="1" w:styleId="Heading9Char">
+    <w:name w:val="Heading 9 Char"/>
+    <w:basedOn w:val="DefaultParagraphFont"/>
+    <w:link w:val="Heading9"/>
+    <w:uiPriority w:val="9"/>
+    <w:semiHidden/>
+    <w:rsid w:val="00CD4189"/>
+    <w:rPr>
+      <w:rFonts w:eastAsiaTheme="majorEastAsia" w:cstheme="majorBidi"/>
+      <w:color w:val="272727" w:themeColor="text1" w:themeTint="D8"/>
+    </w:rPr>
+  </w:style>
+  <w:style w:type="paragraph" w:styleId="Title">
+    <w:name w:val="Title"/>
+    <w:basedOn w:val="Normal"/>
+    <w:next w:val="Normal"/>
+    <w:link w:val="TitleChar"/>
+    <w:uiPriority w:val="10"/>
+    <w:qFormat/>
+    <w:rsid w:val="00CD4189"/>
+    <w:pPr>
+      <w:spacing w:after="80" w:line="240" w:lineRule="auto"/>
+      <w:contextualSpacing/>
+    </w:pPr>
+    <w:rPr>
+      <w:rFonts w:asciiTheme="majorHAnsi" w:eastAsiaTheme="majorEastAsia" w:hAnsiTheme="majorHAnsi" w:cstheme="majorBidi"/>
+      <w:spacing w:val="-10"/>
+      <w:kern w:val="28"/>
+      <w:sz w:val="56"/>
+      <w:szCs w:val="56"/>
+    </w:rPr>
+  </w:style>
+  <w:style w:type="character" w:customStyle="1" w:styleId="TitleChar">
+    <w:name w:val="Title Char"/>
+    <w:basedOn w:val="DefaultParagraphFont"/>
+    <w:link w:val="Title"/>
+    <w:uiPriority w:val="10"/>
+    <w:rsid w:val="00CD4189"/>
+    <w:rPr>
+      <w:rFonts w:asciiTheme="majorHAnsi" w:eastAsiaTheme="majorEastAsia" w:hAnsiTheme="majorHAnsi" w:cstheme="majorBidi"/>
+      <w:spacing w:val="-10"/>
+      <w:kern w:val="28"/>
+      <w:sz w:val="56"/>
+      <w:szCs w:val="56"/>
+    </w:rPr>
+  </w:style>
+  <w:style w:type="paragraph" w:styleId="Subtitle">
+    <w:name w:val="Subtitle"/>
+    <w:basedOn w:val="Normal"/>
+    <w:next w:val="Normal"/>
+    <w:link w:val="SubtitleChar"/>
+    <w:uiPriority w:val="11"/>
+    <w:qFormat/>
+    <w:rsid w:val="00CD4189"/>
+    <w:pPr>
+      <w:numPr>
+        <w:ilvl w:val="1"/>
+      </w:numPr>
+    </w:pPr>
+    <w:rPr>
+      <w:rFonts w:eastAsiaTheme="majorEastAsia" w:cstheme="majorBidi"/>
+      <w:color w:val="595959" w:themeColor="text1" w:themeTint="A6"/>
+      <w:spacing w:val="15"/>
+      <w:sz w:val="28"/>
+      <w:szCs w:val="28"/>
+    </w:rPr>
+  </w:style>
+  <w:style w:type="character" w:customStyle="1" w:styleId="SubtitleChar">
+    <w:name w:val="Subtitle Char"/>
+    <w:basedOn w:val="DefaultParagraphFont"/>
+    <w:link w:val="Subtitle"/>
+    <w:uiPriority w:val="11"/>
+    <w:rsid w:val="00CD4189"/>
+    <w:rPr>
+      <w:rFonts w:eastAsiaTheme="majorEastAsia" w:cstheme="majorBidi"/>
+      <w:color w:val="595959" w:themeColor="text1" w:themeTint="A6"/>
+      <w:spacing w:val="15"/>
+      <w:sz w:val="28"/>
+      <w:szCs w:val="28"/>
+    </w:rPr>
+  </w:style>
+  <w:style w:type="paragraph" w:styleId="Quote">
+    <w:name w:val="Quote"/>
+    <w:basedOn w:val="Normal"/>
+    <w:next w:val="Normal"/>
+    <w:link w:val="QuoteChar"/>
+    <w:uiPriority w:val="29"/>
+    <w:qFormat/>
+    <w:rsid w:val="00CD4189"/>
+    <w:pPr>
+      <w:spacing w:before="160"/>
+      <w:jc w:val="center"/>
+    </w:pPr>
+    <w:rPr>
+      <w:i/>
+      <w:iCs/>
+      <w:color w:val="404040" w:themeColor="text1" w:themeTint="BF"/>
+    </w:rPr>
+  </w:style>
+  <w:style w:type="character" w:customStyle="1" w:styleId="QuoteChar">
+    <w:name w:val="Quote Char"/>
+    <w:basedOn w:val="DefaultParagraphFont"/>
+    <w:link w:val="Quote"/>
+    <w:uiPriority w:val="29"/>
+    <w:rsid w:val="00CD4189"/>
+    <w:rPr>
+      <w:i/>
+      <w:iCs/>
+      <w:color w:val="404040" w:themeColor="text1" w:themeTint="BF"/>
+    </w:rPr>
+  </w:style>
+  <w:style w:type="paragraph" w:styleId="ListParagraph">
+    <w:name w:val="List Paragraph"/>
+    <w:basedOn w:val="Normal"/>
+    <w:uiPriority w:val="34"/>
+    <w:qFormat/>
+    <w:rsid w:val="00CD4189"/>
+    <w:pPr>
+      <w:ind w:left="720"/>
+      <w:contextualSpacing/>
+    </w:pPr>
+  </w:style>
+  <w:style w:type="character" w:styleId="IntenseEmphasis">
+    <w:name w:val="Intense Emphasis"/>
+    <w:basedOn w:val="DefaultParagraphFont"/>
+    <w:uiPriority w:val="21"/>
+    <w:qFormat/>
+    <w:rsid w:val="00CD4189"/>
+    <w:rPr>
+      <w:i/>
+      <w:iCs/>
+      <w:color w:val="0F4761" w:themeColor="accent1" w:themeShade="BF"/>
+    </w:rPr>
+  </w:style>
+  <w:style w:type="paragraph" w:styleId="IntenseQuote">
+    <w:name w:val="Intense Quote"/>
+    <w:basedOn w:val="Normal"/>
+    <w:next w:val="Normal"/>
+    <w:link w:val="IntenseQuoteChar"/>
+    <w:uiPriority w:val="30"/>
+    <w:qFormat/>
+    <w:rsid w:val="00CD4189"/>
+    <w:pPr>
+      <w:pBdr>
+        <w:top w:val="single" w:sz="4" w:space="10" w:color="0F4761" w:themeColor="accent1" w:themeShade="BF"/>
+        <w:bottom w:val="single" w:sz="4" w:space="10" w:color="0F4761" w:themeColor="accent1" w:themeShade="BF"/>
+      </w:pBdr>
+      <w:spacing w:before="360" w:after="360"/>
+      <w:ind w:left="864" w:right="864"/>
+      <w:jc w:val="center"/>
+    </w:pPr>
+    <w:rPr>
+      <w:i/>
+      <w:iCs/>
+      <w:color w:val="0F4761" w:themeColor="accent1" w:themeShade="BF"/>
+    </w:rPr>
+  </w:style>
+  <w:style w:type="character" w:customStyle="1" w:styleId="IntenseQuoteChar">
+    <w:name w:val="Intense Quote Char"/>
+    <w:basedOn w:val="DefaultParagraphFont"/>
+    <w:link w:val="IntenseQuote"/>
+    <w:uiPriority w:val="30"/>
+    <w:rsid w:val="00CD4189"/>
+    <w:rPr>
+      <w:i/>
+      <w:iCs/>
+      <w:color w:val="0F4761" w:themeColor="accent1" w:themeShade="BF"/>
+    </w:rPr>
+  </w:style>
+  <w:style w:type="character" w:styleId="IntenseReference">
+    <w:name w:val="Intense Reference"/>
+    <w:basedOn w:val="DefaultParagraphFont"/>
+    <w:uiPriority w:val="32"/>
+    <w:qFormat/>
+    <w:rsid w:val="00CD4189"/>
+    <w:rPr>
+      <w:b/>
+      <w:bCs/>
+      <w:smallCaps/>
+      <w:color w:val="0F4761" w:themeColor="accent1" w:themeShade="BF"/>
+      <w:spacing w:val="5"/>
+    </w:rPr>
+  </w:style>
+  <w:style w:type="paragraph" w:styleId="NoSpacing">
+    <w:name w:val="No Spacing"/>
+    <w:uiPriority w:val="1"/>
+    <w:qFormat/>
+    <w:rsid w:val="00CD4189"/>
+    <w:pPr>
+      <w:spacing w:after="0" w:line="240" w:lineRule="auto"/>
+    </w:pPr>
+    <w:rPr>
+      <w:rFonts w:ascii="Times New Roman" w:eastAsia="Calibri" w:hAnsi="Times New Roman" w:cs="Times New Roman"/>
+      <w:kern w:val="0"/>
+      <w:sz w:val="28"/>
+      <w:szCs w:val="22"/>
+      <w:lang w:eastAsia="en-US"/>
+      <w14:ligatures w14:val="none"/>
+    </w:rPr>
+  </w:style>
+  <w:style w:type="paragraph" w:styleId="HTMLPreformatted">
+    <w:name w:val="HTML Preformatted"/>
+    <w:basedOn w:val="Normal"/>
+    <w:link w:val="HTMLPreformattedChar"/>
+    <w:uiPriority w:val="99"/>
+    <w:semiHidden/>
+    <w:unhideWhenUsed/>
+    <w:rsid w:val="005411C7"/>
+    <w:pPr>
+      <w:spacing w:after="0" w:line="240" w:lineRule="auto"/>
+    </w:pPr>
+    <w:rPr>
+      <w:rFonts w:ascii="Consolas" w:hAnsi="Consolas"/>
+      <w:sz w:val="20"/>
+      <w:szCs w:val="20"/>
+    </w:rPr>
+  </w:style>
+  <w:style w:type="character" w:customStyle="1" w:styleId="HTMLPreformattedChar">
+    <w:name w:val="HTML Preformatted Char"/>
+    <w:basedOn w:val="DefaultParagraphFont"/>
+    <w:link w:val="HTMLPreformatted"/>
+    <w:uiPriority w:val="99"/>
+    <w:semiHidden/>
+    <w:rsid w:val="005411C7"/>
+    <w:rPr>
+      <w:rFonts w:ascii="Consolas" w:hAnsi="Consolas"/>
+      <w:sz w:val="20"/>
+      <w:szCs w:val="20"/>
+    </w:rPr>
+  </w:style>
+</w:styles>
+</file>
+
+<file path=word/stylesWithEffects.xml><?xml version="1.0" encoding="utf-8"?>
+<w:styles xmlns:wpc="http://schemas.microsoft.com/office/word/2010/wordprocessingCanvas" xmlns:mc="http://schemas.openxmlformats.org/markup-compatibility/2006" xmlns:o="urn:schemas-microsoft-com:office:office" xmlns:r="http://schemas.openxmlformats.org/officeDocument/2006/relationships" xmlns:m="http://schemas.openxmlformats.org/officeDocument/2006/math" xmlns:v="urn:schemas-microsoft-com:vml" xmlns:wp14="http://schemas.microsoft.com/office/word/2010/wordprocessingDrawing" xmlns:wp="http://schemas.openxmlformats.org/drawingml/2006/wordprocessingDrawing" xmlns:w10="urn:schemas-microsoft-com:office:word" xmlns:w="http://schemas.openxmlformats.org/wordprocessingml/2006/main" xmlns:w14="http://schemas.microsoft.com/office/word/2010/wordml" xmlns:wpg="http://schemas.microsoft.com/office/word/2010/wordprocessingGroup" xmlns:wpi="http://schemas.microsoft.com/office/word/2010/wordprocessingInk" xmlns:wne="http://schemas.microsoft.com/office/word/2006/wordml" xmlns:wps="http://schemas.microsoft.com/office/word/2010/wordprocessingShape" mc:Ignorable="w14 wp14">
+  <w:docDefaults>
+    <w:rPrDefault>
+      <w:rPr>
+        <w:rFonts w:asciiTheme="minorHAnsi" w:eastAsiaTheme="minorEastAsia" w:hAnsiTheme="minorHAnsi" w:cstheme="minorBidi"/>
+        <w:kern w:val="2"/>
+        <w:sz w:val="24"/>
+        <w:szCs w:val="24"/>
+        <w:lang w:val="en-US" w:eastAsia="ja-JP" w:bidi="ar-SA"/>
+        <w14:ligatures w14:val="standardContextual"/>
+      </w:rPr>
+    </w:rPrDefault>
+    <w:pPrDefault>
+      <w:pPr>
+        <w:spacing w:after="160" w:line="278" w:lineRule="auto"/>
+      </w:pPr>
+    </w:pPrDefault>
+  </w:docDefaults>
+  <w:latentStyles w:defLockedState="0" w:defUIPriority="99" w:defSemiHidden="1" w:defUnhideWhenUsed="1" w:defQFormat="0" w:count="267">
+    <w:lsdException w:name="Normal" w:semiHidden="0" w:uiPriority="0" w:unhideWhenUsed="0" w:qFormat="1"/>
+    <w:lsdException w:name="heading 1" w:semiHidden="0" w:uiPriority="9" w:unhideWhenUsed="0" w:qFormat="1"/>
+    <w:lsdException w:name="heading 2" w:uiPriority="9" w:qFormat="1"/>
+    <w:lsdException w:name="heading 3" w:uiPriority="9" w:qFormat="1"/>
+    <w:lsdException w:name="heading 4" w:uiPriority="9" w:qFormat="1"/>
+    <w:lsdException w:name="heading 5" w:uiPriority="9" w:qFormat="1"/>
+    <w:lsdException w:name="heading 6" w:uiPriority="9" w:qFormat="1"/>
+    <w:lsdException w:name="heading 7" w:uiPriority="9" w:qFormat="1"/>
+    <w:lsdException w:name="heading 8" w:uiPriority="9" w:qFormat="1"/>
+    <w:lsdException w:name="heading 9" w:uiPriority="9" w:qFormat="1"/>
+    <w:lsdException w:name="toc 1" w:uiPriority="39"/>
+    <w:lsdException w:name="toc 2" w:uiPriority="39"/>
+    <w:lsdException w:name="toc 3" w:uiPriority="39"/>
+    <w:lsdException w:name="toc 4" w:uiPriority="39"/>
+    <w:lsdException w:name="toc 5" w:uiPriority="39"/>
+    <w:lsdException w:name="toc 6" w:uiPriority="39"/>
+    <w:lsdException w:name="toc 7" w:uiPriority="39"/>
+    <w:lsdException w:name="toc 8" w:uiPriority="39"/>
+    <w:lsdException w:name="toc 9" w:uiPriority="39"/>
+    <w:lsdException w:name="caption" w:uiPriority="35" w:qFormat="1"/>
+    <w:lsdException w:name="Title" w:semiHidden="0" w:uiPriority="10" w:unhideWhenUsed="0" w:qFormat="1"/>
+    <w:lsdException w:name="Default Paragraph Font" w:uiPriority="1"/>
+    <w:lsdException w:name="Subtitle" w:semiHidden="0" w:uiPriority="11" w:unhideWhenUsed="0" w:qFormat="1"/>
+    <w:lsdException w:name="Strong" w:semiHidden="0" w:uiPriority="22" w:unhideWhenUsed="0" w:qFormat="1"/>
+    <w:lsdException w:name="Emphasis" w:semiHidden="0" w:uiPriority="20" w:unhideWhenUsed="0" w:qFormat="1"/>
+    <w:lsdException w:name="Table Grid" w:semiHidden="0" w:uiPriority="39" w:unhideWhenUsed="0"/>
+    <w:lsdException w:name="Placeholder Text" w:unhideWhenUsed="0"/>
+    <w:lsdException w:name="No Spacing" w:semiHidden="0" w:uiPriority="1" w:unhideWhenUsed="0" w:qFormat="1"/>
+    <w:lsdException w:name="Light Shading" w:semiHidden="0" w:uiPriority="60" w:unhideWhenUsed="0"/>
+    <w:lsdException w:name="Light List" w:semiHidden="0" w:uiPriority="61" w:unhideWhenUsed="0"/>
+    <w:lsdException w:name="Light Grid" w:semiHidden="0" w:uiPriority="62" w:unhideWhenUsed="0"/>
+    <w:lsdException w:name="Medium Shading 1" w:semiHidden="0" w:uiPriority="63" w:unhideWhenUsed="0"/>
+    <w:lsdException w:name="Medium Shading 2" w:semiHidden="0" w:uiPriority="64" w:unhideWhenUsed="0"/>
+    <w:lsdException w:name="Medium List 1" w:semiHidden="0" w:uiPriority="65" w:unhideWhenUsed="0"/>
+    <w:lsdException w:name="Medium List 2" w:semiHidden="0" w:uiPriority="66" w:unhideWhenUsed="0"/>
+    <w:lsdException w:name="Medium Grid 1" w:semiHidden="0" w:uiPriority="67" w:unhideWhenUsed="0"/>
+    <w:lsdException w:name="Medium Grid 2" w:semiHidden="0" w:uiPriority="68" w:unhideWhenUsed="0"/>
+    <w:lsdException w:name="Medium Grid 3" w:semiHidden="0" w:uiPriority="69" w:unhideWhenUsed="0"/>
+    <w:lsdException w:name="Dark List" w:semiHidden="0" w:uiPriority="70" w:unhideWhenUsed="0"/>
+    <w:lsdException w:name="Colorful Shading" w:semiHidden="0" w:uiPriority="71" w:unhideWhenUsed="0"/>
+    <w:lsdException w:name="Colorful List" w:semiHidden="0" w:uiPriority="72" w:unhideWhenUsed="0"/>
+    <w:lsdException w:name="Colorful Grid" w:semiHidden="0" w:uiPriority="73" w:unhideWhenUsed="0"/>
+    <w:lsdException w:name="Light Shading Accent 1" w:semiHidden="0" w:uiPriority="60" w:unhideWhenUsed="0"/>
+    <w:lsdException w:name="Light List Accent 1" w:semiHidden="0" w:uiPriority="61" w:unhideWhenUsed="0"/>
+    <w:lsdException w:name="Light Grid Accent 1" w:semiHidden="0" w:uiPriority="62" w:unhideWhenUsed="0"/>
+    <w:lsdException w:name="Medium Shading 1 Accent 1" w:semiHidden="0" w:uiPriority="63" w:unhideWhenUsed="0"/>
+    <w:lsdException w:name="Medium Shading 2 Accent 1" w:semiHidden="0" w:uiPriority="64" w:unhideWhenUsed="0"/>
+    <w:lsdException w:name="Medium List 1 Accent 1" w:semiHidden="0" w:uiPriority="65" w:unhideWhenUsed="0"/>
+    <w:lsdException w:name="Revision" w:unhideWhenUsed="0"/>
+    <w:lsdException w:name="List Paragraph" w:semiHidden="0" w:uiPriority="34" w:unhideWhenUsed="0" w:qFormat="1"/>
+    <w:lsdException w:name="Quote" w:semiHidden="0" w:uiPriority="29" w:unhideWhenUsed="0" w:qFormat="1"/>
+    <w:lsdException w:name="Intense Quote" w:semiHidden="0" w:uiPriority="30" w:unhideWhenUsed="0" w:qFormat="1"/>
+    <w:lsdException w:name="Medium List 2 Accent 1" w:semiHidden="0" w:uiPriority="66" w:unhideWhenUsed="0"/>
+    <w:lsdException w:name="Medium Grid 1 Accent 1" w:semiHidden="0" w:uiPriority="67" w:unhideWhenUsed="0"/>
+    <w:lsdException w:name="Medium Grid 2 Accent 1" w:semiHidden="0" w:uiPriority="68" w:unhideWhenUsed="0"/>
+    <w:lsdException w:name="Medium Grid 3 Accent 1" w:semiHidden="0" w:uiPriority="69" w:unhideWhenUsed="0"/>
+    <w:lsdException w:name="Dark List Accent 1" w:semiHidden="0" w:uiPriority="70" w:unhideWhenUsed="0"/>
+    <w:lsdException w:name="Colorful Shading Accent 1" w:semiHidden="0" w:uiPriority="71" w:unhideWhenUsed="0"/>
+    <w:lsdException w:name="Colorful List Accent 1" w:semiHidden="0" w:uiPriority="72" w:unhideWhenUsed="0"/>
+    <w:lsdException w:name="Colorful Grid Accent 1" w:semiHidden="0" w:uiPriority="73" w:unhideWhenUsed="0"/>
+    <w:lsdException w:name="Light Shading Accent 2" w:semiHidden="0" w:uiPriority="60" w:unhideWhenUsed="0"/>
+    <w:lsdException w:name="Light List Accent 2" w:semiHidden="0" w:uiPriority="61" w:unhideWhenUsed="0"/>
+    <w:lsdException w:name="Light Grid Accent 2" w:semiHidden="0" w:uiPriority="62" w:unhideWhenUsed="0"/>
+    <w:lsdException w:name="Medium Shading 1 Accent 2" w:semiHidden="0" w:uiPriority="63" w:unhideWhenUsed="0"/>
+    <w:lsdException w:name="Medium Shading 2 Accent 2" w:semiHidden="0" w:uiPriority="64" w:unhideWhenUsed="0"/>
+    <w:lsdException w:name="Medium List 1 Accent 2" w:semiHidden="0" w:uiPriority="65" w:unhideWhenUsed="0"/>
+    <w:lsdException w:name="Medium List 2 Accent 2" w:semiHidden="0" w:uiPriority="66" w:unhideWhenUsed="0"/>
+    <w:lsdException w:name="Medium Grid 1 Accent 2" w:semiHidden="0" w:uiPriority="67" w:unhideWhenUsed="0"/>
+    <w:lsdException w:name="Medium Grid 2 Accent 2" w:semiHidden="0" w:uiPriority="68" w:unhideWhenUsed="0"/>
+    <w:lsdException w:name="Medium Grid 3 Accent 2" w:semiHidden="0" w:uiPriority="69" w:unhideWhenUsed="0"/>
+    <w:lsdException w:name="Dark List Accent 2" w:semiHidden="0" w:uiPriority="70" w:unhideWhenUsed="0"/>
+    <w:lsdException w:name="Colorful Shading Accent 2" w:semiHidden="0" w:uiPriority="71" w:unhideWhenUsed="0"/>
+    <w:lsdException w:name="Colorful List Accent 2" w:semiHidden="0" w:uiPriority="72" w:unhideWhenUsed="0"/>
+    <w:lsdException w:name="Colorful Grid Accent 2" w:semiHidden="0" w:uiPriority="73" w:unhideWhenUsed="0"/>
+    <w:lsdException w:name="Light Shading Accent 3" w:semiHidden="0" w:uiPriority="60" w:unhideWhenUsed="0"/>
+    <w:lsdException w:name="Light List Accent 3" w:semiHidden="0" w:uiPriority="61" w:unhideWhenUsed="0"/>
+    <w:lsdException w:name="Light Grid Accent 3" w:semiHidden="0" w:uiPriority="62" w:unhideWhenUsed="0"/>
+    <w:lsdException w:name="Medium Shading 1 Accent 3" w:semiHidden="0" w:uiPriority="63" w:unhideWhenUsed="0"/>
+    <w:lsdException w:name="Medium Shading 2 Accent 3" w:semiHidden="0" w:uiPriority="64" w:unhideWhenUsed="0"/>
+    <w:lsdException w:name="Medium List 1 Accent 3" w:semiHidden="0" w:uiPriority="65" w:unhideWhenUsed="0"/>
+    <w:lsdException w:name="Medium List 2 Accent 3" w:semiHidden="0" w:uiPriority="66" w:unhideWhenUsed="0"/>
+    <w:lsdException w:name="Medium Grid 1 Accent 3" w:semiHidden="0" w:uiPriority="67" w:unhideWhenUsed="0"/>
+    <w:lsdException w:name="Medium Grid 2 Accent 3" w:semiHidden="0" w:uiPriority="68" w:unhideWhenUsed="0"/>
+    <w:lsdException w:name="Medium Grid 3 Accent 3" w:semiHidden="0" w:uiPriority="69" w:unhideWhenUsed="0"/>
+    <w:lsdException w:name="Dark List Accent 3" w:semiHidden="0" w:uiPriority="70" w:unhideWhenUsed="0"/>
+    <w:lsdException w:name="Colorful Shading Accent 3" w:semiHidden="0" w:uiPriority="71" w:unhideWhenUsed="0"/>
+    <w:lsdException w:name="Colorful List Accent 3" w:semiHidden="0" w:uiPriority="72" w:unhideWhenUsed="0"/>
+    <w:lsdException w:name="Colorful Grid Accent 3" w:semiHidden="0" w:uiPriority="73" w:unhideWhenUsed="0"/>
+    <w:lsdException w:name="Light Shading Accent 4" w:semiHidden="0" w:uiPriority="60" w:unhideWhenUsed="0"/>
+    <w:lsdException w:name="Light List Accent 4" w:semiHidden="0" w:uiPriority="61" w:unhideWhenUsed="0"/>
+    <w:lsdException w:name="Light Grid Accent 4" w:semiHidden="0" w:uiPriority="62" w:unhideWhenUsed="0"/>
+    <w:lsdException w:name="Medium Shading 1 Accent 4" w:semiHidden="0" w:uiPriority="63" w:unhideWhenUsed="0"/>
+    <w:lsdException w:name="Medium Shading 2 Accent 4" w:semiHidden="0" w:uiPriority="64" w:unhideWhenUsed="0"/>
+    <w:lsdException w:name="Medium List 1 Accent 4" w:semiHidden="0" w:uiPriority="65" w:unhideWhenUsed="0"/>
+    <w:lsdException w:name="Medium List 2 Accent 4" w:semiHidden="0" w:uiPriority="66" w:unhideWhenUsed="0"/>
+    <w:lsdException w:name="Medium Grid 1 Accent 4" w:semiHidden="0" w:uiPriority="67" w:unhideWhenUsed="0"/>
+    <w:lsdException w:name="Medium Grid 2 Accent 4" w:semiHidden="0" w:uiPriority="68" w:unhideWhenUsed="0"/>
+    <w:lsdException w:name="Medium Grid 3 Accent 4" w:semiHidden="0" w:uiPriority="69" w:unhideWhenUsed="0"/>
+    <w:lsdException w:name="Dark List Accent 4" w:semiHidden="0" w:uiPriority="70" w:unhideWhenUsed="0"/>
+    <w:lsdException w:name="Colorful Shading Accent 4" w:semiHidden="0" w:uiPriority="71" w:unhideWhenUsed="0"/>
+    <w:lsdException w:name="Colorful List Accent 4" w:semiHidden="0" w:uiPriority="72" w:unhideWhenUsed="0"/>
+    <w:lsdException w:name="Colorful Grid Accent 4" w:semiHidden="0" w:uiPriority="73" w:unhideWhenUsed="0"/>
+    <w:lsdException w:name="Light Shading Accent 5" w:semiHidden="0" w:uiPriority="60" w:unhideWhenUsed="0"/>
+    <w:lsdException w:name="Light List Accent 5" w:semiHidden="0" w:uiPriority="61" w:unhideWhenUsed="0"/>
+    <w:lsdException w:name="Light Grid Accent 5" w:semiHidden="0" w:uiPriority="62" w:unhideWhenUsed="0"/>
+    <w:lsdException w:name="Medium Shading 1 Accent 5" w:semiHidden="0" w:uiPriority="63" w:unhideWhenUsed="0"/>
+    <w:lsdException w:name="Medium Shading 2 Accent 5" w:semiHidden="0" w:uiPriority="64" w:unhideWhenUsed="0"/>
+    <w:lsdException w:name="Medium List 1 Accent 5" w:semiHidden="0" w:uiPriority="65" w:unhideWhenUsed="0"/>
+    <w:lsdException w:name="Medium List 2 Accent 5" w:semiHidden="0" w:uiPriority="66" w:unhideWhenUsed="0"/>
+    <w:lsdException w:name="Medium Grid 1 Accent 5" w:semiHidden="0" w:uiPriority="67" w:unhideWhenUsed="0"/>
+    <w:lsdException w:name="Medium Grid 2 Accent 5" w:semiHidden="0" w:uiPriority="68" w:unhideWhenUsed="0"/>
+    <w:lsdException w:name="Medium Grid 3 Accent 5" w:semiHidden="0" w:uiPriority="69" w:unhideWhenUsed="0"/>
+    <w:lsdException w:name="Dark List Accent 5" w:semiHidden="0" w:uiPriority="70" w:unhideWhenUsed="0"/>
+    <w:lsdException w:name="Colorful Shading Accent 5" w:semiHidden="0" w:uiPriority="71" w:unhideWhenUsed="0"/>
+    <w:lsdException w:name="Colorful List Accent 5" w:semiHidden="0" w:uiPriority="72" w:unhideWhenUsed="0"/>
+    <w:lsdException w:name="Colorful Grid Accent 5" w:semiHidden="0" w:uiPriority="73" w:unhideWhenUsed="0"/>
+    <w:lsdException w:name="Light Shading Accent 6" w:semiHidden="0" w:uiPriority="60" w:unhideWhenUsed="0"/>
+    <w:lsdException w:name="Light List Accent 6" w:semiHidden="0" w:uiPriority="61" w:unhideWhenUsed="0"/>
+    <w:lsdException w:name="Light Grid Accent 6" w:semiHidden="0" w:uiPriority="62" w:unhideWhenUsed="0"/>
+    <w:lsdException w:name="Medium Shading 1 Accent 6" w:semiHidden="0" w:uiPriority="63" w:unhideWhenUsed="0"/>
+    <w:lsdException w:name="Medium Shading 2 Accent 6" w:semiHidden="0" w:uiPriority="64" w:unhideWhenUsed="0"/>
+    <w:lsdException w:name="Medium List 1 Accent 6" w:semiHidden="0" w:uiPriority="65" w:unhideWhenUsed="0"/>
+    <w:lsdException w:name="Medium List 2 Accent 6" w:semiHidden="0" w:uiPriority="66" w:unhideWhenUsed="0"/>
+    <w:lsdException w:name="Medium Grid 1 Accent 6" w:semiHidden="0" w:uiPriority="67" w:unhideWhenUsed="0"/>
+    <w:lsdException w:name="Medium Grid 2 Accent 6" w:semiHidden="0" w:uiPriority="68" w:unhideWhenUsed="0"/>
+    <w:lsdException w:name="Medium Grid 3 Accent 6" w:semiHidden="0" w:uiPriority="69" w:unhideWhenUsed="0"/>
+    <w:lsdException w:name="Dark List Accent 6" w:semiHidden="0" w:uiPriority="70" w:unhideWhenUsed="0"/>
+    <w:lsdException w:name="Colorful Shading Accent 6" w:semiHidden="0" w:uiPriority="71" w:unhideWhenUsed="0"/>
+    <w:lsdException w:name="Colorful List Accent 6" w:semiHidden="0" w:uiPriority="72" w:unhideWhenUsed="0"/>
+    <w:lsdException w:name="Colorful Grid Accent 6" w:semiHidden="0" w:uiPriority="73" w:unhideWhenUsed="0"/>
+    <w:lsdException w:name="Subtle Emphasis" w:semiHidden="0" w:uiPriority="19" w:unhideWhenUsed="0" w:qFormat="1"/>
+    <w:lsdException w:name="Intense Emphasis" w:semiHidden="0" w:uiPriority="21" w:unhideWhenUsed="0" w:qFormat="1"/>
+    <w:lsdException w:name="Subtle Reference" w:semiHidden="0" w:uiPriority="31" w:unhideWhenUsed="0" w:qFormat="1"/>
+    <w:lsdException w:name="Intense Reference" w:semiHidden="0" w:uiPriority="32" w:unhideWhenUsed="0" w:qFormat="1"/>
+    <w:lsdException w:name="Book Title" w:semiHidden="0" w:uiPriority="33" w:unhideWhenUsed="0" w:qFormat="1"/>
+    <w:lsdException w:name="Bibliography" w:uiPriority="37"/>
+    <w:lsdException w:name="TOC Heading" w:uiPriority="39" w:qFormat="1"/>
   </w:latentStyles>
   <w:style w:type="paragraph" w:default="1" w:styleId="Normal">
     <w:name w:val="Normal"/>
@@ -2262,7 +2724,7 @@
     </a:clrScheme>
     <a:fontScheme name="Office">
       <a:majorFont>
-        <a:latin typeface="Aptos Display" panose="02110004020202020204"/>
+        <a:latin typeface="Aptos Display"/>
         <a:ea typeface=""/>
         <a:cs typeface=""/>
         <a:font script="Jpan" typeface="游ゴシック Light"/>
@@ -2314,7 +2776,7 @@
         <a:font script="Tfng" typeface="Ebrima"/>
       </a:majorFont>
       <a:minorFont>
-        <a:latin typeface="Aptos" panose="02110004020202020204"/>
+        <a:latin typeface="Aptos"/>
         <a:ea typeface=""/>
         <a:cs typeface=""/>
         <a:font script="Jpan" typeface="游明朝"/>
@@ -2528,7 +2990,7 @@
   <a:extraClrSchemeLst/>
   <a:extLst>
     <a:ext uri="{05A4C25C-085E-4340-85A3-A5531E510DB2}">
-      <thm15:themeFamily xmlns:thm15="http://schemas.microsoft.com/office/thememl/2012/main" name="Office Theme" id="{2E142A2C-CD16-42D6-873A-C26D2A0506FA}" vid="{1BDDFF52-6CD6-40A5-AB3C-68EB2F1E4D0A}"/>
+      <thm15:themeFamily xmlns:thm15="http://schemas.microsoft.com/office/thememl/2012/main" xmlns="" name="Office Theme" id="{2E142A2C-CD16-42D6-873A-C26D2A0506FA}" vid="{1BDDFF52-6CD6-40A5-AB3C-68EB2F1E4D0A}"/>
     </a:ext>
   </a:extLst>
 </a:theme>

</xml_diff>

<commit_message>
fix: deposit agreement file generation
</commit_message>
<xml_diff>
--- a/src/main/resources/contract_templates/deposit_contract_template.docx
+++ b/src/main/resources/contract_templates/deposit_contract_template.docx
@@ -302,7 +302,23 @@
           <w:sz w:val="24"/>
           <w:szCs w:val="24"/>
         </w:rPr>
-        <w:t xml:space="preserve"> ${contactPhoneList</w:t>
+        <w:t xml:space="preserve"> ${own</w:t>
+      </w:r>
+      <w:bookmarkStart w:id="0" w:name="_GoBack"/>
+      <w:bookmarkEnd w:id="0"/>
+      <w:r>
+        <w:rPr>
+          <w:sz w:val="24"/>
+          <w:szCs w:val="24"/>
+        </w:rPr>
+        <w:t>erC</w:t>
+      </w:r>
+      <w:r>
+        <w:rPr>
+          <w:sz w:val="24"/>
+          <w:szCs w:val="24"/>
+        </w:rPr>
+        <w:t>ontactPhoneList</w:t>
       </w:r>
       <w:r>
         <w:rPr>
@@ -683,7 +699,35 @@
           <w:sz w:val="24"/>
           <w:szCs w:val="24"/>
         </w:rPr>
-        <w:t xml:space="preserve">     Hợp đồng có thời hạn: .............tháng và bắt đầu tính tiền từ ngày....... tháng.......năm............</w:t>
+        <w:t xml:space="preserve">     Hợp đồng có thời hạn: </w:t>
+      </w:r>
+      <w:r>
+        <w:rPr>
+          <w:sz w:val="24"/>
+          <w:szCs w:val="24"/>
+        </w:rPr>
+        <w:t xml:space="preserve">${contractDuration} </w:t>
+      </w:r>
+      <w:r>
+        <w:rPr>
+          <w:sz w:val="24"/>
+          <w:szCs w:val="24"/>
+        </w:rPr>
+        <w:t>tháng và bắt đầu tính tiền từ</w:t>
+      </w:r>
+      <w:r>
+        <w:rPr>
+          <w:sz w:val="24"/>
+          <w:szCs w:val="24"/>
+        </w:rPr>
+        <w:t xml:space="preserve"> ${contractStartDate}</w:t>
+      </w:r>
+      <w:r>
+        <w:rPr>
+          <w:sz w:val="24"/>
+          <w:szCs w:val="24"/>
+        </w:rPr>
+        <w:t xml:space="preserve"> </w:t>
       </w:r>
     </w:p>
     <w:p>
@@ -729,16 +773,7 @@
           <w:sz w:val="24"/>
           <w:szCs w:val="24"/>
         </w:rPr>
-        <w:t xml:space="preserve">     Phương thức thanh t</w:t>
-      </w:r>
-      <w:bookmarkStart w:id="0" w:name="_GoBack"/>
-      <w:bookmarkEnd w:id="0"/>
-      <w:r>
-        <w:rPr>
-          <w:sz w:val="24"/>
-          <w:szCs w:val="24"/>
-        </w:rPr>
-        <w:t>oán: Đặt cọc</w:t>
+        <w:t xml:space="preserve">     Phương thức thanh toán: Đặt cọc</w:t>
       </w:r>
       <w:r>
         <w:rPr>
@@ -882,14 +917,14 @@
           <w:szCs w:val="24"/>
           <w:bdr w:val="none" w:sz="0" w:space="0" w:color="auto" w:frame="1"/>
         </w:rPr>
-        <w:t xml:space="preserve">  2.1 Từ ngày kí hợp đồng này đến ngày</w:t>
-      </w:r>
-      <w:r>
-        <w:rPr>
-          <w:sz w:val="24"/>
-          <w:szCs w:val="24"/>
-        </w:rPr>
-        <w:t xml:space="preserve"> ${expectedLeaseSignDate}</w:t>
+        <w:t xml:space="preserve">  2.1 Từ ngày kí hợp đồng này đến </w:t>
+      </w:r>
+      <w:r>
+        <w:rPr>
+          <w:sz w:val="24"/>
+          <w:szCs w:val="24"/>
+        </w:rPr>
+        <w:t>${expectedLeaseSignDate}</w:t>
       </w:r>
       <w:r>
         <w:rPr>

</xml_diff>

<commit_message>
feat(occupancy): update contract template files
</commit_message>
<xml_diff>
--- a/src/main/resources/contract_templates/deposit_contract_template.docx
+++ b/src/main/resources/contract_templates/deposit_contract_template.docx
@@ -1,6 +1,6 @@
 
 <file path=word/document.xml><?xml version="1.0" encoding="utf-8"?>
-<w:document xmlns:wpc="http://schemas.microsoft.com/office/word/2010/wordprocessingCanvas" xmlns:mc="http://schemas.openxmlformats.org/markup-compatibility/2006" xmlns:o="urn:schemas-microsoft-com:office:office" xmlns:r="http://schemas.openxmlformats.org/officeDocument/2006/relationships" xmlns:m="http://schemas.openxmlformats.org/officeDocument/2006/math" xmlns:v="urn:schemas-microsoft-com:vml" xmlns:wp14="http://schemas.microsoft.com/office/word/2010/wordprocessingDrawing" xmlns:wp="http://schemas.openxmlformats.org/drawingml/2006/wordprocessingDrawing" xmlns:w10="urn:schemas-microsoft-com:office:word" xmlns:w="http://schemas.openxmlformats.org/wordprocessingml/2006/main" xmlns:w14="http://schemas.microsoft.com/office/word/2010/wordml" xmlns:wpg="http://schemas.microsoft.com/office/word/2010/wordprocessingGroup" xmlns:wpi="http://schemas.microsoft.com/office/word/2010/wordprocessingInk" xmlns:wne="http://schemas.microsoft.com/office/word/2006/wordml" xmlns:wps="http://schemas.microsoft.com/office/word/2010/wordprocessingShape" mc:Ignorable="w14 wp14">
+<w:document xmlns:wpc="http://schemas.microsoft.com/office/word/2010/wordprocessingCanvas" xmlns:cx="http://schemas.microsoft.com/office/drawing/2014/chartex" xmlns:cx1="http://schemas.microsoft.com/office/drawing/2015/9/8/chartex" xmlns:cx2="http://schemas.microsoft.com/office/drawing/2015/10/21/chartex" xmlns:cx3="http://schemas.microsoft.com/office/drawing/2016/5/9/chartex" xmlns:cx4="http://schemas.microsoft.com/office/drawing/2016/5/10/chartex" xmlns:cx5="http://schemas.microsoft.com/office/drawing/2016/5/11/chartex" xmlns:cx6="http://schemas.microsoft.com/office/drawing/2016/5/12/chartex" xmlns:cx7="http://schemas.microsoft.com/office/drawing/2016/5/13/chartex" xmlns:cx8="http://schemas.microsoft.com/office/drawing/2016/5/14/chartex" xmlns:mc="http://schemas.openxmlformats.org/markup-compatibility/2006" xmlns:aink="http://schemas.microsoft.com/office/drawing/2016/ink" xmlns:am3d="http://schemas.microsoft.com/office/drawing/2017/model3d" xmlns:o="urn:schemas-microsoft-com:office:office" xmlns:oel="http://schemas.microsoft.com/office/2019/extlst" xmlns:r="http://schemas.openxmlformats.org/officeDocument/2006/relationships" xmlns:m="http://schemas.openxmlformats.org/officeDocument/2006/math" xmlns:v="urn:schemas-microsoft-com:vml" xmlns:wp14="http://schemas.microsoft.com/office/word/2010/wordprocessingDrawing" xmlns:wp="http://schemas.openxmlformats.org/drawingml/2006/wordprocessingDrawing" xmlns:w10="urn:schemas-microsoft-com:office:word" xmlns:w="http://schemas.openxmlformats.org/wordprocessingml/2006/main" xmlns:w14="http://schemas.microsoft.com/office/word/2010/wordml" xmlns:w15="http://schemas.microsoft.com/office/word/2012/wordml" xmlns:w16cex="http://schemas.microsoft.com/office/word/2018/wordml/cex" xmlns:w16cid="http://schemas.microsoft.com/office/word/2016/wordml/cid" xmlns:w16="http://schemas.microsoft.com/office/word/2018/wordml" xmlns:w16du="http://schemas.microsoft.com/office/word/2023/wordml/word16du" xmlns:w16sdtdh="http://schemas.microsoft.com/office/word/2020/wordml/sdtdatahash" xmlns:w16sdtfl="http://schemas.microsoft.com/office/word/2024/wordml/sdtformatlock" xmlns:w16se="http://schemas.microsoft.com/office/word/2015/wordml/symex" xmlns:wpg="http://schemas.microsoft.com/office/word/2010/wordprocessingGroup" xmlns:wpi="http://schemas.microsoft.com/office/word/2010/wordprocessingInk" xmlns:wne="http://schemas.microsoft.com/office/word/2006/wordml" xmlns:wps="http://schemas.microsoft.com/office/word/2010/wordprocessingShape" mc:Ignorable="w14 w15 w16se w16cid w16 w16cex w16sdtdh w16sdtfl w16du wp14">
   <w:body>
     <w:p>
       <w:pPr>
@@ -123,7 +123,25 @@
           <w:szCs w:val="24"/>
           <w:lang w:eastAsia="ja-JP"/>
         </w:rPr>
-        <w:t xml:space="preserve"> ${issuedAt}</w:t>
+        <w:t xml:space="preserve"> ${issuedAt</w:t>
+      </w:r>
+      <w:r>
+        <w:rPr>
+          <w:rFonts w:eastAsiaTheme="minorEastAsia" w:hint="eastAsia"/>
+          <w:sz w:val="24"/>
+          <w:szCs w:val="24"/>
+          <w:lang w:eastAsia="ja-JP"/>
+        </w:rPr>
+        <w:t>Date</w:t>
+      </w:r>
+      <w:r>
+        <w:rPr>
+          <w:rFonts w:eastAsiaTheme="minorEastAsia" w:hint="eastAsia"/>
+          <w:sz w:val="24"/>
+          <w:szCs w:val="24"/>
+          <w:lang w:eastAsia="ja-JP"/>
+        </w:rPr>
+        <w:t>}</w:t>
       </w:r>
       <w:r>
         <w:rPr>
@@ -198,7 +216,27 @@
           <w:sz w:val="24"/>
           <w:szCs w:val="24"/>
         </w:rPr>
-        <w:t>${ownerFullName}</w:t>
+        <w:t>${ownerFullName</w:t>
+      </w:r>
+      <w:r>
+        <w:rPr>
+          <w:rFonts w:eastAsiaTheme="minorEastAsia" w:hint="eastAsia"/>
+          <w:b/>
+          <w:bCs/>
+          <w:sz w:val="24"/>
+          <w:szCs w:val="24"/>
+          <w:lang w:eastAsia="ja-JP"/>
+        </w:rPr>
+        <w:t>Uppercase</w:t>
+      </w:r>
+      <w:r>
+        <w:rPr>
+          <w:b/>
+          <w:bCs/>
+          <w:sz w:val="24"/>
+          <w:szCs w:val="24"/>
+        </w:rPr>
+        <w:t>}</w:t>
       </w:r>
     </w:p>
     <w:p>
@@ -279,7 +317,23 @@
           <w:sz w:val="24"/>
           <w:szCs w:val="24"/>
         </w:rPr>
-        <w:t>${ownerId}</w:t>
+        <w:t>${ownerId</w:t>
+      </w:r>
+      <w:r>
+        <w:rPr>
+          <w:rFonts w:eastAsiaTheme="minorEastAsia" w:hint="eastAsia"/>
+          <w:sz w:val="24"/>
+          <w:szCs w:val="24"/>
+          <w:lang w:eastAsia="ja-JP"/>
+        </w:rPr>
+        <w:t>IssuedPlace</w:t>
+      </w:r>
+      <w:r>
+        <w:rPr>
+          <w:sz w:val="24"/>
+          <w:szCs w:val="24"/>
+        </w:rPr>
+        <w:t>}</w:t>
       </w:r>
     </w:p>
     <w:p>
@@ -304,8 +358,6 @@
         </w:rPr>
         <w:t xml:space="preserve"> ${own</w:t>
       </w:r>
-      <w:bookmarkStart w:id="0" w:name="_GoBack"/>
-      <w:bookmarkEnd w:id="0"/>
       <w:r>
         <w:rPr>
           <w:sz w:val="24"/>
@@ -422,7 +474,25 @@
           <w:szCs w:val="24"/>
           <w:lang w:eastAsia="ja-JP"/>
         </w:rPr>
-        <w:t xml:space="preserve"> ${fullName}</w:t>
+        <w:t xml:space="preserve"> ${</w:t>
+      </w:r>
+      <w:r>
+        <w:rPr>
+          <w:rFonts w:eastAsiaTheme="minorEastAsia" w:hint="eastAsia"/>
+          <w:sz w:val="24"/>
+          <w:szCs w:val="24"/>
+          <w:lang w:eastAsia="ja-JP"/>
+        </w:rPr>
+        <w:t>signerF</w:t>
+      </w:r>
+      <w:r>
+        <w:rPr>
+          <w:rFonts w:eastAsiaTheme="minorEastAsia" w:hint="eastAsia"/>
+          <w:sz w:val="24"/>
+          <w:szCs w:val="24"/>
+          <w:lang w:eastAsia="ja-JP"/>
+        </w:rPr>
+        <w:t>ullName}</w:t>
       </w:r>
       <w:r>
         <w:rPr>
@@ -464,7 +534,25 @@
           <w:szCs w:val="24"/>
           <w:lang w:eastAsia="ja-JP"/>
         </w:rPr>
-        <w:t>: ${idNumber}</w:t>
+        <w:t>: ${</w:t>
+      </w:r>
+      <w:r>
+        <w:rPr>
+          <w:rFonts w:eastAsiaTheme="minorEastAsia" w:hint="eastAsia"/>
+          <w:sz w:val="24"/>
+          <w:szCs w:val="24"/>
+          <w:lang w:eastAsia="ja-JP"/>
+        </w:rPr>
+        <w:t>signerI</w:t>
+      </w:r>
+      <w:r>
+        <w:rPr>
+          <w:rFonts w:eastAsiaTheme="minorEastAsia" w:hint="eastAsia"/>
+          <w:sz w:val="24"/>
+          <w:szCs w:val="24"/>
+          <w:lang w:eastAsia="ja-JP"/>
+        </w:rPr>
+        <w:t>dNumber}</w:t>
       </w:r>
       <w:r>
         <w:rPr>
@@ -482,10 +570,19 @@
       </w:r>
       <w:r>
         <w:rPr>
-          <w:sz w:val="24"/>
-          <w:szCs w:val="24"/>
-        </w:rPr>
-        <w:t xml:space="preserve">idIssuedDate} </w:t>
+          <w:rFonts w:eastAsiaTheme="minorEastAsia" w:hint="eastAsia"/>
+          <w:sz w:val="24"/>
+          <w:szCs w:val="24"/>
+          <w:lang w:eastAsia="ja-JP"/>
+        </w:rPr>
+        <w:t>signerI</w:t>
+      </w:r>
+      <w:r>
+        <w:rPr>
+          <w:sz w:val="24"/>
+          <w:szCs w:val="24"/>
+        </w:rPr>
+        <w:t xml:space="preserve">dIssuedDate} </w:t>
       </w:r>
       <w:r>
         <w:rPr>
@@ -499,7 +596,23 @@
           <w:sz w:val="24"/>
           <w:szCs w:val="24"/>
         </w:rPr>
-        <w:t>${idIssuedPlace}</w:t>
+        <w:t>${</w:t>
+      </w:r>
+      <w:r>
+        <w:rPr>
+          <w:rFonts w:eastAsiaTheme="minorEastAsia" w:hint="eastAsia"/>
+          <w:sz w:val="24"/>
+          <w:szCs w:val="24"/>
+          <w:lang w:eastAsia="ja-JP"/>
+        </w:rPr>
+        <w:t>signerI</w:t>
+      </w:r>
+      <w:r>
+        <w:rPr>
+          <w:sz w:val="24"/>
+          <w:szCs w:val="24"/>
+        </w:rPr>
+        <w:t>dIssuedPlace}</w:t>
       </w:r>
     </w:p>
     <w:p>
@@ -527,7 +640,43 @@
           <w:szCs w:val="24"/>
           <w:lang w:eastAsia="ja-JP"/>
         </w:rPr>
-        <w:t xml:space="preserve"> ${phone}</w:t>
+        <w:t xml:space="preserve"> ${</w:t>
+      </w:r>
+      <w:r>
+        <w:rPr>
+          <w:rFonts w:eastAsiaTheme="minorEastAsia" w:hint="eastAsia"/>
+          <w:sz w:val="24"/>
+          <w:szCs w:val="24"/>
+          <w:lang w:eastAsia="ja-JP"/>
+        </w:rPr>
+        <w:t>signerP</w:t>
+      </w:r>
+      <w:r>
+        <w:rPr>
+          <w:rFonts w:eastAsiaTheme="minorEastAsia" w:hint="eastAsia"/>
+          <w:sz w:val="24"/>
+          <w:szCs w:val="24"/>
+          <w:lang w:eastAsia="ja-JP"/>
+        </w:rPr>
+        <w:t>hone</w:t>
+      </w:r>
+      <w:r>
+        <w:rPr>
+          <w:rFonts w:eastAsiaTheme="minorEastAsia" w:hint="eastAsia"/>
+          <w:sz w:val="24"/>
+          <w:szCs w:val="24"/>
+          <w:lang w:eastAsia="ja-JP"/>
+        </w:rPr>
+        <w:t>Number</w:t>
+      </w:r>
+      <w:r>
+        <w:rPr>
+          <w:rFonts w:eastAsiaTheme="minorEastAsia" w:hint="eastAsia"/>
+          <w:sz w:val="24"/>
+          <w:szCs w:val="24"/>
+          <w:lang w:eastAsia="ja-JP"/>
+        </w:rPr>
+        <w:t>}</w:t>
       </w:r>
     </w:p>
     <w:p>
@@ -557,10 +706,19 @@
       </w:r>
       <w:r>
         <w:rPr>
-          <w:sz w:val="24"/>
-          <w:szCs w:val="24"/>
-        </w:rPr>
-        <w:t>permanentAddress</w:t>
+          <w:rFonts w:eastAsiaTheme="minorEastAsia" w:hint="eastAsia"/>
+          <w:sz w:val="24"/>
+          <w:szCs w:val="24"/>
+          <w:lang w:eastAsia="ja-JP"/>
+        </w:rPr>
+        <w:t>signerP</w:t>
+      </w:r>
+      <w:r>
+        <w:rPr>
+          <w:sz w:val="24"/>
+          <w:szCs w:val="24"/>
+        </w:rPr>
+        <w:t>ermanentAddress</w:t>
       </w:r>
       <w:r>
         <w:rPr>
@@ -660,7 +818,50 @@
           <w:sz w:val="24"/>
           <w:szCs w:val="24"/>
         </w:rPr>
-        <w:t>. Tòa nhà có địa chỉ: Số 70A1, Thôn 4, xã Thạch Hoà, Thạch Thất, Hà Nội. Do bên A đại diện là Ban Quản Lý tòa nhà với các thỏa thuận trong hợp đồng như sau:</w:t>
+        <w:t>. Tòa nhà có địa chỉ:</w:t>
+      </w:r>
+      <w:r>
+        <w:rPr>
+          <w:rFonts w:eastAsiaTheme="minorEastAsia" w:hint="eastAsia"/>
+          <w:sz w:val="24"/>
+          <w:szCs w:val="24"/>
+          <w:lang w:eastAsia="ja-JP"/>
+        </w:rPr>
+        <w:t xml:space="preserve"> </w:t>
+      </w:r>
+      <w:r>
+        <w:rPr>
+          <w:rFonts w:eastAsiaTheme="minorEastAsia" w:hint="eastAsia"/>
+          <w:sz w:val="24"/>
+          <w:szCs w:val="24"/>
+          <w:lang w:eastAsia="ja-JP"/>
+        </w:rPr>
+        <w:t>${</w:t>
+      </w:r>
+      <w:r>
+        <w:rPr>
+          <w:rFonts w:eastAsiaTheme="minorEastAsia" w:hint="eastAsia"/>
+          <w:sz w:val="24"/>
+          <w:szCs w:val="24"/>
+          <w:lang w:eastAsia="ja-JP"/>
+        </w:rPr>
+        <w:t>propertyAddress</w:t>
+      </w:r>
+      <w:r>
+        <w:rPr>
+          <w:rFonts w:eastAsiaTheme="minorEastAsia" w:hint="eastAsia"/>
+          <w:sz w:val="24"/>
+          <w:szCs w:val="24"/>
+          <w:lang w:eastAsia="ja-JP"/>
+        </w:rPr>
+        <w:t>}</w:t>
+      </w:r>
+      <w:r>
+        <w:rPr>
+          <w:sz w:val="24"/>
+          <w:szCs w:val="24"/>
+        </w:rPr>
+        <w:t>. Do bên A đại diện là Ban Quản Lý tòa nhà với các thỏa thuận trong hợp đồng như sau:</w:t>
       </w:r>
     </w:p>
     <w:p>
@@ -683,7 +884,55 @@
           <w:sz w:val="24"/>
           <w:szCs w:val="24"/>
         </w:rPr>
-        <w:t xml:space="preserve"> ${occupantNumber}</w:t>
+        <w:t xml:space="preserve"> ${</w:t>
+      </w:r>
+      <w:r>
+        <w:rPr>
+          <w:rFonts w:eastAsiaTheme="minorEastAsia" w:hint="eastAsia"/>
+          <w:sz w:val="24"/>
+          <w:szCs w:val="24"/>
+          <w:lang w:eastAsia="ja-JP"/>
+        </w:rPr>
+        <w:t>signer</w:t>
+      </w:r>
+      <w:r>
+        <w:rPr>
+          <w:sz w:val="24"/>
+          <w:szCs w:val="24"/>
+        </w:rPr>
+        <w:t>Number</w:t>
+      </w:r>
+      <w:r>
+        <w:rPr>
+          <w:rFonts w:eastAsiaTheme="minorEastAsia" w:hint="eastAsia"/>
+          <w:sz w:val="24"/>
+          <w:szCs w:val="24"/>
+          <w:lang w:eastAsia="ja-JP"/>
+        </w:rPr>
+        <w:t>OfO</w:t>
+      </w:r>
+      <w:r>
+        <w:rPr>
+          <w:sz w:val="24"/>
+          <w:szCs w:val="24"/>
+        </w:rPr>
+        <w:t>ccupant</w:t>
+      </w:r>
+      <w:r>
+        <w:rPr>
+          <w:rFonts w:eastAsiaTheme="minorEastAsia" w:hint="eastAsia"/>
+          <w:sz w:val="24"/>
+          <w:szCs w:val="24"/>
+          <w:lang w:eastAsia="ja-JP"/>
+        </w:rPr>
+        <w:t>s</w:t>
+      </w:r>
+      <w:r>
+        <w:rPr>
+          <w:sz w:val="24"/>
+          <w:szCs w:val="24"/>
+        </w:rPr>
+        <w:t>}</w:t>
       </w:r>
     </w:p>
     <w:p>
@@ -1013,6 +1262,7 @@
           <w:sz w:val="24"/>
           <w:szCs w:val="24"/>
         </w:rPr>
+        <w:lastRenderedPageBreak/>
         <w:t xml:space="preserve">   3.1 Hai bên xác định hoàn toàn tự nguyện khi ký hợp đồng này và cam kết cùng nhau thực hiện nghiêm túc những điều khoản trên đây.</w:t>
       </w:r>
     </w:p>
@@ -1029,7 +1279,6 @@
           <w:sz w:val="24"/>
           <w:szCs w:val="24"/>
         </w:rPr>
-        <w:lastRenderedPageBreak/>
         <w:t xml:space="preserve">   3.2 Hợp đồng này có hiệu lực từ ngày ký, hợp đồng được lập thành 02 bản, mỗi bên giữ 01 bản có giá trị pháp lý như nhau. Sau khi đọc hợp đồng cả 2 bên đã hiểu rõ quyền lợi và nghĩa vụ của mình và cùng ký tện dưới đây.</w:t>
       </w:r>
     </w:p>
@@ -1090,7 +1339,25 @@
           <w:sz w:val="24"/>
           <w:szCs w:val="24"/>
         </w:rPr>
-        <w:t>${depositSignedDateString}</w:t>
+        <w:t>${</w:t>
+      </w:r>
+      <w:r>
+        <w:rPr>
+          <w:rFonts w:eastAsiaTheme="minorEastAsia" w:hint="eastAsia"/>
+          <w:i/>
+          <w:sz w:val="24"/>
+          <w:szCs w:val="24"/>
+          <w:lang w:eastAsia="ja-JP"/>
+        </w:rPr>
+        <w:t>issuedAtDateString</w:t>
+      </w:r>
+      <w:r>
+        <w:rPr>
+          <w:i/>
+          <w:sz w:val="24"/>
+          <w:szCs w:val="24"/>
+        </w:rPr>
+        <w:t>}</w:t>
       </w:r>
     </w:p>
     <w:p>
@@ -1200,14 +1467,34 @@
           <w:sz w:val="24"/>
           <w:szCs w:val="24"/>
         </w:rPr>
-        <w:t>${ownerFullName}</w:t>
-      </w:r>
-      <w:r>
-        <w:rPr>
+        <w:t>${ownerFullName</w:t>
+      </w:r>
+      <w:r>
+        <w:rPr>
+          <w:rFonts w:eastAsiaTheme="minorEastAsia" w:hint="eastAsia"/>
           <w:b/>
           <w:bCs/>
           <w:sz w:val="24"/>
           <w:szCs w:val="24"/>
+          <w:lang w:eastAsia="ja-JP"/>
+        </w:rPr>
+        <w:t>Uppercase</w:t>
+      </w:r>
+      <w:r>
+        <w:rPr>
+          <w:b/>
+          <w:bCs/>
+          <w:sz w:val="24"/>
+          <w:szCs w:val="24"/>
+        </w:rPr>
+        <w:t>}</w:t>
+      </w:r>
+      <w:r>
+        <w:rPr>
+          <w:b/>
+          <w:bCs/>
+          <w:sz w:val="24"/>
+          <w:szCs w:val="24"/>
         </w:rPr>
         <w:tab/>
       </w:r>
@@ -1246,7 +1533,6 @@
           <w:szCs w:val="24"/>
         </w:rPr>
         <w:tab/>
-        <w:t>${fullName}</w:t>
       </w:r>
     </w:p>
     <w:p/>
@@ -1261,7 +1547,7 @@
 </file>
 
 <file path=word/styles.xml><?xml version="1.0" encoding="utf-8"?>
-<w:styles xmlns:mc="http://schemas.openxmlformats.org/markup-compatibility/2006" xmlns:r="http://schemas.openxmlformats.org/officeDocument/2006/relationships" xmlns:w="http://schemas.openxmlformats.org/wordprocessingml/2006/main" xmlns:w14="http://schemas.microsoft.com/office/word/2010/wordml" mc:Ignorable="w14">
+<w:styles xmlns:mc="http://schemas.openxmlformats.org/markup-compatibility/2006" xmlns:r="http://schemas.openxmlformats.org/officeDocument/2006/relationships" xmlns:w="http://schemas.openxmlformats.org/wordprocessingml/2006/main" xmlns:w14="http://schemas.microsoft.com/office/word/2010/wordml" xmlns:w15="http://schemas.microsoft.com/office/word/2012/wordml" xmlns:w16cex="http://schemas.microsoft.com/office/word/2018/wordml/cex" xmlns:w16cid="http://schemas.microsoft.com/office/word/2016/wordml/cid" xmlns:w16="http://schemas.microsoft.com/office/word/2018/wordml" xmlns:w16du="http://schemas.microsoft.com/office/word/2023/wordml/word16du" xmlns:w16sdtdh="http://schemas.microsoft.com/office/word/2020/wordml/sdtdatahash" xmlns:w16sdtfl="http://schemas.microsoft.com/office/word/2024/wordml/sdtformatlock" xmlns:w16se="http://schemas.microsoft.com/office/word/2015/wordml/symex" mc:Ignorable="w14 w15 w16se w16cid w16 w16cex w16sdtdh w16sdtfl w16du">
   <w:docDefaults>
     <w:rPrDefault>
       <w:rPr>
@@ -1279,144 +1565,383 @@
       </w:pPr>
     </w:pPrDefault>
   </w:docDefaults>
-  <w:latentStyles w:defLockedState="0" w:defUIPriority="99" w:defSemiHidden="1" w:defUnhideWhenUsed="1" w:defQFormat="0" w:count="267">
-    <w:lsdException w:name="Normal" w:semiHidden="0" w:uiPriority="0" w:unhideWhenUsed="0" w:qFormat="1"/>
-    <w:lsdException w:name="heading 1" w:semiHidden="0" w:uiPriority="9" w:unhideWhenUsed="0" w:qFormat="1"/>
-    <w:lsdException w:name="heading 2" w:uiPriority="9" w:qFormat="1"/>
-    <w:lsdException w:name="heading 3" w:uiPriority="9" w:qFormat="1"/>
-    <w:lsdException w:name="heading 4" w:uiPriority="9" w:qFormat="1"/>
-    <w:lsdException w:name="heading 5" w:uiPriority="9" w:qFormat="1"/>
-    <w:lsdException w:name="heading 6" w:uiPriority="9" w:qFormat="1"/>
-    <w:lsdException w:name="heading 7" w:uiPriority="9" w:qFormat="1"/>
-    <w:lsdException w:name="heading 8" w:uiPriority="9" w:qFormat="1"/>
-    <w:lsdException w:name="heading 9" w:uiPriority="9" w:qFormat="1"/>
-    <w:lsdException w:name="toc 1" w:uiPriority="39"/>
-    <w:lsdException w:name="toc 2" w:uiPriority="39"/>
-    <w:lsdException w:name="toc 3" w:uiPriority="39"/>
-    <w:lsdException w:name="toc 4" w:uiPriority="39"/>
-    <w:lsdException w:name="toc 5" w:uiPriority="39"/>
-    <w:lsdException w:name="toc 6" w:uiPriority="39"/>
-    <w:lsdException w:name="toc 7" w:uiPriority="39"/>
-    <w:lsdException w:name="toc 8" w:uiPriority="39"/>
-    <w:lsdException w:name="toc 9" w:uiPriority="39"/>
-    <w:lsdException w:name="caption" w:uiPriority="35" w:qFormat="1"/>
-    <w:lsdException w:name="Title" w:semiHidden="0" w:uiPriority="10" w:unhideWhenUsed="0" w:qFormat="1"/>
-    <w:lsdException w:name="Default Paragraph Font" w:uiPriority="1"/>
-    <w:lsdException w:name="Subtitle" w:semiHidden="0" w:uiPriority="11" w:unhideWhenUsed="0" w:qFormat="1"/>
-    <w:lsdException w:name="Strong" w:semiHidden="0" w:uiPriority="22" w:unhideWhenUsed="0" w:qFormat="1"/>
-    <w:lsdException w:name="Emphasis" w:semiHidden="0" w:uiPriority="20" w:unhideWhenUsed="0" w:qFormat="1"/>
-    <w:lsdException w:name="Table Grid" w:semiHidden="0" w:uiPriority="39" w:unhideWhenUsed="0"/>
-    <w:lsdException w:name="Placeholder Text" w:unhideWhenUsed="0"/>
-    <w:lsdException w:name="No Spacing" w:semiHidden="0" w:uiPriority="1" w:unhideWhenUsed="0" w:qFormat="1"/>
-    <w:lsdException w:name="Light Shading" w:semiHidden="0" w:uiPriority="60" w:unhideWhenUsed="0"/>
-    <w:lsdException w:name="Light List" w:semiHidden="0" w:uiPriority="61" w:unhideWhenUsed="0"/>
-    <w:lsdException w:name="Light Grid" w:semiHidden="0" w:uiPriority="62" w:unhideWhenUsed="0"/>
-    <w:lsdException w:name="Medium Shading 1" w:semiHidden="0" w:uiPriority="63" w:unhideWhenUsed="0"/>
-    <w:lsdException w:name="Medium Shading 2" w:semiHidden="0" w:uiPriority="64" w:unhideWhenUsed="0"/>
-    <w:lsdException w:name="Medium List 1" w:semiHidden="0" w:uiPriority="65" w:unhideWhenUsed="0"/>
-    <w:lsdException w:name="Medium List 2" w:semiHidden="0" w:uiPriority="66" w:unhideWhenUsed="0"/>
-    <w:lsdException w:name="Medium Grid 1" w:semiHidden="0" w:uiPriority="67" w:unhideWhenUsed="0"/>
-    <w:lsdException w:name="Medium Grid 2" w:semiHidden="0" w:uiPriority="68" w:unhideWhenUsed="0"/>
-    <w:lsdException w:name="Medium Grid 3" w:semiHidden="0" w:uiPriority="69" w:unhideWhenUsed="0"/>
-    <w:lsdException w:name="Dark List" w:semiHidden="0" w:uiPriority="70" w:unhideWhenUsed="0"/>
-    <w:lsdException w:name="Colorful Shading" w:semiHidden="0" w:uiPriority="71" w:unhideWhenUsed="0"/>
-    <w:lsdException w:name="Colorful List" w:semiHidden="0" w:uiPriority="72" w:unhideWhenUsed="0"/>
-    <w:lsdException w:name="Colorful Grid" w:semiHidden="0" w:uiPriority="73" w:unhideWhenUsed="0"/>
-    <w:lsdException w:name="Light Shading Accent 1" w:semiHidden="0" w:uiPriority="60" w:unhideWhenUsed="0"/>
-    <w:lsdException w:name="Light List Accent 1" w:semiHidden="0" w:uiPriority="61" w:unhideWhenUsed="0"/>
-    <w:lsdException w:name="Light Grid Accent 1" w:semiHidden="0" w:uiPriority="62" w:unhideWhenUsed="0"/>
-    <w:lsdException w:name="Medium Shading 1 Accent 1" w:semiHidden="0" w:uiPriority="63" w:unhideWhenUsed="0"/>
-    <w:lsdException w:name="Medium Shading 2 Accent 1" w:semiHidden="0" w:uiPriority="64" w:unhideWhenUsed="0"/>
-    <w:lsdException w:name="Medium List 1 Accent 1" w:semiHidden="0" w:uiPriority="65" w:unhideWhenUsed="0"/>
-    <w:lsdException w:name="Revision" w:unhideWhenUsed="0"/>
-    <w:lsdException w:name="List Paragraph" w:semiHidden="0" w:uiPriority="34" w:unhideWhenUsed="0" w:qFormat="1"/>
-    <w:lsdException w:name="Quote" w:semiHidden="0" w:uiPriority="29" w:unhideWhenUsed="0" w:qFormat="1"/>
-    <w:lsdException w:name="Intense Quote" w:semiHidden="0" w:uiPriority="30" w:unhideWhenUsed="0" w:qFormat="1"/>
-    <w:lsdException w:name="Medium List 2 Accent 1" w:semiHidden="0" w:uiPriority="66" w:unhideWhenUsed="0"/>
-    <w:lsdException w:name="Medium Grid 1 Accent 1" w:semiHidden="0" w:uiPriority="67" w:unhideWhenUsed="0"/>
-    <w:lsdException w:name="Medium Grid 2 Accent 1" w:semiHidden="0" w:uiPriority="68" w:unhideWhenUsed="0"/>
-    <w:lsdException w:name="Medium Grid 3 Accent 1" w:semiHidden="0" w:uiPriority="69" w:unhideWhenUsed="0"/>
-    <w:lsdException w:name="Dark List Accent 1" w:semiHidden="0" w:uiPriority="70" w:unhideWhenUsed="0"/>
-    <w:lsdException w:name="Colorful Shading Accent 1" w:semiHidden="0" w:uiPriority="71" w:unhideWhenUsed="0"/>
-    <w:lsdException w:name="Colorful List Accent 1" w:semiHidden="0" w:uiPriority="72" w:unhideWhenUsed="0"/>
-    <w:lsdException w:name="Colorful Grid Accent 1" w:semiHidden="0" w:uiPriority="73" w:unhideWhenUsed="0"/>
-    <w:lsdException w:name="Light Shading Accent 2" w:semiHidden="0" w:uiPriority="60" w:unhideWhenUsed="0"/>
-    <w:lsdException w:name="Light List Accent 2" w:semiHidden="0" w:uiPriority="61" w:unhideWhenUsed="0"/>
-    <w:lsdException w:name="Light Grid Accent 2" w:semiHidden="0" w:uiPriority="62" w:unhideWhenUsed="0"/>
-    <w:lsdException w:name="Medium Shading 1 Accent 2" w:semiHidden="0" w:uiPriority="63" w:unhideWhenUsed="0"/>
-    <w:lsdException w:name="Medium Shading 2 Accent 2" w:semiHidden="0" w:uiPriority="64" w:unhideWhenUsed="0"/>
-    <w:lsdException w:name="Medium List 1 Accent 2" w:semiHidden="0" w:uiPriority="65" w:unhideWhenUsed="0"/>
-    <w:lsdException w:name="Medium List 2 Accent 2" w:semiHidden="0" w:uiPriority="66" w:unhideWhenUsed="0"/>
-    <w:lsdException w:name="Medium Grid 1 Accent 2" w:semiHidden="0" w:uiPriority="67" w:unhideWhenUsed="0"/>
-    <w:lsdException w:name="Medium Grid 2 Accent 2" w:semiHidden="0" w:uiPriority="68" w:unhideWhenUsed="0"/>
-    <w:lsdException w:name="Medium Grid 3 Accent 2" w:semiHidden="0" w:uiPriority="69" w:unhideWhenUsed="0"/>
-    <w:lsdException w:name="Dark List Accent 2" w:semiHidden="0" w:uiPriority="70" w:unhideWhenUsed="0"/>
-    <w:lsdException w:name="Colorful Shading Accent 2" w:semiHidden="0" w:uiPriority="71" w:unhideWhenUsed="0"/>
-    <w:lsdException w:name="Colorful List Accent 2" w:semiHidden="0" w:uiPriority="72" w:unhideWhenUsed="0"/>
-    <w:lsdException w:name="Colorful Grid Accent 2" w:semiHidden="0" w:uiPriority="73" w:unhideWhenUsed="0"/>
-    <w:lsdException w:name="Light Shading Accent 3" w:semiHidden="0" w:uiPriority="60" w:unhideWhenUsed="0"/>
-    <w:lsdException w:name="Light List Accent 3" w:semiHidden="0" w:uiPriority="61" w:unhideWhenUsed="0"/>
-    <w:lsdException w:name="Light Grid Accent 3" w:semiHidden="0" w:uiPriority="62" w:unhideWhenUsed="0"/>
-    <w:lsdException w:name="Medium Shading 1 Accent 3" w:semiHidden="0" w:uiPriority="63" w:unhideWhenUsed="0"/>
-    <w:lsdException w:name="Medium Shading 2 Accent 3" w:semiHidden="0" w:uiPriority="64" w:unhideWhenUsed="0"/>
-    <w:lsdException w:name="Medium List 1 Accent 3" w:semiHidden="0" w:uiPriority="65" w:unhideWhenUsed="0"/>
-    <w:lsdException w:name="Medium List 2 Accent 3" w:semiHidden="0" w:uiPriority="66" w:unhideWhenUsed="0"/>
-    <w:lsdException w:name="Medium Grid 1 Accent 3" w:semiHidden="0" w:uiPriority="67" w:unhideWhenUsed="0"/>
-    <w:lsdException w:name="Medium Grid 2 Accent 3" w:semiHidden="0" w:uiPriority="68" w:unhideWhenUsed="0"/>
-    <w:lsdException w:name="Medium Grid 3 Accent 3" w:semiHidden="0" w:uiPriority="69" w:unhideWhenUsed="0"/>
-    <w:lsdException w:name="Dark List Accent 3" w:semiHidden="0" w:uiPriority="70" w:unhideWhenUsed="0"/>
-    <w:lsdException w:name="Colorful Shading Accent 3" w:semiHidden="0" w:uiPriority="71" w:unhideWhenUsed="0"/>
-    <w:lsdException w:name="Colorful List Accent 3" w:semiHidden="0" w:uiPriority="72" w:unhideWhenUsed="0"/>
-    <w:lsdException w:name="Colorful Grid Accent 3" w:semiHidden="0" w:uiPriority="73" w:unhideWhenUsed="0"/>
-    <w:lsdException w:name="Light Shading Accent 4" w:semiHidden="0" w:uiPriority="60" w:unhideWhenUsed="0"/>
-    <w:lsdException w:name="Light List Accent 4" w:semiHidden="0" w:uiPriority="61" w:unhideWhenUsed="0"/>
-    <w:lsdException w:name="Light Grid Accent 4" w:semiHidden="0" w:uiPriority="62" w:unhideWhenUsed="0"/>
-    <w:lsdException w:name="Medium Shading 1 Accent 4" w:semiHidden="0" w:uiPriority="63" w:unhideWhenUsed="0"/>
-    <w:lsdException w:name="Medium Shading 2 Accent 4" w:semiHidden="0" w:uiPriority="64" w:unhideWhenUsed="0"/>
-    <w:lsdException w:name="Medium List 1 Accent 4" w:semiHidden="0" w:uiPriority="65" w:unhideWhenUsed="0"/>
-    <w:lsdException w:name="Medium List 2 Accent 4" w:semiHidden="0" w:uiPriority="66" w:unhideWhenUsed="0"/>
-    <w:lsdException w:name="Medium Grid 1 Accent 4" w:semiHidden="0" w:uiPriority="67" w:unhideWhenUsed="0"/>
-    <w:lsdException w:name="Medium Grid 2 Accent 4" w:semiHidden="0" w:uiPriority="68" w:unhideWhenUsed="0"/>
-    <w:lsdException w:name="Medium Grid 3 Accent 4" w:semiHidden="0" w:uiPriority="69" w:unhideWhenUsed="0"/>
-    <w:lsdException w:name="Dark List Accent 4" w:semiHidden="0" w:uiPriority="70" w:unhideWhenUsed="0"/>
-    <w:lsdException w:name="Colorful Shading Accent 4" w:semiHidden="0" w:uiPriority="71" w:unhideWhenUsed="0"/>
-    <w:lsdException w:name="Colorful List Accent 4" w:semiHidden="0" w:uiPriority="72" w:unhideWhenUsed="0"/>
-    <w:lsdException w:name="Colorful Grid Accent 4" w:semiHidden="0" w:uiPriority="73" w:unhideWhenUsed="0"/>
-    <w:lsdException w:name="Light Shading Accent 5" w:semiHidden="0" w:uiPriority="60" w:unhideWhenUsed="0"/>
-    <w:lsdException w:name="Light List Accent 5" w:semiHidden="0" w:uiPriority="61" w:unhideWhenUsed="0"/>
-    <w:lsdException w:name="Light Grid Accent 5" w:semiHidden="0" w:uiPriority="62" w:unhideWhenUsed="0"/>
-    <w:lsdException w:name="Medium Shading 1 Accent 5" w:semiHidden="0" w:uiPriority="63" w:unhideWhenUsed="0"/>
-    <w:lsdException w:name="Medium Shading 2 Accent 5" w:semiHidden="0" w:uiPriority="64" w:unhideWhenUsed="0"/>
-    <w:lsdException w:name="Medium List 1 Accent 5" w:semiHidden="0" w:uiPriority="65" w:unhideWhenUsed="0"/>
-    <w:lsdException w:name="Medium List 2 Accent 5" w:semiHidden="0" w:uiPriority="66" w:unhideWhenUsed="0"/>
-    <w:lsdException w:name="Medium Grid 1 Accent 5" w:semiHidden="0" w:uiPriority="67" w:unhideWhenUsed="0"/>
-    <w:lsdException w:name="Medium Grid 2 Accent 5" w:semiHidden="0" w:uiPriority="68" w:unhideWhenUsed="0"/>
-    <w:lsdException w:name="Medium Grid 3 Accent 5" w:semiHidden="0" w:uiPriority="69" w:unhideWhenUsed="0"/>
-    <w:lsdException w:name="Dark List Accent 5" w:semiHidden="0" w:uiPriority="70" w:unhideWhenUsed="0"/>
-    <w:lsdException w:name="Colorful Shading Accent 5" w:semiHidden="0" w:uiPriority="71" w:unhideWhenUsed="0"/>
-    <w:lsdException w:name="Colorful List Accent 5" w:semiHidden="0" w:uiPriority="72" w:unhideWhenUsed="0"/>
-    <w:lsdException w:name="Colorful Grid Accent 5" w:semiHidden="0" w:uiPriority="73" w:unhideWhenUsed="0"/>
-    <w:lsdException w:name="Light Shading Accent 6" w:semiHidden="0" w:uiPriority="60" w:unhideWhenUsed="0"/>
-    <w:lsdException w:name="Light List Accent 6" w:semiHidden="0" w:uiPriority="61" w:unhideWhenUsed="0"/>
-    <w:lsdException w:name="Light Grid Accent 6" w:semiHidden="0" w:uiPriority="62" w:unhideWhenUsed="0"/>
-    <w:lsdException w:name="Medium Shading 1 Accent 6" w:semiHidden="0" w:uiPriority="63" w:unhideWhenUsed="0"/>
-    <w:lsdException w:name="Medium Shading 2 Accent 6" w:semiHidden="0" w:uiPriority="64" w:unhideWhenUsed="0"/>
-    <w:lsdException w:name="Medium List 1 Accent 6" w:semiHidden="0" w:uiPriority="65" w:unhideWhenUsed="0"/>
-    <w:lsdException w:name="Medium List 2 Accent 6" w:semiHidden="0" w:uiPriority="66" w:unhideWhenUsed="0"/>
-    <w:lsdException w:name="Medium Grid 1 Accent 6" w:semiHidden="0" w:uiPriority="67" w:unhideWhenUsed="0"/>
-    <w:lsdException w:name="Medium Grid 2 Accent 6" w:semiHidden="0" w:uiPriority="68" w:unhideWhenUsed="0"/>
-    <w:lsdException w:name="Medium Grid 3 Accent 6" w:semiHidden="0" w:uiPriority="69" w:unhideWhenUsed="0"/>
-    <w:lsdException w:name="Dark List Accent 6" w:semiHidden="0" w:uiPriority="70" w:unhideWhenUsed="0"/>
-    <w:lsdException w:name="Colorful Shading Accent 6" w:semiHidden="0" w:uiPriority="71" w:unhideWhenUsed="0"/>
-    <w:lsdException w:name="Colorful List Accent 6" w:semiHidden="0" w:uiPriority="72" w:unhideWhenUsed="0"/>
-    <w:lsdException w:name="Colorful Grid Accent 6" w:semiHidden="0" w:uiPriority="73" w:unhideWhenUsed="0"/>
-    <w:lsdException w:name="Subtle Emphasis" w:semiHidden="0" w:uiPriority="19" w:unhideWhenUsed="0" w:qFormat="1"/>
-    <w:lsdException w:name="Intense Emphasis" w:semiHidden="0" w:uiPriority="21" w:unhideWhenUsed="0" w:qFormat="1"/>
-    <w:lsdException w:name="Subtle Reference" w:semiHidden="0" w:uiPriority="31" w:unhideWhenUsed="0" w:qFormat="1"/>
-    <w:lsdException w:name="Intense Reference" w:semiHidden="0" w:uiPriority="32" w:unhideWhenUsed="0" w:qFormat="1"/>
-    <w:lsdException w:name="Book Title" w:semiHidden="0" w:uiPriority="33" w:unhideWhenUsed="0" w:qFormat="1"/>
-    <w:lsdException w:name="Bibliography" w:uiPriority="37"/>
-    <w:lsdException w:name="TOC Heading" w:uiPriority="39" w:qFormat="1"/>
+  <w:latentStyles w:defLockedState="0" w:defUIPriority="99" w:defSemiHidden="0" w:defUnhideWhenUsed="0" w:defQFormat="0" w:count="376">
+    <w:lsdException w:name="Normal" w:uiPriority="0" w:qFormat="1"/>
+    <w:lsdException w:name="heading 1" w:uiPriority="9" w:qFormat="1"/>
+    <w:lsdException w:name="heading 2" w:semiHidden="1" w:uiPriority="9" w:unhideWhenUsed="1" w:qFormat="1"/>
+    <w:lsdException w:name="heading 3" w:semiHidden="1" w:uiPriority="9" w:unhideWhenUsed="1" w:qFormat="1"/>
+    <w:lsdException w:name="heading 4" w:semiHidden="1" w:uiPriority="9" w:unhideWhenUsed="1" w:qFormat="1"/>
+    <w:lsdException w:name="heading 5" w:semiHidden="1" w:uiPriority="9" w:unhideWhenUsed="1" w:qFormat="1"/>
+    <w:lsdException w:name="heading 6" w:semiHidden="1" w:uiPriority="9" w:unhideWhenUsed="1" w:qFormat="1"/>
+    <w:lsdException w:name="heading 7" w:semiHidden="1" w:uiPriority="9" w:unhideWhenUsed="1" w:qFormat="1"/>
+    <w:lsdException w:name="heading 8" w:semiHidden="1" w:uiPriority="9" w:unhideWhenUsed="1" w:qFormat="1"/>
+    <w:lsdException w:name="heading 9" w:semiHidden="1" w:uiPriority="9" w:unhideWhenUsed="1" w:qFormat="1"/>
+    <w:lsdException w:name="index 1" w:semiHidden="1" w:unhideWhenUsed="1"/>
+    <w:lsdException w:name="index 2" w:semiHidden="1" w:unhideWhenUsed="1"/>
+    <w:lsdException w:name="index 3" w:semiHidden="1" w:unhideWhenUsed="1"/>
+    <w:lsdException w:name="index 4" w:semiHidden="1" w:unhideWhenUsed="1"/>
+    <w:lsdException w:name="index 5" w:semiHidden="1" w:unhideWhenUsed="1"/>
+    <w:lsdException w:name="index 6" w:semiHidden="1" w:unhideWhenUsed="1"/>
+    <w:lsdException w:name="index 7" w:semiHidden="1" w:unhideWhenUsed="1"/>
+    <w:lsdException w:name="index 8" w:semiHidden="1" w:unhideWhenUsed="1"/>
+    <w:lsdException w:name="index 9" w:semiHidden="1" w:unhideWhenUsed="1"/>
+    <w:lsdException w:name="toc 1" w:semiHidden="1" w:uiPriority="39" w:unhideWhenUsed="1"/>
+    <w:lsdException w:name="toc 2" w:semiHidden="1" w:uiPriority="39" w:unhideWhenUsed="1"/>
+    <w:lsdException w:name="toc 3" w:semiHidden="1" w:uiPriority="39" w:unhideWhenUsed="1"/>
+    <w:lsdException w:name="toc 4" w:semiHidden="1" w:uiPriority="39" w:unhideWhenUsed="1"/>
+    <w:lsdException w:name="toc 5" w:semiHidden="1" w:uiPriority="39" w:unhideWhenUsed="1"/>
+    <w:lsdException w:name="toc 6" w:semiHidden="1" w:uiPriority="39" w:unhideWhenUsed="1"/>
+    <w:lsdException w:name="toc 7" w:semiHidden="1" w:uiPriority="39" w:unhideWhenUsed="1"/>
+    <w:lsdException w:name="toc 8" w:semiHidden="1" w:uiPriority="39" w:unhideWhenUsed="1"/>
+    <w:lsdException w:name="toc 9" w:semiHidden="1" w:uiPriority="39" w:unhideWhenUsed="1"/>
+    <w:lsdException w:name="Normal Indent" w:semiHidden="1" w:unhideWhenUsed="1"/>
+    <w:lsdException w:name="footnote text" w:semiHidden="1" w:unhideWhenUsed="1"/>
+    <w:lsdException w:name="annotation text" w:semiHidden="1" w:unhideWhenUsed="1"/>
+    <w:lsdException w:name="header" w:semiHidden="1" w:unhideWhenUsed="1"/>
+    <w:lsdException w:name="footer" w:semiHidden="1" w:unhideWhenUsed="1"/>
+    <w:lsdException w:name="index heading" w:semiHidden="1" w:unhideWhenUsed="1"/>
+    <w:lsdException w:name="caption" w:semiHidden="1" w:uiPriority="35" w:unhideWhenUsed="1" w:qFormat="1"/>
+    <w:lsdException w:name="table of figures" w:semiHidden="1" w:unhideWhenUsed="1"/>
+    <w:lsdException w:name="envelope address" w:semiHidden="1" w:unhideWhenUsed="1"/>
+    <w:lsdException w:name="envelope return" w:semiHidden="1" w:unhideWhenUsed="1"/>
+    <w:lsdException w:name="footnote reference" w:semiHidden="1" w:unhideWhenUsed="1"/>
+    <w:lsdException w:name="annotation reference" w:semiHidden="1" w:unhideWhenUsed="1"/>
+    <w:lsdException w:name="line number" w:semiHidden="1" w:unhideWhenUsed="1"/>
+    <w:lsdException w:name="page number" w:semiHidden="1" w:unhideWhenUsed="1"/>
+    <w:lsdException w:name="endnote reference" w:semiHidden="1" w:unhideWhenUsed="1"/>
+    <w:lsdException w:name="endnote text" w:semiHidden="1" w:unhideWhenUsed="1"/>
+    <w:lsdException w:name="table of authorities" w:semiHidden="1" w:unhideWhenUsed="1"/>
+    <w:lsdException w:name="macro" w:semiHidden="1" w:unhideWhenUsed="1"/>
+    <w:lsdException w:name="toa heading" w:semiHidden="1" w:unhideWhenUsed="1"/>
+    <w:lsdException w:name="List" w:semiHidden="1" w:unhideWhenUsed="1"/>
+    <w:lsdException w:name="List Bullet" w:semiHidden="1" w:unhideWhenUsed="1"/>
+    <w:lsdException w:name="List Number" w:semiHidden="1" w:unhideWhenUsed="1"/>
+    <w:lsdException w:name="List 2" w:semiHidden="1" w:unhideWhenUsed="1"/>
+    <w:lsdException w:name="List 3" w:semiHidden="1" w:unhideWhenUsed="1"/>
+    <w:lsdException w:name="List 4" w:semiHidden="1" w:unhideWhenUsed="1"/>
+    <w:lsdException w:name="List 5" w:semiHidden="1" w:unhideWhenUsed="1"/>
+    <w:lsdException w:name="List Bullet 2" w:semiHidden="1" w:unhideWhenUsed="1"/>
+    <w:lsdException w:name="List Bullet 3" w:semiHidden="1" w:unhideWhenUsed="1"/>
+    <w:lsdException w:name="List Bullet 4" w:semiHidden="1" w:unhideWhenUsed="1"/>
+    <w:lsdException w:name="List Bullet 5" w:semiHidden="1" w:unhideWhenUsed="1"/>
+    <w:lsdException w:name="List Number 2" w:semiHidden="1" w:unhideWhenUsed="1"/>
+    <w:lsdException w:name="List Number 3" w:semiHidden="1" w:unhideWhenUsed="1"/>
+    <w:lsdException w:name="List Number 4" w:semiHidden="1" w:unhideWhenUsed="1"/>
+    <w:lsdException w:name="List Number 5" w:semiHidden="1" w:unhideWhenUsed="1"/>
+    <w:lsdException w:name="Title" w:uiPriority="10" w:qFormat="1"/>
+    <w:lsdException w:name="Closing" w:semiHidden="1" w:unhideWhenUsed="1"/>
+    <w:lsdException w:name="Signature" w:semiHidden="1" w:unhideWhenUsed="1"/>
+    <w:lsdException w:name="Default Paragraph Font" w:semiHidden="1" w:uiPriority="1" w:unhideWhenUsed="1"/>
+    <w:lsdException w:name="Body Text" w:semiHidden="1" w:unhideWhenUsed="1"/>
+    <w:lsdException w:name="Body Text Indent" w:semiHidden="1" w:unhideWhenUsed="1"/>
+    <w:lsdException w:name="List Continue" w:semiHidden="1" w:unhideWhenUsed="1"/>
+    <w:lsdException w:name="List Continue 2" w:semiHidden="1" w:unhideWhenUsed="1"/>
+    <w:lsdException w:name="List Continue 3" w:semiHidden="1" w:unhideWhenUsed="1"/>
+    <w:lsdException w:name="List Continue 4" w:semiHidden="1" w:unhideWhenUsed="1"/>
+    <w:lsdException w:name="List Continue 5" w:semiHidden="1" w:unhideWhenUsed="1"/>
+    <w:lsdException w:name="Message Header" w:semiHidden="1" w:unhideWhenUsed="1"/>
+    <w:lsdException w:name="Subtitle" w:uiPriority="11" w:qFormat="1"/>
+    <w:lsdException w:name="Salutation" w:semiHidden="1" w:unhideWhenUsed="1"/>
+    <w:lsdException w:name="Date" w:semiHidden="1" w:unhideWhenUsed="1"/>
+    <w:lsdException w:name="Body Text First Indent" w:semiHidden="1" w:unhideWhenUsed="1"/>
+    <w:lsdException w:name="Body Text First Indent 2" w:semiHidden="1" w:unhideWhenUsed="1"/>
+    <w:lsdException w:name="Note Heading" w:semiHidden="1" w:unhideWhenUsed="1"/>
+    <w:lsdException w:name="Body Text 2" w:semiHidden="1" w:unhideWhenUsed="1"/>
+    <w:lsdException w:name="Body Text 3" w:semiHidden="1" w:unhideWhenUsed="1"/>
+    <w:lsdException w:name="Body Text Indent 2" w:semiHidden="1" w:unhideWhenUsed="1"/>
+    <w:lsdException w:name="Body Text Indent 3" w:semiHidden="1" w:unhideWhenUsed="1"/>
+    <w:lsdException w:name="Block Text" w:semiHidden="1" w:unhideWhenUsed="1"/>
+    <w:lsdException w:name="Hyperlink" w:semiHidden="1" w:unhideWhenUsed="1"/>
+    <w:lsdException w:name="FollowedHyperlink" w:semiHidden="1" w:unhideWhenUsed="1"/>
+    <w:lsdException w:name="Strong" w:uiPriority="22" w:qFormat="1"/>
+    <w:lsdException w:name="Emphasis" w:uiPriority="20" w:qFormat="1"/>
+    <w:lsdException w:name="Document Map" w:semiHidden="1" w:unhideWhenUsed="1"/>
+    <w:lsdException w:name="Plain Text" w:semiHidden="1" w:unhideWhenUsed="1"/>
+    <w:lsdException w:name="E-mail Signature" w:semiHidden="1" w:unhideWhenUsed="1"/>
+    <w:lsdException w:name="HTML Top of Form" w:semiHidden="1" w:unhideWhenUsed="1"/>
+    <w:lsdException w:name="HTML Bottom of Form" w:semiHidden="1" w:unhideWhenUsed="1"/>
+    <w:lsdException w:name="Normal (Web)" w:semiHidden="1" w:unhideWhenUsed="1"/>
+    <w:lsdException w:name="HTML Acronym" w:semiHidden="1" w:unhideWhenUsed="1"/>
+    <w:lsdException w:name="HTML Address" w:semiHidden="1" w:unhideWhenUsed="1"/>
+    <w:lsdException w:name="HTML Cite" w:semiHidden="1" w:unhideWhenUsed="1"/>
+    <w:lsdException w:name="HTML Code" w:semiHidden="1" w:unhideWhenUsed="1"/>
+    <w:lsdException w:name="HTML Definition" w:semiHidden="1" w:unhideWhenUsed="1"/>
+    <w:lsdException w:name="HTML Keyboard" w:semiHidden="1" w:unhideWhenUsed="1"/>
+    <w:lsdException w:name="HTML Preformatted" w:semiHidden="1" w:unhideWhenUsed="1"/>
+    <w:lsdException w:name="HTML Sample" w:semiHidden="1" w:unhideWhenUsed="1"/>
+    <w:lsdException w:name="HTML Typewriter" w:semiHidden="1" w:unhideWhenUsed="1"/>
+    <w:lsdException w:name="HTML Variable" w:semiHidden="1" w:unhideWhenUsed="1"/>
+    <w:lsdException w:name="Normal Table" w:semiHidden="1" w:unhideWhenUsed="1"/>
+    <w:lsdException w:name="annotation subject" w:semiHidden="1" w:unhideWhenUsed="1"/>
+    <w:lsdException w:name="No List" w:semiHidden="1" w:unhideWhenUsed="1"/>
+    <w:lsdException w:name="Outline List 1" w:semiHidden="1" w:unhideWhenUsed="1"/>
+    <w:lsdException w:name="Outline List 2" w:semiHidden="1" w:unhideWhenUsed="1"/>
+    <w:lsdException w:name="Outline List 3" w:semiHidden="1" w:unhideWhenUsed="1"/>
+    <w:lsdException w:name="Table Simple 1" w:semiHidden="1" w:unhideWhenUsed="1"/>
+    <w:lsdException w:name="Table Simple 2" w:semiHidden="1" w:unhideWhenUsed="1"/>
+    <w:lsdException w:name="Table Simple 3" w:semiHidden="1" w:unhideWhenUsed="1"/>
+    <w:lsdException w:name="Table Classic 1" w:semiHidden="1" w:unhideWhenUsed="1"/>
+    <w:lsdException w:name="Table Classic 2" w:semiHidden="1" w:unhideWhenUsed="1"/>
+    <w:lsdException w:name="Table Classic 3" w:semiHidden="1" w:unhideWhenUsed="1"/>
+    <w:lsdException w:name="Table Classic 4" w:semiHidden="1" w:unhideWhenUsed="1"/>
+    <w:lsdException w:name="Table Colorful 1" w:semiHidden="1" w:unhideWhenUsed="1"/>
+    <w:lsdException w:name="Table Colorful 2" w:semiHidden="1" w:unhideWhenUsed="1"/>
+    <w:lsdException w:name="Table Colorful 3" w:semiHidden="1" w:unhideWhenUsed="1"/>
+    <w:lsdException w:name="Table Columns 1" w:semiHidden="1" w:unhideWhenUsed="1"/>
+    <w:lsdException w:name="Table Columns 2" w:semiHidden="1" w:unhideWhenUsed="1"/>
+    <w:lsdException w:name="Table Columns 3" w:semiHidden="1" w:unhideWhenUsed="1"/>
+    <w:lsdException w:name="Table Columns 4" w:semiHidden="1" w:unhideWhenUsed="1"/>
+    <w:lsdException w:name="Table Columns 5" w:semiHidden="1" w:unhideWhenUsed="1"/>
+    <w:lsdException w:name="Table Grid 1" w:semiHidden="1" w:unhideWhenUsed="1"/>
+    <w:lsdException w:name="Table Grid 2" w:semiHidden="1" w:unhideWhenUsed="1"/>
+    <w:lsdException w:name="Table Grid 3" w:semiHidden="1" w:unhideWhenUsed="1"/>
+    <w:lsdException w:name="Table Grid 4" w:semiHidden="1" w:unhideWhenUsed="1"/>
+    <w:lsdException w:name="Table Grid 5" w:semiHidden="1" w:unhideWhenUsed="1"/>
+    <w:lsdException w:name="Table Grid 6" w:semiHidden="1" w:unhideWhenUsed="1"/>
+    <w:lsdException w:name="Table Grid 7" w:semiHidden="1" w:unhideWhenUsed="1"/>
+    <w:lsdException w:name="Table Grid 8" w:semiHidden="1" w:unhideWhenUsed="1"/>
+    <w:lsdException w:name="Table List 1" w:semiHidden="1" w:unhideWhenUsed="1"/>
+    <w:lsdException w:name="Table List 2" w:semiHidden="1" w:unhideWhenUsed="1"/>
+    <w:lsdException w:name="Table List 3" w:semiHidden="1" w:unhideWhenUsed="1"/>
+    <w:lsdException w:name="Table List 4" w:semiHidden="1" w:unhideWhenUsed="1"/>
+    <w:lsdException w:name="Table List 5" w:semiHidden="1" w:unhideWhenUsed="1"/>
+    <w:lsdException w:name="Table List 6" w:semiHidden="1" w:unhideWhenUsed="1"/>
+    <w:lsdException w:name="Table List 7" w:semiHidden="1" w:unhideWhenUsed="1"/>
+    <w:lsdException w:name="Table List 8" w:semiHidden="1" w:unhideWhenUsed="1"/>
+    <w:lsdException w:name="Table 3D effects 1" w:semiHidden="1" w:unhideWhenUsed="1"/>
+    <w:lsdException w:name="Table 3D effects 2" w:semiHidden="1" w:unhideWhenUsed="1"/>
+    <w:lsdException w:name="Table 3D effects 3" w:semiHidden="1" w:unhideWhenUsed="1"/>
+    <w:lsdException w:name="Table Contemporary" w:semiHidden="1" w:unhideWhenUsed="1"/>
+    <w:lsdException w:name="Table Elegant" w:semiHidden="1" w:unhideWhenUsed="1"/>
+    <w:lsdException w:name="Table Professional" w:semiHidden="1" w:unhideWhenUsed="1"/>
+    <w:lsdException w:name="Table Subtle 1" w:semiHidden="1" w:unhideWhenUsed="1"/>
+    <w:lsdException w:name="Table Subtle 2" w:semiHidden="1" w:unhideWhenUsed="1"/>
+    <w:lsdException w:name="Table Web 1" w:semiHidden="1" w:unhideWhenUsed="1"/>
+    <w:lsdException w:name="Table Web 2" w:semiHidden="1" w:unhideWhenUsed="1"/>
+    <w:lsdException w:name="Table Web 3" w:semiHidden="1" w:unhideWhenUsed="1"/>
+    <w:lsdException w:name="Balloon Text" w:semiHidden="1" w:unhideWhenUsed="1"/>
+    <w:lsdException w:name="Table Grid" w:uiPriority="39"/>
+    <w:lsdException w:name="Table Theme" w:semiHidden="1" w:unhideWhenUsed="1"/>
+    <w:lsdException w:name="Placeholder Text" w:semiHidden="1"/>
+    <w:lsdException w:name="No Spacing" w:uiPriority="1" w:qFormat="1"/>
+    <w:lsdException w:name="Light Shading" w:uiPriority="60"/>
+    <w:lsdException w:name="Light List" w:uiPriority="61"/>
+    <w:lsdException w:name="Light Grid" w:uiPriority="62"/>
+    <w:lsdException w:name="Medium Shading 1" w:uiPriority="63"/>
+    <w:lsdException w:name="Medium Shading 2" w:uiPriority="64"/>
+    <w:lsdException w:name="Medium List 1" w:uiPriority="65"/>
+    <w:lsdException w:name="Medium List 2" w:uiPriority="66"/>
+    <w:lsdException w:name="Medium Grid 1" w:uiPriority="67"/>
+    <w:lsdException w:name="Medium Grid 2" w:uiPriority="68"/>
+    <w:lsdException w:name="Medium Grid 3" w:uiPriority="69"/>
+    <w:lsdException w:name="Dark List" w:uiPriority="70"/>
+    <w:lsdException w:name="Colorful Shading" w:uiPriority="71"/>
+    <w:lsdException w:name="Colorful List" w:uiPriority="72"/>
+    <w:lsdException w:name="Colorful Grid" w:uiPriority="73"/>
+    <w:lsdException w:name="Light Shading Accent 1" w:uiPriority="60"/>
+    <w:lsdException w:name="Light List Accent 1" w:uiPriority="61"/>
+    <w:lsdException w:name="Light Grid Accent 1" w:uiPriority="62"/>
+    <w:lsdException w:name="Medium Shading 1 Accent 1" w:uiPriority="63"/>
+    <w:lsdException w:name="Medium Shading 2 Accent 1" w:uiPriority="64"/>
+    <w:lsdException w:name="Medium List 1 Accent 1" w:uiPriority="65"/>
+    <w:lsdException w:name="Revision" w:semiHidden="1"/>
+    <w:lsdException w:name="List Paragraph" w:uiPriority="34" w:qFormat="1"/>
+    <w:lsdException w:name="Quote" w:uiPriority="29" w:qFormat="1"/>
+    <w:lsdException w:name="Intense Quote" w:uiPriority="30" w:qFormat="1"/>
+    <w:lsdException w:name="Medium List 2 Accent 1" w:uiPriority="66"/>
+    <w:lsdException w:name="Medium Grid 1 Accent 1" w:uiPriority="67"/>
+    <w:lsdException w:name="Medium Grid 2 Accent 1" w:uiPriority="68"/>
+    <w:lsdException w:name="Medium Grid 3 Accent 1" w:uiPriority="69"/>
+    <w:lsdException w:name="Dark List Accent 1" w:uiPriority="70"/>
+    <w:lsdException w:name="Colorful Shading Accent 1" w:uiPriority="71"/>
+    <w:lsdException w:name="Colorful List Accent 1" w:uiPriority="72"/>
+    <w:lsdException w:name="Colorful Grid Accent 1" w:uiPriority="73"/>
+    <w:lsdException w:name="Light Shading Accent 2" w:uiPriority="60"/>
+    <w:lsdException w:name="Light List Accent 2" w:uiPriority="61"/>
+    <w:lsdException w:name="Light Grid Accent 2" w:uiPriority="62"/>
+    <w:lsdException w:name="Medium Shading 1 Accent 2" w:uiPriority="63"/>
+    <w:lsdException w:name="Medium Shading 2 Accent 2" w:uiPriority="64"/>
+    <w:lsdException w:name="Medium List 1 Accent 2" w:uiPriority="65"/>
+    <w:lsdException w:name="Medium List 2 Accent 2" w:uiPriority="66"/>
+    <w:lsdException w:name="Medium Grid 1 Accent 2" w:uiPriority="67"/>
+    <w:lsdException w:name="Medium Grid 2 Accent 2" w:uiPriority="68"/>
+    <w:lsdException w:name="Medium Grid 3 Accent 2" w:uiPriority="69"/>
+    <w:lsdException w:name="Dark List Accent 2" w:uiPriority="70"/>
+    <w:lsdException w:name="Colorful Shading Accent 2" w:uiPriority="71"/>
+    <w:lsdException w:name="Colorful List Accent 2" w:uiPriority="72"/>
+    <w:lsdException w:name="Colorful Grid Accent 2" w:uiPriority="73"/>
+    <w:lsdException w:name="Light Shading Accent 3" w:uiPriority="60"/>
+    <w:lsdException w:name="Light List Accent 3" w:uiPriority="61"/>
+    <w:lsdException w:name="Light Grid Accent 3" w:uiPriority="62"/>
+    <w:lsdException w:name="Medium Shading 1 Accent 3" w:uiPriority="63"/>
+    <w:lsdException w:name="Medium Shading 2 Accent 3" w:uiPriority="64"/>
+    <w:lsdException w:name="Medium List 1 Accent 3" w:uiPriority="65"/>
+    <w:lsdException w:name="Medium List 2 Accent 3" w:uiPriority="66"/>
+    <w:lsdException w:name="Medium Grid 1 Accent 3" w:uiPriority="67"/>
+    <w:lsdException w:name="Medium Grid 2 Accent 3" w:uiPriority="68"/>
+    <w:lsdException w:name="Medium Grid 3 Accent 3" w:uiPriority="69"/>
+    <w:lsdException w:name="Dark List Accent 3" w:uiPriority="70"/>
+    <w:lsdException w:name="Colorful Shading Accent 3" w:uiPriority="71"/>
+    <w:lsdException w:name="Colorful List Accent 3" w:uiPriority="72"/>
+    <w:lsdException w:name="Colorful Grid Accent 3" w:uiPriority="73"/>
+    <w:lsdException w:name="Light Shading Accent 4" w:uiPriority="60"/>
+    <w:lsdException w:name="Light List Accent 4" w:uiPriority="61"/>
+    <w:lsdException w:name="Light Grid Accent 4" w:uiPriority="62"/>
+    <w:lsdException w:name="Medium Shading 1 Accent 4" w:uiPriority="63"/>
+    <w:lsdException w:name="Medium Shading 2 Accent 4" w:uiPriority="64"/>
+    <w:lsdException w:name="Medium List 1 Accent 4" w:uiPriority="65"/>
+    <w:lsdException w:name="Medium List 2 Accent 4" w:uiPriority="66"/>
+    <w:lsdException w:name="Medium Grid 1 Accent 4" w:uiPriority="67"/>
+    <w:lsdException w:name="Medium Grid 2 Accent 4" w:uiPriority="68"/>
+    <w:lsdException w:name="Medium Grid 3 Accent 4" w:uiPriority="69"/>
+    <w:lsdException w:name="Dark List Accent 4" w:uiPriority="70"/>
+    <w:lsdException w:name="Colorful Shading Accent 4" w:uiPriority="71"/>
+    <w:lsdException w:name="Colorful List Accent 4" w:uiPriority="72"/>
+    <w:lsdException w:name="Colorful Grid Accent 4" w:uiPriority="73"/>
+    <w:lsdException w:name="Light Shading Accent 5" w:uiPriority="60"/>
+    <w:lsdException w:name="Light List Accent 5" w:uiPriority="61"/>
+    <w:lsdException w:name="Light Grid Accent 5" w:uiPriority="62"/>
+    <w:lsdException w:name="Medium Shading 1 Accent 5" w:uiPriority="63"/>
+    <w:lsdException w:name="Medium Shading 2 Accent 5" w:uiPriority="64"/>
+    <w:lsdException w:name="Medium List 1 Accent 5" w:uiPriority="65"/>
+    <w:lsdException w:name="Medium List 2 Accent 5" w:uiPriority="66"/>
+    <w:lsdException w:name="Medium Grid 1 Accent 5" w:uiPriority="67"/>
+    <w:lsdException w:name="Medium Grid 2 Accent 5" w:uiPriority="68"/>
+    <w:lsdException w:name="Medium Grid 3 Accent 5" w:uiPriority="69"/>
+    <w:lsdException w:name="Dark List Accent 5" w:uiPriority="70"/>
+    <w:lsdException w:name="Colorful Shading Accent 5" w:uiPriority="71"/>
+    <w:lsdException w:name="Colorful List Accent 5" w:uiPriority="72"/>
+    <w:lsdException w:name="Colorful Grid Accent 5" w:uiPriority="73"/>
+    <w:lsdException w:name="Light Shading Accent 6" w:uiPriority="60"/>
+    <w:lsdException w:name="Light List Accent 6" w:uiPriority="61"/>
+    <w:lsdException w:name="Light Grid Accent 6" w:uiPriority="62"/>
+    <w:lsdException w:name="Medium Shading 1 Accent 6" w:uiPriority="63"/>
+    <w:lsdException w:name="Medium Shading 2 Accent 6" w:uiPriority="64"/>
+    <w:lsdException w:name="Medium List 1 Accent 6" w:uiPriority="65"/>
+    <w:lsdException w:name="Medium List 2 Accent 6" w:uiPriority="66"/>
+    <w:lsdException w:name="Medium Grid 1 Accent 6" w:uiPriority="67"/>
+    <w:lsdException w:name="Medium Grid 2 Accent 6" w:uiPriority="68"/>
+    <w:lsdException w:name="Medium Grid 3 Accent 6" w:uiPriority="69"/>
+    <w:lsdException w:name="Dark List Accent 6" w:uiPriority="70"/>
+    <w:lsdException w:name="Colorful Shading Accent 6" w:uiPriority="71"/>
+    <w:lsdException w:name="Colorful List Accent 6" w:uiPriority="72"/>
+    <w:lsdException w:name="Colorful Grid Accent 6" w:uiPriority="73"/>
+    <w:lsdException w:name="Subtle Emphasis" w:uiPriority="19" w:qFormat="1"/>
+    <w:lsdException w:name="Intense Emphasis" w:uiPriority="21" w:qFormat="1"/>
+    <w:lsdException w:name="Subtle Reference" w:uiPriority="31" w:qFormat="1"/>
+    <w:lsdException w:name="Intense Reference" w:uiPriority="32" w:qFormat="1"/>
+    <w:lsdException w:name="Book Title" w:uiPriority="33" w:qFormat="1"/>
+    <w:lsdException w:name="Bibliography" w:semiHidden="1" w:uiPriority="37" w:unhideWhenUsed="1"/>
+    <w:lsdException w:name="TOC Heading" w:semiHidden="1" w:uiPriority="39" w:unhideWhenUsed="1" w:qFormat="1"/>
+    <w:lsdException w:name="Plain Table 1" w:uiPriority="41"/>
+    <w:lsdException w:name="Plain Table 2" w:uiPriority="42"/>
+    <w:lsdException w:name="Plain Table 3" w:uiPriority="43"/>
+    <w:lsdException w:name="Plain Table 4" w:uiPriority="44"/>
+    <w:lsdException w:name="Plain Table 5" w:uiPriority="45"/>
+    <w:lsdException w:name="Grid Table Light" w:uiPriority="40"/>
+    <w:lsdException w:name="Grid Table 1 Light" w:uiPriority="46"/>
+    <w:lsdException w:name="Grid Table 2" w:uiPriority="47"/>
+    <w:lsdException w:name="Grid Table 3" w:uiPriority="48"/>
+    <w:lsdException w:name="Grid Table 4" w:uiPriority="49"/>
+    <w:lsdException w:name="Grid Table 5 Dark" w:uiPriority="50"/>
+    <w:lsdException w:name="Grid Table 6 Colorful" w:uiPriority="51"/>
+    <w:lsdException w:name="Grid Table 7 Colorful" w:uiPriority="52"/>
+    <w:lsdException w:name="Grid Table 1 Light Accent 1" w:uiPriority="46"/>
+    <w:lsdException w:name="Grid Table 2 Accent 1" w:uiPriority="47"/>
+    <w:lsdException w:name="Grid Table 3 Accent 1" w:uiPriority="48"/>
+    <w:lsdException w:name="Grid Table 4 Accent 1" w:uiPriority="49"/>
+    <w:lsdException w:name="Grid Table 5 Dark Accent 1" w:uiPriority="50"/>
+    <w:lsdException w:name="Grid Table 6 Colorful Accent 1" w:uiPriority="51"/>
+    <w:lsdException w:name="Grid Table 7 Colorful Accent 1" w:uiPriority="52"/>
+    <w:lsdException w:name="Grid Table 1 Light Accent 2" w:uiPriority="46"/>
+    <w:lsdException w:name="Grid Table 2 Accent 2" w:uiPriority="47"/>
+    <w:lsdException w:name="Grid Table 3 Accent 2" w:uiPriority="48"/>
+    <w:lsdException w:name="Grid Table 4 Accent 2" w:uiPriority="49"/>
+    <w:lsdException w:name="Grid Table 5 Dark Accent 2" w:uiPriority="50"/>
+    <w:lsdException w:name="Grid Table 6 Colorful Accent 2" w:uiPriority="51"/>
+    <w:lsdException w:name="Grid Table 7 Colorful Accent 2" w:uiPriority="52"/>
+    <w:lsdException w:name="Grid Table 1 Light Accent 3" w:uiPriority="46"/>
+    <w:lsdException w:name="Grid Table 2 Accent 3" w:uiPriority="47"/>
+    <w:lsdException w:name="Grid Table 3 Accent 3" w:uiPriority="48"/>
+    <w:lsdException w:name="Grid Table 4 Accent 3" w:uiPriority="49"/>
+    <w:lsdException w:name="Grid Table 5 Dark Accent 3" w:uiPriority="50"/>
+    <w:lsdException w:name="Grid Table 6 Colorful Accent 3" w:uiPriority="51"/>
+    <w:lsdException w:name="Grid Table 7 Colorful Accent 3" w:uiPriority="52"/>
+    <w:lsdException w:name="Grid Table 1 Light Accent 4" w:uiPriority="46"/>
+    <w:lsdException w:name="Grid Table 2 Accent 4" w:uiPriority="47"/>
+    <w:lsdException w:name="Grid Table 3 Accent 4" w:uiPriority="48"/>
+    <w:lsdException w:name="Grid Table 4 Accent 4" w:uiPriority="49"/>
+    <w:lsdException w:name="Grid Table 5 Dark Accent 4" w:uiPriority="50"/>
+    <w:lsdException w:name="Grid Table 6 Colorful Accent 4" w:uiPriority="51"/>
+    <w:lsdException w:name="Grid Table 7 Colorful Accent 4" w:uiPriority="52"/>
+    <w:lsdException w:name="Grid Table 1 Light Accent 5" w:uiPriority="46"/>
+    <w:lsdException w:name="Grid Table 2 Accent 5" w:uiPriority="47"/>
+    <w:lsdException w:name="Grid Table 3 Accent 5" w:uiPriority="48"/>
+    <w:lsdException w:name="Grid Table 4 Accent 5" w:uiPriority="49"/>
+    <w:lsdException w:name="Grid Table 5 Dark Accent 5" w:uiPriority="50"/>
+    <w:lsdException w:name="Grid Table 6 Colorful Accent 5" w:uiPriority="51"/>
+    <w:lsdException w:name="Grid Table 7 Colorful Accent 5" w:uiPriority="52"/>
+    <w:lsdException w:name="Grid Table 1 Light Accent 6" w:uiPriority="46"/>
+    <w:lsdException w:name="Grid Table 2 Accent 6" w:uiPriority="47"/>
+    <w:lsdException w:name="Grid Table 3 Accent 6" w:uiPriority="48"/>
+    <w:lsdException w:name="Grid Table 4 Accent 6" w:uiPriority="49"/>
+    <w:lsdException w:name="Grid Table 5 Dark Accent 6" w:uiPriority="50"/>
+    <w:lsdException w:name="Grid Table 6 Colorful Accent 6" w:uiPriority="51"/>
+    <w:lsdException w:name="Grid Table 7 Colorful Accent 6" w:uiPriority="52"/>
+    <w:lsdException w:name="List Table 1 Light" w:uiPriority="46"/>
+    <w:lsdException w:name="List Table 2" w:uiPriority="47"/>
+    <w:lsdException w:name="List Table 3" w:uiPriority="48"/>
+    <w:lsdException w:name="List Table 4" w:uiPriority="49"/>
+    <w:lsdException w:name="List Table 5 Dark" w:uiPriority="50"/>
+    <w:lsdException w:name="List Table 6 Colorful" w:uiPriority="51"/>
+    <w:lsdException w:name="List Table 7 Colorful" w:uiPriority="52"/>
+    <w:lsdException w:name="List Table 1 Light Accent 1" w:uiPriority="46"/>
+    <w:lsdException w:name="List Table 2 Accent 1" w:uiPriority="47"/>
+    <w:lsdException w:name="List Table 3 Accent 1" w:uiPriority="48"/>
+    <w:lsdException w:name="List Table 4 Accent 1" w:uiPriority="49"/>
+    <w:lsdException w:name="List Table 5 Dark Accent 1" w:uiPriority="50"/>
+    <w:lsdException w:name="List Table 6 Colorful Accent 1" w:uiPriority="51"/>
+    <w:lsdException w:name="List Table 7 Colorful Accent 1" w:uiPriority="52"/>
+    <w:lsdException w:name="List Table 1 Light Accent 2" w:uiPriority="46"/>
+    <w:lsdException w:name="List Table 2 Accent 2" w:uiPriority="47"/>
+    <w:lsdException w:name="List Table 3 Accent 2" w:uiPriority="48"/>
+    <w:lsdException w:name="List Table 4 Accent 2" w:uiPriority="49"/>
+    <w:lsdException w:name="List Table 5 Dark Accent 2" w:uiPriority="50"/>
+    <w:lsdException w:name="List Table 6 Colorful Accent 2" w:uiPriority="51"/>
+    <w:lsdException w:name="List Table 7 Colorful Accent 2" w:uiPriority="52"/>
+    <w:lsdException w:name="List Table 1 Light Accent 3" w:uiPriority="46"/>
+    <w:lsdException w:name="List Table 2 Accent 3" w:uiPriority="47"/>
+    <w:lsdException w:name="List Table 3 Accent 3" w:uiPriority="48"/>
+    <w:lsdException w:name="List Table 4 Accent 3" w:uiPriority="49"/>
+    <w:lsdException w:name="List Table 5 Dark Accent 3" w:uiPriority="50"/>
+    <w:lsdException w:name="List Table 6 Colorful Accent 3" w:uiPriority="51"/>
+    <w:lsdException w:name="List Table 7 Colorful Accent 3" w:uiPriority="52"/>
+    <w:lsdException w:name="List Table 1 Light Accent 4" w:uiPriority="46"/>
+    <w:lsdException w:name="List Table 2 Accent 4" w:uiPriority="47"/>
+    <w:lsdException w:name="List Table 3 Accent 4" w:uiPriority="48"/>
+    <w:lsdException w:name="List Table 4 Accent 4" w:uiPriority="49"/>
+    <w:lsdException w:name="List Table 5 Dark Accent 4" w:uiPriority="50"/>
+    <w:lsdException w:name="List Table 6 Colorful Accent 4" w:uiPriority="51"/>
+    <w:lsdException w:name="List Table 7 Colorful Accent 4" w:uiPriority="52"/>
+    <w:lsdException w:name="List Table 1 Light Accent 5" w:uiPriority="46"/>
+    <w:lsdException w:name="List Table 2 Accent 5" w:uiPriority="47"/>
+    <w:lsdException w:name="List Table 3 Accent 5" w:uiPriority="48"/>
+    <w:lsdException w:name="List Table 4 Accent 5" w:uiPriority="49"/>
+    <w:lsdException w:name="List Table 5 Dark Accent 5" w:uiPriority="50"/>
+    <w:lsdException w:name="List Table 6 Colorful Accent 5" w:uiPriority="51"/>
+    <w:lsdException w:name="List Table 7 Colorful Accent 5" w:uiPriority="52"/>
+    <w:lsdException w:name="List Table 1 Light Accent 6" w:uiPriority="46"/>
+    <w:lsdException w:name="List Table 2 Accent 6" w:uiPriority="47"/>
+    <w:lsdException w:name="List Table 3 Accent 6" w:uiPriority="48"/>
+    <w:lsdException w:name="List Table 4 Accent 6" w:uiPriority="49"/>
+    <w:lsdException w:name="List Table 5 Dark Accent 6" w:uiPriority="50"/>
+    <w:lsdException w:name="List Table 6 Colorful Accent 6" w:uiPriority="51"/>
+    <w:lsdException w:name="List Table 7 Colorful Accent 6" w:uiPriority="52"/>
+    <w:lsdException w:name="Mention" w:semiHidden="1" w:unhideWhenUsed="1"/>
+    <w:lsdException w:name="Smart Hyperlink" w:semiHidden="1" w:unhideWhenUsed="1"/>
+    <w:lsdException w:name="Hashtag" w:semiHidden="1" w:unhideWhenUsed="1"/>
+    <w:lsdException w:name="Unresolved Mention" w:semiHidden="1" w:unhideWhenUsed="1"/>
+    <w:lsdException w:name="Smart Link" w:semiHidden="1" w:unhideWhenUsed="1"/>
   </w:latentStyles>
   <w:style w:type="paragraph" w:default="1" w:styleId="Normal">
     <w:name w:val="Normal"/>
@@ -1624,735 +2149,6 @@
   <w:style w:type="character" w:default="1" w:styleId="DefaultParagraphFont">
     <w:name w:val="Default Paragraph Font"/>
     <w:uiPriority w:val="1"/>
-    <w:semiHidden/>
-    <w:unhideWhenUsed/>
-  </w:style>
-  <w:style w:type="table" w:default="1" w:styleId="TableNormal">
-    <w:name w:val="Normal Table"/>
-    <w:uiPriority w:val="99"/>
-    <w:semiHidden/>
-    <w:unhideWhenUsed/>
-    <w:tblPr>
-      <w:tblInd w:w="0" w:type="dxa"/>
-      <w:tblCellMar>
-        <w:top w:w="0" w:type="dxa"/>
-        <w:left w:w="108" w:type="dxa"/>
-        <w:bottom w:w="0" w:type="dxa"/>
-        <w:right w:w="108" w:type="dxa"/>
-      </w:tblCellMar>
-    </w:tblPr>
-  </w:style>
-  <w:style w:type="numbering" w:default="1" w:styleId="NoList">
-    <w:name w:val="No List"/>
-    <w:uiPriority w:val="99"/>
-    <w:semiHidden/>
-    <w:unhideWhenUsed/>
-  </w:style>
-  <w:style w:type="character" w:customStyle="1" w:styleId="Heading1Char">
-    <w:name w:val="Heading 1 Char"/>
-    <w:basedOn w:val="DefaultParagraphFont"/>
-    <w:link w:val="Heading1"/>
-    <w:uiPriority w:val="9"/>
-    <w:rsid w:val="00CD4189"/>
-    <w:rPr>
-      <w:rFonts w:asciiTheme="majorHAnsi" w:eastAsiaTheme="majorEastAsia" w:hAnsiTheme="majorHAnsi" w:cstheme="majorBidi"/>
-      <w:color w:val="0F4761" w:themeColor="accent1" w:themeShade="BF"/>
-      <w:sz w:val="40"/>
-      <w:szCs w:val="40"/>
-    </w:rPr>
-  </w:style>
-  <w:style w:type="character" w:customStyle="1" w:styleId="Heading2Char">
-    <w:name w:val="Heading 2 Char"/>
-    <w:basedOn w:val="DefaultParagraphFont"/>
-    <w:link w:val="Heading2"/>
-    <w:uiPriority w:val="9"/>
-    <w:semiHidden/>
-    <w:rsid w:val="00CD4189"/>
-    <w:rPr>
-      <w:rFonts w:asciiTheme="majorHAnsi" w:eastAsiaTheme="majorEastAsia" w:hAnsiTheme="majorHAnsi" w:cstheme="majorBidi"/>
-      <w:color w:val="0F4761" w:themeColor="accent1" w:themeShade="BF"/>
-      <w:sz w:val="32"/>
-      <w:szCs w:val="32"/>
-    </w:rPr>
-  </w:style>
-  <w:style w:type="character" w:customStyle="1" w:styleId="Heading3Char">
-    <w:name w:val="Heading 3 Char"/>
-    <w:basedOn w:val="DefaultParagraphFont"/>
-    <w:link w:val="Heading3"/>
-    <w:uiPriority w:val="9"/>
-    <w:semiHidden/>
-    <w:rsid w:val="00CD4189"/>
-    <w:rPr>
-      <w:rFonts w:eastAsiaTheme="majorEastAsia" w:cstheme="majorBidi"/>
-      <w:color w:val="0F4761" w:themeColor="accent1" w:themeShade="BF"/>
-      <w:sz w:val="28"/>
-      <w:szCs w:val="28"/>
-    </w:rPr>
-  </w:style>
-  <w:style w:type="character" w:customStyle="1" w:styleId="Heading4Char">
-    <w:name w:val="Heading 4 Char"/>
-    <w:basedOn w:val="DefaultParagraphFont"/>
-    <w:link w:val="Heading4"/>
-    <w:uiPriority w:val="9"/>
-    <w:semiHidden/>
-    <w:rsid w:val="00CD4189"/>
-    <w:rPr>
-      <w:rFonts w:eastAsiaTheme="majorEastAsia" w:cstheme="majorBidi"/>
-      <w:i/>
-      <w:iCs/>
-      <w:color w:val="0F4761" w:themeColor="accent1" w:themeShade="BF"/>
-    </w:rPr>
-  </w:style>
-  <w:style w:type="character" w:customStyle="1" w:styleId="Heading5Char">
-    <w:name w:val="Heading 5 Char"/>
-    <w:basedOn w:val="DefaultParagraphFont"/>
-    <w:link w:val="Heading5"/>
-    <w:uiPriority w:val="9"/>
-    <w:semiHidden/>
-    <w:rsid w:val="00CD4189"/>
-    <w:rPr>
-      <w:rFonts w:eastAsiaTheme="majorEastAsia" w:cstheme="majorBidi"/>
-      <w:color w:val="0F4761" w:themeColor="accent1" w:themeShade="BF"/>
-    </w:rPr>
-  </w:style>
-  <w:style w:type="character" w:customStyle="1" w:styleId="Heading6Char">
-    <w:name w:val="Heading 6 Char"/>
-    <w:basedOn w:val="DefaultParagraphFont"/>
-    <w:link w:val="Heading6"/>
-    <w:uiPriority w:val="9"/>
-    <w:semiHidden/>
-    <w:rsid w:val="00CD4189"/>
-    <w:rPr>
-      <w:rFonts w:eastAsiaTheme="majorEastAsia" w:cstheme="majorBidi"/>
-      <w:i/>
-      <w:iCs/>
-      <w:color w:val="595959" w:themeColor="text1" w:themeTint="A6"/>
-    </w:rPr>
-  </w:style>
-  <w:style w:type="character" w:customStyle="1" w:styleId="Heading7Char">
-    <w:name w:val="Heading 7 Char"/>
-    <w:basedOn w:val="DefaultParagraphFont"/>
-    <w:link w:val="Heading7"/>
-    <w:uiPriority w:val="9"/>
-    <w:semiHidden/>
-    <w:rsid w:val="00CD4189"/>
-    <w:rPr>
-      <w:rFonts w:eastAsiaTheme="majorEastAsia" w:cstheme="majorBidi"/>
-      <w:color w:val="595959" w:themeColor="text1" w:themeTint="A6"/>
-    </w:rPr>
-  </w:style>
-  <w:style w:type="character" w:customStyle="1" w:styleId="Heading8Char">
-    <w:name w:val="Heading 8 Char"/>
-    <w:basedOn w:val="DefaultParagraphFont"/>
-    <w:link w:val="Heading8"/>
-    <w:uiPriority w:val="9"/>
-    <w:semiHidden/>
-    <w:rsid w:val="00CD4189"/>
-    <w:rPr>
-      <w:rFonts w:eastAsiaTheme="majorEastAsia" w:cstheme="majorBidi"/>
-      <w:i/>
-      <w:iCs/>
-      <w:color w:val="272727" w:themeColor="text1" w:themeTint="D8"/>
-    </w:rPr>
-  </w:style>
-  <w:style w:type="character" w:customStyle="1" w:styleId="Heading9Char">
-    <w:name w:val="Heading 9 Char"/>
-    <w:basedOn w:val="DefaultParagraphFont"/>
-    <w:link w:val="Heading9"/>
-    <w:uiPriority w:val="9"/>
-    <w:semiHidden/>
-    <w:rsid w:val="00CD4189"/>
-    <w:rPr>
-      <w:rFonts w:eastAsiaTheme="majorEastAsia" w:cstheme="majorBidi"/>
-      <w:color w:val="272727" w:themeColor="text1" w:themeTint="D8"/>
-    </w:rPr>
-  </w:style>
-  <w:style w:type="paragraph" w:styleId="Title">
-    <w:name w:val="Title"/>
-    <w:basedOn w:val="Normal"/>
-    <w:next w:val="Normal"/>
-    <w:link w:val="TitleChar"/>
-    <w:uiPriority w:val="10"/>
-    <w:qFormat/>
-    <w:rsid w:val="00CD4189"/>
-    <w:pPr>
-      <w:spacing w:after="80" w:line="240" w:lineRule="auto"/>
-      <w:contextualSpacing/>
-    </w:pPr>
-    <w:rPr>
-      <w:rFonts w:asciiTheme="majorHAnsi" w:eastAsiaTheme="majorEastAsia" w:hAnsiTheme="majorHAnsi" w:cstheme="majorBidi"/>
-      <w:spacing w:val="-10"/>
-      <w:kern w:val="28"/>
-      <w:sz w:val="56"/>
-      <w:szCs w:val="56"/>
-    </w:rPr>
-  </w:style>
-  <w:style w:type="character" w:customStyle="1" w:styleId="TitleChar">
-    <w:name w:val="Title Char"/>
-    <w:basedOn w:val="DefaultParagraphFont"/>
-    <w:link w:val="Title"/>
-    <w:uiPriority w:val="10"/>
-    <w:rsid w:val="00CD4189"/>
-    <w:rPr>
-      <w:rFonts w:asciiTheme="majorHAnsi" w:eastAsiaTheme="majorEastAsia" w:hAnsiTheme="majorHAnsi" w:cstheme="majorBidi"/>
-      <w:spacing w:val="-10"/>
-      <w:kern w:val="28"/>
-      <w:sz w:val="56"/>
-      <w:szCs w:val="56"/>
-    </w:rPr>
-  </w:style>
-  <w:style w:type="paragraph" w:styleId="Subtitle">
-    <w:name w:val="Subtitle"/>
-    <w:basedOn w:val="Normal"/>
-    <w:next w:val="Normal"/>
-    <w:link w:val="SubtitleChar"/>
-    <w:uiPriority w:val="11"/>
-    <w:qFormat/>
-    <w:rsid w:val="00CD4189"/>
-    <w:pPr>
-      <w:numPr>
-        <w:ilvl w:val="1"/>
-      </w:numPr>
-    </w:pPr>
-    <w:rPr>
-      <w:rFonts w:eastAsiaTheme="majorEastAsia" w:cstheme="majorBidi"/>
-      <w:color w:val="595959" w:themeColor="text1" w:themeTint="A6"/>
-      <w:spacing w:val="15"/>
-      <w:sz w:val="28"/>
-      <w:szCs w:val="28"/>
-    </w:rPr>
-  </w:style>
-  <w:style w:type="character" w:customStyle="1" w:styleId="SubtitleChar">
-    <w:name w:val="Subtitle Char"/>
-    <w:basedOn w:val="DefaultParagraphFont"/>
-    <w:link w:val="Subtitle"/>
-    <w:uiPriority w:val="11"/>
-    <w:rsid w:val="00CD4189"/>
-    <w:rPr>
-      <w:rFonts w:eastAsiaTheme="majorEastAsia" w:cstheme="majorBidi"/>
-      <w:color w:val="595959" w:themeColor="text1" w:themeTint="A6"/>
-      <w:spacing w:val="15"/>
-      <w:sz w:val="28"/>
-      <w:szCs w:val="28"/>
-    </w:rPr>
-  </w:style>
-  <w:style w:type="paragraph" w:styleId="Quote">
-    <w:name w:val="Quote"/>
-    <w:basedOn w:val="Normal"/>
-    <w:next w:val="Normal"/>
-    <w:link w:val="QuoteChar"/>
-    <w:uiPriority w:val="29"/>
-    <w:qFormat/>
-    <w:rsid w:val="00CD4189"/>
-    <w:pPr>
-      <w:spacing w:before="160"/>
-      <w:jc w:val="center"/>
-    </w:pPr>
-    <w:rPr>
-      <w:i/>
-      <w:iCs/>
-      <w:color w:val="404040" w:themeColor="text1" w:themeTint="BF"/>
-    </w:rPr>
-  </w:style>
-  <w:style w:type="character" w:customStyle="1" w:styleId="QuoteChar">
-    <w:name w:val="Quote Char"/>
-    <w:basedOn w:val="DefaultParagraphFont"/>
-    <w:link w:val="Quote"/>
-    <w:uiPriority w:val="29"/>
-    <w:rsid w:val="00CD4189"/>
-    <w:rPr>
-      <w:i/>
-      <w:iCs/>
-      <w:color w:val="404040" w:themeColor="text1" w:themeTint="BF"/>
-    </w:rPr>
-  </w:style>
-  <w:style w:type="paragraph" w:styleId="ListParagraph">
-    <w:name w:val="List Paragraph"/>
-    <w:basedOn w:val="Normal"/>
-    <w:uiPriority w:val="34"/>
-    <w:qFormat/>
-    <w:rsid w:val="00CD4189"/>
-    <w:pPr>
-      <w:ind w:left="720"/>
-      <w:contextualSpacing/>
-    </w:pPr>
-  </w:style>
-  <w:style w:type="character" w:styleId="IntenseEmphasis">
-    <w:name w:val="Intense Emphasis"/>
-    <w:basedOn w:val="DefaultParagraphFont"/>
-    <w:uiPriority w:val="21"/>
-    <w:qFormat/>
-    <w:rsid w:val="00CD4189"/>
-    <w:rPr>
-      <w:i/>
-      <w:iCs/>
-      <w:color w:val="0F4761" w:themeColor="accent1" w:themeShade="BF"/>
-    </w:rPr>
-  </w:style>
-  <w:style w:type="paragraph" w:styleId="IntenseQuote">
-    <w:name w:val="Intense Quote"/>
-    <w:basedOn w:val="Normal"/>
-    <w:next w:val="Normal"/>
-    <w:link w:val="IntenseQuoteChar"/>
-    <w:uiPriority w:val="30"/>
-    <w:qFormat/>
-    <w:rsid w:val="00CD4189"/>
-    <w:pPr>
-      <w:pBdr>
-        <w:top w:val="single" w:sz="4" w:space="10" w:color="0F4761" w:themeColor="accent1" w:themeShade="BF"/>
-        <w:bottom w:val="single" w:sz="4" w:space="10" w:color="0F4761" w:themeColor="accent1" w:themeShade="BF"/>
-      </w:pBdr>
-      <w:spacing w:before="360" w:after="360"/>
-      <w:ind w:left="864" w:right="864"/>
-      <w:jc w:val="center"/>
-    </w:pPr>
-    <w:rPr>
-      <w:i/>
-      <w:iCs/>
-      <w:color w:val="0F4761" w:themeColor="accent1" w:themeShade="BF"/>
-    </w:rPr>
-  </w:style>
-  <w:style w:type="character" w:customStyle="1" w:styleId="IntenseQuoteChar">
-    <w:name w:val="Intense Quote Char"/>
-    <w:basedOn w:val="DefaultParagraphFont"/>
-    <w:link w:val="IntenseQuote"/>
-    <w:uiPriority w:val="30"/>
-    <w:rsid w:val="00CD4189"/>
-    <w:rPr>
-      <w:i/>
-      <w:iCs/>
-      <w:color w:val="0F4761" w:themeColor="accent1" w:themeShade="BF"/>
-    </w:rPr>
-  </w:style>
-  <w:style w:type="character" w:styleId="IntenseReference">
-    <w:name w:val="Intense Reference"/>
-    <w:basedOn w:val="DefaultParagraphFont"/>
-    <w:uiPriority w:val="32"/>
-    <w:qFormat/>
-    <w:rsid w:val="00CD4189"/>
-    <w:rPr>
-      <w:b/>
-      <w:bCs/>
-      <w:smallCaps/>
-      <w:color w:val="0F4761" w:themeColor="accent1" w:themeShade="BF"/>
-      <w:spacing w:val="5"/>
-    </w:rPr>
-  </w:style>
-  <w:style w:type="paragraph" w:styleId="NoSpacing">
-    <w:name w:val="No Spacing"/>
-    <w:uiPriority w:val="1"/>
-    <w:qFormat/>
-    <w:rsid w:val="00CD4189"/>
-    <w:pPr>
-      <w:spacing w:after="0" w:line="240" w:lineRule="auto"/>
-    </w:pPr>
-    <w:rPr>
-      <w:rFonts w:ascii="Times New Roman" w:eastAsia="Calibri" w:hAnsi="Times New Roman" w:cs="Times New Roman"/>
-      <w:kern w:val="0"/>
-      <w:sz w:val="28"/>
-      <w:szCs w:val="22"/>
-      <w:lang w:eastAsia="en-US"/>
-      <w14:ligatures w14:val="none"/>
-    </w:rPr>
-  </w:style>
-  <w:style w:type="paragraph" w:styleId="HTMLPreformatted">
-    <w:name w:val="HTML Preformatted"/>
-    <w:basedOn w:val="Normal"/>
-    <w:link w:val="HTMLPreformattedChar"/>
-    <w:uiPriority w:val="99"/>
-    <w:semiHidden/>
-    <w:unhideWhenUsed/>
-    <w:rsid w:val="005411C7"/>
-    <w:pPr>
-      <w:spacing w:after="0" w:line="240" w:lineRule="auto"/>
-    </w:pPr>
-    <w:rPr>
-      <w:rFonts w:ascii="Consolas" w:hAnsi="Consolas"/>
-      <w:sz w:val="20"/>
-      <w:szCs w:val="20"/>
-    </w:rPr>
-  </w:style>
-  <w:style w:type="character" w:customStyle="1" w:styleId="HTMLPreformattedChar">
-    <w:name w:val="HTML Preformatted Char"/>
-    <w:basedOn w:val="DefaultParagraphFont"/>
-    <w:link w:val="HTMLPreformatted"/>
-    <w:uiPriority w:val="99"/>
-    <w:semiHidden/>
-    <w:rsid w:val="005411C7"/>
-    <w:rPr>
-      <w:rFonts w:ascii="Consolas" w:hAnsi="Consolas"/>
-      <w:sz w:val="20"/>
-      <w:szCs w:val="20"/>
-    </w:rPr>
-  </w:style>
-</w:styles>
-</file>
-
-<file path=word/stylesWithEffects.xml><?xml version="1.0" encoding="utf-8"?>
-<w:styles xmlns:wpc="http://schemas.microsoft.com/office/word/2010/wordprocessingCanvas" xmlns:mc="http://schemas.openxmlformats.org/markup-compatibility/2006" xmlns:o="urn:schemas-microsoft-com:office:office" xmlns:r="http://schemas.openxmlformats.org/officeDocument/2006/relationships" xmlns:m="http://schemas.openxmlformats.org/officeDocument/2006/math" xmlns:v="urn:schemas-microsoft-com:vml" xmlns:wp14="http://schemas.microsoft.com/office/word/2010/wordprocessingDrawing" xmlns:wp="http://schemas.openxmlformats.org/drawingml/2006/wordprocessingDrawing" xmlns:w10="urn:schemas-microsoft-com:office:word" xmlns:w="http://schemas.openxmlformats.org/wordprocessingml/2006/main" xmlns:w14="http://schemas.microsoft.com/office/word/2010/wordml" xmlns:wpg="http://schemas.microsoft.com/office/word/2010/wordprocessingGroup" xmlns:wpi="http://schemas.microsoft.com/office/word/2010/wordprocessingInk" xmlns:wne="http://schemas.microsoft.com/office/word/2006/wordml" xmlns:wps="http://schemas.microsoft.com/office/word/2010/wordprocessingShape" mc:Ignorable="w14 wp14">
-  <w:docDefaults>
-    <w:rPrDefault>
-      <w:rPr>
-        <w:rFonts w:asciiTheme="minorHAnsi" w:eastAsiaTheme="minorEastAsia" w:hAnsiTheme="minorHAnsi" w:cstheme="minorBidi"/>
-        <w:kern w:val="2"/>
-        <w:sz w:val="24"/>
-        <w:szCs w:val="24"/>
-        <w:lang w:val="en-US" w:eastAsia="ja-JP" w:bidi="ar-SA"/>
-        <w14:ligatures w14:val="standardContextual"/>
-      </w:rPr>
-    </w:rPrDefault>
-    <w:pPrDefault>
-      <w:pPr>
-        <w:spacing w:after="160" w:line="278" w:lineRule="auto"/>
-      </w:pPr>
-    </w:pPrDefault>
-  </w:docDefaults>
-  <w:latentStyles w:defLockedState="0" w:defUIPriority="99" w:defSemiHidden="1" w:defUnhideWhenUsed="1" w:defQFormat="0" w:count="267">
-    <w:lsdException w:name="Normal" w:semiHidden="0" w:uiPriority="0" w:unhideWhenUsed="0" w:qFormat="1"/>
-    <w:lsdException w:name="heading 1" w:semiHidden="0" w:uiPriority="9" w:unhideWhenUsed="0" w:qFormat="1"/>
-    <w:lsdException w:name="heading 2" w:uiPriority="9" w:qFormat="1"/>
-    <w:lsdException w:name="heading 3" w:uiPriority="9" w:qFormat="1"/>
-    <w:lsdException w:name="heading 4" w:uiPriority="9" w:qFormat="1"/>
-    <w:lsdException w:name="heading 5" w:uiPriority="9" w:qFormat="1"/>
-    <w:lsdException w:name="heading 6" w:uiPriority="9" w:qFormat="1"/>
-    <w:lsdException w:name="heading 7" w:uiPriority="9" w:qFormat="1"/>
-    <w:lsdException w:name="heading 8" w:uiPriority="9" w:qFormat="1"/>
-    <w:lsdException w:name="heading 9" w:uiPriority="9" w:qFormat="1"/>
-    <w:lsdException w:name="toc 1" w:uiPriority="39"/>
-    <w:lsdException w:name="toc 2" w:uiPriority="39"/>
-    <w:lsdException w:name="toc 3" w:uiPriority="39"/>
-    <w:lsdException w:name="toc 4" w:uiPriority="39"/>
-    <w:lsdException w:name="toc 5" w:uiPriority="39"/>
-    <w:lsdException w:name="toc 6" w:uiPriority="39"/>
-    <w:lsdException w:name="toc 7" w:uiPriority="39"/>
-    <w:lsdException w:name="toc 8" w:uiPriority="39"/>
-    <w:lsdException w:name="toc 9" w:uiPriority="39"/>
-    <w:lsdException w:name="caption" w:uiPriority="35" w:qFormat="1"/>
-    <w:lsdException w:name="Title" w:semiHidden="0" w:uiPriority="10" w:unhideWhenUsed="0" w:qFormat="1"/>
-    <w:lsdException w:name="Default Paragraph Font" w:uiPriority="1"/>
-    <w:lsdException w:name="Subtitle" w:semiHidden="0" w:uiPriority="11" w:unhideWhenUsed="0" w:qFormat="1"/>
-    <w:lsdException w:name="Strong" w:semiHidden="0" w:uiPriority="22" w:unhideWhenUsed="0" w:qFormat="1"/>
-    <w:lsdException w:name="Emphasis" w:semiHidden="0" w:uiPriority="20" w:unhideWhenUsed="0" w:qFormat="1"/>
-    <w:lsdException w:name="Table Grid" w:semiHidden="0" w:uiPriority="39" w:unhideWhenUsed="0"/>
-    <w:lsdException w:name="Placeholder Text" w:unhideWhenUsed="0"/>
-    <w:lsdException w:name="No Spacing" w:semiHidden="0" w:uiPriority="1" w:unhideWhenUsed="0" w:qFormat="1"/>
-    <w:lsdException w:name="Light Shading" w:semiHidden="0" w:uiPriority="60" w:unhideWhenUsed="0"/>
-    <w:lsdException w:name="Light List" w:semiHidden="0" w:uiPriority="61" w:unhideWhenUsed="0"/>
-    <w:lsdException w:name="Light Grid" w:semiHidden="0" w:uiPriority="62" w:unhideWhenUsed="0"/>
-    <w:lsdException w:name="Medium Shading 1" w:semiHidden="0" w:uiPriority="63" w:unhideWhenUsed="0"/>
-    <w:lsdException w:name="Medium Shading 2" w:semiHidden="0" w:uiPriority="64" w:unhideWhenUsed="0"/>
-    <w:lsdException w:name="Medium List 1" w:semiHidden="0" w:uiPriority="65" w:unhideWhenUsed="0"/>
-    <w:lsdException w:name="Medium List 2" w:semiHidden="0" w:uiPriority="66" w:unhideWhenUsed="0"/>
-    <w:lsdException w:name="Medium Grid 1" w:semiHidden="0" w:uiPriority="67" w:unhideWhenUsed="0"/>
-    <w:lsdException w:name="Medium Grid 2" w:semiHidden="0" w:uiPriority="68" w:unhideWhenUsed="0"/>
-    <w:lsdException w:name="Medium Grid 3" w:semiHidden="0" w:uiPriority="69" w:unhideWhenUsed="0"/>
-    <w:lsdException w:name="Dark List" w:semiHidden="0" w:uiPriority="70" w:unhideWhenUsed="0"/>
-    <w:lsdException w:name="Colorful Shading" w:semiHidden="0" w:uiPriority="71" w:unhideWhenUsed="0"/>
-    <w:lsdException w:name="Colorful List" w:semiHidden="0" w:uiPriority="72" w:unhideWhenUsed="0"/>
-    <w:lsdException w:name="Colorful Grid" w:semiHidden="0" w:uiPriority="73" w:unhideWhenUsed="0"/>
-    <w:lsdException w:name="Light Shading Accent 1" w:semiHidden="0" w:uiPriority="60" w:unhideWhenUsed="0"/>
-    <w:lsdException w:name="Light List Accent 1" w:semiHidden="0" w:uiPriority="61" w:unhideWhenUsed="0"/>
-    <w:lsdException w:name="Light Grid Accent 1" w:semiHidden="0" w:uiPriority="62" w:unhideWhenUsed="0"/>
-    <w:lsdException w:name="Medium Shading 1 Accent 1" w:semiHidden="0" w:uiPriority="63" w:unhideWhenUsed="0"/>
-    <w:lsdException w:name="Medium Shading 2 Accent 1" w:semiHidden="0" w:uiPriority="64" w:unhideWhenUsed="0"/>
-    <w:lsdException w:name="Medium List 1 Accent 1" w:semiHidden="0" w:uiPriority="65" w:unhideWhenUsed="0"/>
-    <w:lsdException w:name="Revision" w:unhideWhenUsed="0"/>
-    <w:lsdException w:name="List Paragraph" w:semiHidden="0" w:uiPriority="34" w:unhideWhenUsed="0" w:qFormat="1"/>
-    <w:lsdException w:name="Quote" w:semiHidden="0" w:uiPriority="29" w:unhideWhenUsed="0" w:qFormat="1"/>
-    <w:lsdException w:name="Intense Quote" w:semiHidden="0" w:uiPriority="30" w:unhideWhenUsed="0" w:qFormat="1"/>
-    <w:lsdException w:name="Medium List 2 Accent 1" w:semiHidden="0" w:uiPriority="66" w:unhideWhenUsed="0"/>
-    <w:lsdException w:name="Medium Grid 1 Accent 1" w:semiHidden="0" w:uiPriority="67" w:unhideWhenUsed="0"/>
-    <w:lsdException w:name="Medium Grid 2 Accent 1" w:semiHidden="0" w:uiPriority="68" w:unhideWhenUsed="0"/>
-    <w:lsdException w:name="Medium Grid 3 Accent 1" w:semiHidden="0" w:uiPriority="69" w:unhideWhenUsed="0"/>
-    <w:lsdException w:name="Dark List Accent 1" w:semiHidden="0" w:uiPriority="70" w:unhideWhenUsed="0"/>
-    <w:lsdException w:name="Colorful Shading Accent 1" w:semiHidden="0" w:uiPriority="71" w:unhideWhenUsed="0"/>
-    <w:lsdException w:name="Colorful List Accent 1" w:semiHidden="0" w:uiPriority="72" w:unhideWhenUsed="0"/>
-    <w:lsdException w:name="Colorful Grid Accent 1" w:semiHidden="0" w:uiPriority="73" w:unhideWhenUsed="0"/>
-    <w:lsdException w:name="Light Shading Accent 2" w:semiHidden="0" w:uiPriority="60" w:unhideWhenUsed="0"/>
-    <w:lsdException w:name="Light List Accent 2" w:semiHidden="0" w:uiPriority="61" w:unhideWhenUsed="0"/>
-    <w:lsdException w:name="Light Grid Accent 2" w:semiHidden="0" w:uiPriority="62" w:unhideWhenUsed="0"/>
-    <w:lsdException w:name="Medium Shading 1 Accent 2" w:semiHidden="0" w:uiPriority="63" w:unhideWhenUsed="0"/>
-    <w:lsdException w:name="Medium Shading 2 Accent 2" w:semiHidden="0" w:uiPriority="64" w:unhideWhenUsed="0"/>
-    <w:lsdException w:name="Medium List 1 Accent 2" w:semiHidden="0" w:uiPriority="65" w:unhideWhenUsed="0"/>
-    <w:lsdException w:name="Medium List 2 Accent 2" w:semiHidden="0" w:uiPriority="66" w:unhideWhenUsed="0"/>
-    <w:lsdException w:name="Medium Grid 1 Accent 2" w:semiHidden="0" w:uiPriority="67" w:unhideWhenUsed="0"/>
-    <w:lsdException w:name="Medium Grid 2 Accent 2" w:semiHidden="0" w:uiPriority="68" w:unhideWhenUsed="0"/>
-    <w:lsdException w:name="Medium Grid 3 Accent 2" w:semiHidden="0" w:uiPriority="69" w:unhideWhenUsed="0"/>
-    <w:lsdException w:name="Dark List Accent 2" w:semiHidden="0" w:uiPriority="70" w:unhideWhenUsed="0"/>
-    <w:lsdException w:name="Colorful Shading Accent 2" w:semiHidden="0" w:uiPriority="71" w:unhideWhenUsed="0"/>
-    <w:lsdException w:name="Colorful List Accent 2" w:semiHidden="0" w:uiPriority="72" w:unhideWhenUsed="0"/>
-    <w:lsdException w:name="Colorful Grid Accent 2" w:semiHidden="0" w:uiPriority="73" w:unhideWhenUsed="0"/>
-    <w:lsdException w:name="Light Shading Accent 3" w:semiHidden="0" w:uiPriority="60" w:unhideWhenUsed="0"/>
-    <w:lsdException w:name="Light List Accent 3" w:semiHidden="0" w:uiPriority="61" w:unhideWhenUsed="0"/>
-    <w:lsdException w:name="Light Grid Accent 3" w:semiHidden="0" w:uiPriority="62" w:unhideWhenUsed="0"/>
-    <w:lsdException w:name="Medium Shading 1 Accent 3" w:semiHidden="0" w:uiPriority="63" w:unhideWhenUsed="0"/>
-    <w:lsdException w:name="Medium Shading 2 Accent 3" w:semiHidden="0" w:uiPriority="64" w:unhideWhenUsed="0"/>
-    <w:lsdException w:name="Medium List 1 Accent 3" w:semiHidden="0" w:uiPriority="65" w:unhideWhenUsed="0"/>
-    <w:lsdException w:name="Medium List 2 Accent 3" w:semiHidden="0" w:uiPriority="66" w:unhideWhenUsed="0"/>
-    <w:lsdException w:name="Medium Grid 1 Accent 3" w:semiHidden="0" w:uiPriority="67" w:unhideWhenUsed="0"/>
-    <w:lsdException w:name="Medium Grid 2 Accent 3" w:semiHidden="0" w:uiPriority="68" w:unhideWhenUsed="0"/>
-    <w:lsdException w:name="Medium Grid 3 Accent 3" w:semiHidden="0" w:uiPriority="69" w:unhideWhenUsed="0"/>
-    <w:lsdException w:name="Dark List Accent 3" w:semiHidden="0" w:uiPriority="70" w:unhideWhenUsed="0"/>
-    <w:lsdException w:name="Colorful Shading Accent 3" w:semiHidden="0" w:uiPriority="71" w:unhideWhenUsed="0"/>
-    <w:lsdException w:name="Colorful List Accent 3" w:semiHidden="0" w:uiPriority="72" w:unhideWhenUsed="0"/>
-    <w:lsdException w:name="Colorful Grid Accent 3" w:semiHidden="0" w:uiPriority="73" w:unhideWhenUsed="0"/>
-    <w:lsdException w:name="Light Shading Accent 4" w:semiHidden="0" w:uiPriority="60" w:unhideWhenUsed="0"/>
-    <w:lsdException w:name="Light List Accent 4" w:semiHidden="0" w:uiPriority="61" w:unhideWhenUsed="0"/>
-    <w:lsdException w:name="Light Grid Accent 4" w:semiHidden="0" w:uiPriority="62" w:unhideWhenUsed="0"/>
-    <w:lsdException w:name="Medium Shading 1 Accent 4" w:semiHidden="0" w:uiPriority="63" w:unhideWhenUsed="0"/>
-    <w:lsdException w:name="Medium Shading 2 Accent 4" w:semiHidden="0" w:uiPriority="64" w:unhideWhenUsed="0"/>
-    <w:lsdException w:name="Medium List 1 Accent 4" w:semiHidden="0" w:uiPriority="65" w:unhideWhenUsed="0"/>
-    <w:lsdException w:name="Medium List 2 Accent 4" w:semiHidden="0" w:uiPriority="66" w:unhideWhenUsed="0"/>
-    <w:lsdException w:name="Medium Grid 1 Accent 4" w:semiHidden="0" w:uiPriority="67" w:unhideWhenUsed="0"/>
-    <w:lsdException w:name="Medium Grid 2 Accent 4" w:semiHidden="0" w:uiPriority="68" w:unhideWhenUsed="0"/>
-    <w:lsdException w:name="Medium Grid 3 Accent 4" w:semiHidden="0" w:uiPriority="69" w:unhideWhenUsed="0"/>
-    <w:lsdException w:name="Dark List Accent 4" w:semiHidden="0" w:uiPriority="70" w:unhideWhenUsed="0"/>
-    <w:lsdException w:name="Colorful Shading Accent 4" w:semiHidden="0" w:uiPriority="71" w:unhideWhenUsed="0"/>
-    <w:lsdException w:name="Colorful List Accent 4" w:semiHidden="0" w:uiPriority="72" w:unhideWhenUsed="0"/>
-    <w:lsdException w:name="Colorful Grid Accent 4" w:semiHidden="0" w:uiPriority="73" w:unhideWhenUsed="0"/>
-    <w:lsdException w:name="Light Shading Accent 5" w:semiHidden="0" w:uiPriority="60" w:unhideWhenUsed="0"/>
-    <w:lsdException w:name="Light List Accent 5" w:semiHidden="0" w:uiPriority="61" w:unhideWhenUsed="0"/>
-    <w:lsdException w:name="Light Grid Accent 5" w:semiHidden="0" w:uiPriority="62" w:unhideWhenUsed="0"/>
-    <w:lsdException w:name="Medium Shading 1 Accent 5" w:semiHidden="0" w:uiPriority="63" w:unhideWhenUsed="0"/>
-    <w:lsdException w:name="Medium Shading 2 Accent 5" w:semiHidden="0" w:uiPriority="64" w:unhideWhenUsed="0"/>
-    <w:lsdException w:name="Medium List 1 Accent 5" w:semiHidden="0" w:uiPriority="65" w:unhideWhenUsed="0"/>
-    <w:lsdException w:name="Medium List 2 Accent 5" w:semiHidden="0" w:uiPriority="66" w:unhideWhenUsed="0"/>
-    <w:lsdException w:name="Medium Grid 1 Accent 5" w:semiHidden="0" w:uiPriority="67" w:unhideWhenUsed="0"/>
-    <w:lsdException w:name="Medium Grid 2 Accent 5" w:semiHidden="0" w:uiPriority="68" w:unhideWhenUsed="0"/>
-    <w:lsdException w:name="Medium Grid 3 Accent 5" w:semiHidden="0" w:uiPriority="69" w:unhideWhenUsed="0"/>
-    <w:lsdException w:name="Dark List Accent 5" w:semiHidden="0" w:uiPriority="70" w:unhideWhenUsed="0"/>
-    <w:lsdException w:name="Colorful Shading Accent 5" w:semiHidden="0" w:uiPriority="71" w:unhideWhenUsed="0"/>
-    <w:lsdException w:name="Colorful List Accent 5" w:semiHidden="0" w:uiPriority="72" w:unhideWhenUsed="0"/>
-    <w:lsdException w:name="Colorful Grid Accent 5" w:semiHidden="0" w:uiPriority="73" w:unhideWhenUsed="0"/>
-    <w:lsdException w:name="Light Shading Accent 6" w:semiHidden="0" w:uiPriority="60" w:unhideWhenUsed="0"/>
-    <w:lsdException w:name="Light List Accent 6" w:semiHidden="0" w:uiPriority="61" w:unhideWhenUsed="0"/>
-    <w:lsdException w:name="Light Grid Accent 6" w:semiHidden="0" w:uiPriority="62" w:unhideWhenUsed="0"/>
-    <w:lsdException w:name="Medium Shading 1 Accent 6" w:semiHidden="0" w:uiPriority="63" w:unhideWhenUsed="0"/>
-    <w:lsdException w:name="Medium Shading 2 Accent 6" w:semiHidden="0" w:uiPriority="64" w:unhideWhenUsed="0"/>
-    <w:lsdException w:name="Medium List 1 Accent 6" w:semiHidden="0" w:uiPriority="65" w:unhideWhenUsed="0"/>
-    <w:lsdException w:name="Medium List 2 Accent 6" w:semiHidden="0" w:uiPriority="66" w:unhideWhenUsed="0"/>
-    <w:lsdException w:name="Medium Grid 1 Accent 6" w:semiHidden="0" w:uiPriority="67" w:unhideWhenUsed="0"/>
-    <w:lsdException w:name="Medium Grid 2 Accent 6" w:semiHidden="0" w:uiPriority="68" w:unhideWhenUsed="0"/>
-    <w:lsdException w:name="Medium Grid 3 Accent 6" w:semiHidden="0" w:uiPriority="69" w:unhideWhenUsed="0"/>
-    <w:lsdException w:name="Dark List Accent 6" w:semiHidden="0" w:uiPriority="70" w:unhideWhenUsed="0"/>
-    <w:lsdException w:name="Colorful Shading Accent 6" w:semiHidden="0" w:uiPriority="71" w:unhideWhenUsed="0"/>
-    <w:lsdException w:name="Colorful List Accent 6" w:semiHidden="0" w:uiPriority="72" w:unhideWhenUsed="0"/>
-    <w:lsdException w:name="Colorful Grid Accent 6" w:semiHidden="0" w:uiPriority="73" w:unhideWhenUsed="0"/>
-    <w:lsdException w:name="Subtle Emphasis" w:semiHidden="0" w:uiPriority="19" w:unhideWhenUsed="0" w:qFormat="1"/>
-    <w:lsdException w:name="Intense Emphasis" w:semiHidden="0" w:uiPriority="21" w:unhideWhenUsed="0" w:qFormat="1"/>
-    <w:lsdException w:name="Subtle Reference" w:semiHidden="0" w:uiPriority="31" w:unhideWhenUsed="0" w:qFormat="1"/>
-    <w:lsdException w:name="Intense Reference" w:semiHidden="0" w:uiPriority="32" w:unhideWhenUsed="0" w:qFormat="1"/>
-    <w:lsdException w:name="Book Title" w:semiHidden="0" w:uiPriority="33" w:unhideWhenUsed="0" w:qFormat="1"/>
-    <w:lsdException w:name="Bibliography" w:uiPriority="37"/>
-    <w:lsdException w:name="TOC Heading" w:uiPriority="39" w:qFormat="1"/>
-  </w:latentStyles>
-  <w:style w:type="paragraph" w:default="1" w:styleId="Normal">
-    <w:name w:val="Normal"/>
-    <w:qFormat/>
-  </w:style>
-  <w:style w:type="paragraph" w:styleId="Heading1">
-    <w:name w:val="heading 1"/>
-    <w:basedOn w:val="Normal"/>
-    <w:next w:val="Normal"/>
-    <w:link w:val="Heading1Char"/>
-    <w:uiPriority w:val="9"/>
-    <w:qFormat/>
-    <w:rsid w:val="00CD4189"/>
-    <w:pPr>
-      <w:keepNext/>
-      <w:keepLines/>
-      <w:spacing w:before="360" w:after="80"/>
-      <w:outlineLvl w:val="0"/>
-    </w:pPr>
-    <w:rPr>
-      <w:rFonts w:asciiTheme="majorHAnsi" w:eastAsiaTheme="majorEastAsia" w:hAnsiTheme="majorHAnsi" w:cstheme="majorBidi"/>
-      <w:color w:val="0F4761" w:themeColor="accent1" w:themeShade="BF"/>
-      <w:sz w:val="40"/>
-      <w:szCs w:val="40"/>
-    </w:rPr>
-  </w:style>
-  <w:style w:type="paragraph" w:styleId="Heading2">
-    <w:name w:val="heading 2"/>
-    <w:basedOn w:val="Normal"/>
-    <w:next w:val="Normal"/>
-    <w:link w:val="Heading2Char"/>
-    <w:uiPriority w:val="9"/>
-    <w:semiHidden/>
-    <w:unhideWhenUsed/>
-    <w:qFormat/>
-    <w:rsid w:val="00CD4189"/>
-    <w:pPr>
-      <w:keepNext/>
-      <w:keepLines/>
-      <w:spacing w:before="160" w:after="80"/>
-      <w:outlineLvl w:val="1"/>
-    </w:pPr>
-    <w:rPr>
-      <w:rFonts w:asciiTheme="majorHAnsi" w:eastAsiaTheme="majorEastAsia" w:hAnsiTheme="majorHAnsi" w:cstheme="majorBidi"/>
-      <w:color w:val="0F4761" w:themeColor="accent1" w:themeShade="BF"/>
-      <w:sz w:val="32"/>
-      <w:szCs w:val="32"/>
-    </w:rPr>
-  </w:style>
-  <w:style w:type="paragraph" w:styleId="Heading3">
-    <w:name w:val="heading 3"/>
-    <w:basedOn w:val="Normal"/>
-    <w:next w:val="Normal"/>
-    <w:link w:val="Heading3Char"/>
-    <w:uiPriority w:val="9"/>
-    <w:semiHidden/>
-    <w:unhideWhenUsed/>
-    <w:qFormat/>
-    <w:rsid w:val="00CD4189"/>
-    <w:pPr>
-      <w:keepNext/>
-      <w:keepLines/>
-      <w:spacing w:before="160" w:after="80"/>
-      <w:outlineLvl w:val="2"/>
-    </w:pPr>
-    <w:rPr>
-      <w:rFonts w:eastAsiaTheme="majorEastAsia" w:cstheme="majorBidi"/>
-      <w:color w:val="0F4761" w:themeColor="accent1" w:themeShade="BF"/>
-      <w:sz w:val="28"/>
-      <w:szCs w:val="28"/>
-    </w:rPr>
-  </w:style>
-  <w:style w:type="paragraph" w:styleId="Heading4">
-    <w:name w:val="heading 4"/>
-    <w:basedOn w:val="Normal"/>
-    <w:next w:val="Normal"/>
-    <w:link w:val="Heading4Char"/>
-    <w:uiPriority w:val="9"/>
-    <w:semiHidden/>
-    <w:unhideWhenUsed/>
-    <w:qFormat/>
-    <w:rsid w:val="00CD4189"/>
-    <w:pPr>
-      <w:keepNext/>
-      <w:keepLines/>
-      <w:spacing w:before="80" w:after="40"/>
-      <w:outlineLvl w:val="3"/>
-    </w:pPr>
-    <w:rPr>
-      <w:rFonts w:eastAsiaTheme="majorEastAsia" w:cstheme="majorBidi"/>
-      <w:i/>
-      <w:iCs/>
-      <w:color w:val="0F4761" w:themeColor="accent1" w:themeShade="BF"/>
-    </w:rPr>
-  </w:style>
-  <w:style w:type="paragraph" w:styleId="Heading5">
-    <w:name w:val="heading 5"/>
-    <w:basedOn w:val="Normal"/>
-    <w:next w:val="Normal"/>
-    <w:link w:val="Heading5Char"/>
-    <w:uiPriority w:val="9"/>
-    <w:semiHidden/>
-    <w:unhideWhenUsed/>
-    <w:qFormat/>
-    <w:rsid w:val="00CD4189"/>
-    <w:pPr>
-      <w:keepNext/>
-      <w:keepLines/>
-      <w:spacing w:before="80" w:after="40"/>
-      <w:outlineLvl w:val="4"/>
-    </w:pPr>
-    <w:rPr>
-      <w:rFonts w:eastAsiaTheme="majorEastAsia" w:cstheme="majorBidi"/>
-      <w:color w:val="0F4761" w:themeColor="accent1" w:themeShade="BF"/>
-    </w:rPr>
-  </w:style>
-  <w:style w:type="paragraph" w:styleId="Heading6">
-    <w:name w:val="heading 6"/>
-    <w:basedOn w:val="Normal"/>
-    <w:next w:val="Normal"/>
-    <w:link w:val="Heading6Char"/>
-    <w:uiPriority w:val="9"/>
-    <w:semiHidden/>
-    <w:unhideWhenUsed/>
-    <w:qFormat/>
-    <w:rsid w:val="00CD4189"/>
-    <w:pPr>
-      <w:keepNext/>
-      <w:keepLines/>
-      <w:spacing w:before="40" w:after="0"/>
-      <w:outlineLvl w:val="5"/>
-    </w:pPr>
-    <w:rPr>
-      <w:rFonts w:eastAsiaTheme="majorEastAsia" w:cstheme="majorBidi"/>
-      <w:i/>
-      <w:iCs/>
-      <w:color w:val="595959" w:themeColor="text1" w:themeTint="A6"/>
-    </w:rPr>
-  </w:style>
-  <w:style w:type="paragraph" w:styleId="Heading7">
-    <w:name w:val="heading 7"/>
-    <w:basedOn w:val="Normal"/>
-    <w:next w:val="Normal"/>
-    <w:link w:val="Heading7Char"/>
-    <w:uiPriority w:val="9"/>
-    <w:semiHidden/>
-    <w:unhideWhenUsed/>
-    <w:qFormat/>
-    <w:rsid w:val="00CD4189"/>
-    <w:pPr>
-      <w:keepNext/>
-      <w:keepLines/>
-      <w:spacing w:before="40" w:after="0"/>
-      <w:outlineLvl w:val="6"/>
-    </w:pPr>
-    <w:rPr>
-      <w:rFonts w:eastAsiaTheme="majorEastAsia" w:cstheme="majorBidi"/>
-      <w:color w:val="595959" w:themeColor="text1" w:themeTint="A6"/>
-    </w:rPr>
-  </w:style>
-  <w:style w:type="paragraph" w:styleId="Heading8">
-    <w:name w:val="heading 8"/>
-    <w:basedOn w:val="Normal"/>
-    <w:next w:val="Normal"/>
-    <w:link w:val="Heading8Char"/>
-    <w:uiPriority w:val="9"/>
-    <w:semiHidden/>
-    <w:unhideWhenUsed/>
-    <w:qFormat/>
-    <w:rsid w:val="00CD4189"/>
-    <w:pPr>
-      <w:keepNext/>
-      <w:keepLines/>
-      <w:spacing w:after="0"/>
-      <w:outlineLvl w:val="7"/>
-    </w:pPr>
-    <w:rPr>
-      <w:rFonts w:eastAsiaTheme="majorEastAsia" w:cstheme="majorBidi"/>
-      <w:i/>
-      <w:iCs/>
-      <w:color w:val="272727" w:themeColor="text1" w:themeTint="D8"/>
-    </w:rPr>
-  </w:style>
-  <w:style w:type="paragraph" w:styleId="Heading9">
-    <w:name w:val="heading 9"/>
-    <w:basedOn w:val="Normal"/>
-    <w:next w:val="Normal"/>
-    <w:link w:val="Heading9Char"/>
-    <w:uiPriority w:val="9"/>
-    <w:semiHidden/>
-    <w:unhideWhenUsed/>
-    <w:qFormat/>
-    <w:rsid w:val="00CD4189"/>
-    <w:pPr>
-      <w:keepNext/>
-      <w:keepLines/>
-      <w:spacing w:after="0"/>
-      <w:outlineLvl w:val="8"/>
-    </w:pPr>
-    <w:rPr>
-      <w:rFonts w:eastAsiaTheme="majorEastAsia" w:cstheme="majorBidi"/>
-      <w:color w:val="272727" w:themeColor="text1" w:themeTint="D8"/>
-    </w:rPr>
-  </w:style>
-  <w:style w:type="character" w:default="1" w:styleId="DefaultParagraphFont">
-    <w:name w:val="Default Paragraph Font"/>
-    <w:uiPriority w:val="1"/>
-    <w:semiHidden/>
     <w:unhideWhenUsed/>
   </w:style>
   <w:style w:type="table" w:default="1" w:styleId="TableNormal">
@@ -3025,7 +2821,7 @@
   <a:extraClrSchemeLst/>
   <a:extLst>
     <a:ext uri="{05A4C25C-085E-4340-85A3-A5531E510DB2}">
-      <thm15:themeFamily xmlns:thm15="http://schemas.microsoft.com/office/thememl/2012/main" xmlns="" name="Office Theme" id="{2E142A2C-CD16-42D6-873A-C26D2A0506FA}" vid="{1BDDFF52-6CD6-40A5-AB3C-68EB2F1E4D0A}"/>
+      <thm15:themeFamily xmlns:thm15="http://schemas.microsoft.com/office/thememl/2012/main" name="Office Theme" id="{2E142A2C-CD16-42D6-873A-C26D2A0506FA}" vid="{1BDDFF52-6CD6-40A5-AB3C-68EB2F1E4D0A}"/>
     </a:ext>
   </a:extLst>
 </a:theme>

</xml_diff>